<commit_message>
Align English P2 exam formatting with standard
</commit_message>
<xml_diff>
--- a/docs/provas/ingles/p2/simulados/simulado-p2-ingles-02.docx
+++ b/docs/provas/ingles/p2/simulados/simulado-p2-ingles-02.docx
@@ -4,7 +4,7 @@
   <w:body>
     <w:p>
       <w:pPr>
-        <w:spacing w:after="160" w:line="276" w:lineRule="auto"/>
+        <w:spacing w:before="0" w:after="40" w:line="269" w:lineRule="auto"/>
       </w:pPr>
       <w:r>
         <w:rPr>
@@ -17,7 +17,7 @@
     </w:p>
     <w:p>
       <w:pPr>
-        <w:spacing w:after="160" w:line="276" w:lineRule="auto"/>
+        <w:spacing w:before="0" w:after="160" w:line="269" w:lineRule="auto"/>
       </w:pPr>
       <w:r>
         <w:rPr>
@@ -30,7 +30,7 @@
     </w:p>
     <w:p>
       <w:pPr>
-        <w:spacing w:after="160" w:line="276" w:lineRule="auto"/>
+        <w:spacing w:before="0" w:after="200" w:line="269" w:lineRule="auto"/>
       </w:pPr>
       <w:r>
         <w:rPr>
@@ -43,40 +43,27 @@
     </w:p>
     <w:p>
       <w:pPr>
-        <w:spacing w:after="80"/>
-      </w:pPr>
-    </w:p>
-    <w:p>
-      <w:pPr>
-        <w:spacing w:after="160" w:line="276" w:lineRule="auto"/>
-      </w:pPr>
-      <w:r>
-        <w:rPr>
-          <w:b/>
-          <w:sz w:val="22"/>
-          <w:szCs w:val="22"/>
-        </w:rPr>
-        <w:t xml:space="preserve">Nome: ___________________________________________  Turma: ___________________  Data: ____ / ____ / _______</w:t>
-      </w:r>
-    </w:p>
-    <w:p>
-      <w:pPr>
-        <w:spacing w:after="80"/>
-      </w:pPr>
-    </w:p>
-    <w:p>
-      <w:pPr>
-        <w:spacing w:after="80"/>
-      </w:pPr>
-    </w:p>
-    <w:p>
-      <w:pPr>
-        <w:spacing w:after="80"/>
-      </w:pPr>
-    </w:p>
-    <w:p>
-      <w:pPr>
-        <w:spacing w:after="160" w:line="276" w:lineRule="auto"/>
+        <w:spacing w:before="0" w:after="80" w:line="269" w:lineRule="auto"/>
+      </w:pPr>
+    </w:p>
+    <w:p>
+      <w:pPr>
+        <w:spacing w:before="0" w:after="80" w:line="269" w:lineRule="auto"/>
+      </w:pPr>
+    </w:p>
+    <w:p>
+      <w:pPr>
+        <w:spacing w:before="0" w:after="80" w:line="269" w:lineRule="auto"/>
+      </w:pPr>
+    </w:p>
+    <w:p>
+      <w:pPr>
+        <w:spacing w:before="0" w:after="80" w:line="269" w:lineRule="auto"/>
+      </w:pPr>
+    </w:p>
+    <w:p>
+      <w:pPr>
+        <w:spacing w:before="0" w:after="120" w:line="269" w:lineRule="auto"/>
       </w:pPr>
       <w:r>
         <w:rPr>
@@ -89,12 +76,12 @@
     </w:p>
     <w:p>
       <w:pPr>
-        <w:spacing w:after="80"/>
-      </w:pPr>
-    </w:p>
-    <w:p>
-      <w:pPr>
-        <w:spacing w:after="160" w:line="276" w:lineRule="auto"/>
+        <w:spacing w:before="0" w:after="80" w:line="269" w:lineRule="auto"/>
+      </w:pPr>
+    </w:p>
+    <w:p>
+      <w:pPr>
+        <w:spacing w:before="200" w:after="80" w:line="269" w:lineRule="auto"/>
       </w:pPr>
       <w:r>
         <w:rPr>
@@ -107,12 +94,12 @@
     </w:p>
     <w:p>
       <w:pPr>
-        <w:spacing w:after="80"/>
-      </w:pPr>
-    </w:p>
-    <w:p>
-      <w:pPr>
-        <w:spacing w:after="160" w:line="276" w:lineRule="auto"/>
+        <w:spacing w:before="0" w:after="80" w:line="269" w:lineRule="auto"/>
+      </w:pPr>
+    </w:p>
+    <w:p>
+      <w:pPr>
+        <w:spacing w:before="0" w:after="80" w:line="269" w:lineRule="auto"/>
       </w:pPr>
       <w:r>
         <w:rPr>
@@ -125,12 +112,12 @@
     </w:p>
     <w:p>
       <w:pPr>
-        <w:spacing w:after="80"/>
-      </w:pPr>
-    </w:p>
-    <w:p>
-      <w:pPr>
-        <w:spacing w:after="160" w:line="276" w:lineRule="auto"/>
+        <w:spacing w:before="0" w:after="80" w:line="269" w:lineRule="auto"/>
+      </w:pPr>
+    </w:p>
+    <w:p>
+      <w:pPr>
+        <w:spacing w:before="0" w:after="120" w:line="269" w:lineRule="auto"/>
       </w:pPr>
       <w:r>
         <w:rPr>
@@ -143,12 +130,12 @@
     </w:p>
     <w:p>
       <w:pPr>
-        <w:spacing w:after="80"/>
-      </w:pPr>
-    </w:p>
-    <w:p>
-      <w:pPr>
-        <w:spacing w:after="160" w:line="276" w:lineRule="auto"/>
+        <w:spacing w:before="0" w:after="80" w:line="269" w:lineRule="auto"/>
+      </w:pPr>
+    </w:p>
+    <w:p>
+      <w:pPr>
+        <w:spacing w:before="0" w:after="120" w:line="269" w:lineRule="auto"/>
       </w:pPr>
       <w:r>
         <w:rPr>
@@ -161,22 +148,22 @@
     </w:p>
     <w:p>
       <w:pPr>
-        <w:spacing w:after="80"/>
-      </w:pPr>
-    </w:p>
-    <w:p>
-      <w:pPr>
-        <w:spacing w:after="80"/>
-      </w:pPr>
-    </w:p>
-    <w:p>
-      <w:pPr>
-        <w:spacing w:after="80"/>
-      </w:pPr>
-    </w:p>
-    <w:p>
-      <w:pPr>
-        <w:spacing w:after="160" w:line="276" w:lineRule="auto"/>
+        <w:spacing w:before="0" w:after="80" w:line="269" w:lineRule="auto"/>
+      </w:pPr>
+    </w:p>
+    <w:p>
+      <w:pPr>
+        <w:spacing w:before="0" w:after="80" w:line="269" w:lineRule="auto"/>
+      </w:pPr>
+    </w:p>
+    <w:p>
+      <w:pPr>
+        <w:spacing w:before="0" w:after="80" w:line="269" w:lineRule="auto"/>
+      </w:pPr>
+    </w:p>
+    <w:p>
+      <w:pPr>
+        <w:spacing w:before="200" w:after="80" w:line="269" w:lineRule="auto"/>
       </w:pPr>
       <w:r>
         <w:rPr>
@@ -189,12 +176,12 @@
     </w:p>
     <w:p>
       <w:pPr>
-        <w:spacing w:after="80"/>
-      </w:pPr>
-    </w:p>
-    <w:p>
-      <w:pPr>
-        <w:spacing w:after="160" w:line="276" w:lineRule="auto"/>
+        <w:spacing w:before="0" w:after="80" w:line="269" w:lineRule="auto"/>
+      </w:pPr>
+    </w:p>
+    <w:p>
+      <w:pPr>
+        <w:spacing w:before="0" w:after="80" w:line="269" w:lineRule="auto"/>
       </w:pPr>
       <w:r>
         <w:rPr>
@@ -207,12 +194,12 @@
     </w:p>
     <w:p>
       <w:pPr>
-        <w:spacing w:after="80"/>
-      </w:pPr>
-    </w:p>
-    <w:p>
-      <w:pPr>
-        <w:spacing w:after="160" w:line="276" w:lineRule="auto"/>
+        <w:spacing w:before="0" w:after="80" w:line="269" w:lineRule="auto"/>
+      </w:pPr>
+    </w:p>
+    <w:p>
+      <w:pPr>
+        <w:spacing w:before="0" w:after="80" w:line="269" w:lineRule="auto"/>
       </w:pPr>
       <w:r>
         <w:rPr>
@@ -225,12 +212,12 @@
     </w:p>
     <w:p>
       <w:pPr>
-        <w:spacing w:after="80"/>
-      </w:pPr>
-    </w:p>
-    <w:p>
-      <w:pPr>
-        <w:spacing w:after="160" w:line="276" w:lineRule="auto"/>
+        <w:spacing w:before="0" w:after="80" w:line="269" w:lineRule="auto"/>
+      </w:pPr>
+    </w:p>
+    <w:p>
+      <w:pPr>
+        <w:spacing w:before="0" w:after="120" w:line="269" w:lineRule="auto"/>
       </w:pPr>
       <w:r>
         <w:rPr>
@@ -243,12 +230,12 @@
     </w:p>
     <w:p>
       <w:pPr>
-        <w:spacing w:after="80"/>
-      </w:pPr>
-    </w:p>
-    <w:p>
-      <w:pPr>
-        <w:spacing w:after="160" w:line="276" w:lineRule="auto"/>
+        <w:spacing w:before="0" w:after="80" w:line="269" w:lineRule="auto"/>
+      </w:pPr>
+    </w:p>
+    <w:p>
+      <w:pPr>
+        <w:spacing w:before="0" w:after="40" w:line="269" w:lineRule="auto"/>
       </w:pPr>
       <w:r>
         <w:rPr>
@@ -261,12 +248,12 @@
     </w:p>
     <w:p>
       <w:pPr>
-        <w:spacing w:after="80"/>
-      </w:pPr>
-    </w:p>
-    <w:p>
-      <w:pPr>
-        <w:spacing w:after="160" w:line="276" w:lineRule="auto"/>
+        <w:spacing w:before="0" w:after="80" w:line="269" w:lineRule="auto"/>
+      </w:pPr>
+    </w:p>
+    <w:p>
+      <w:pPr>
+        <w:spacing w:before="0" w:after="20" w:line="269" w:lineRule="auto"/>
       </w:pPr>
       <w:r>
         <w:rPr>
@@ -279,12 +266,12 @@
     </w:p>
     <w:p>
       <w:pPr>
-        <w:spacing w:after="80"/>
-      </w:pPr>
-    </w:p>
-    <w:p>
-      <w:pPr>
-        <w:spacing w:after="160" w:line="276" w:lineRule="auto"/>
+        <w:spacing w:before="0" w:after="80" w:line="269" w:lineRule="auto"/>
+      </w:pPr>
+    </w:p>
+    <w:p>
+      <w:pPr>
+        <w:spacing w:before="0" w:after="80" w:line="269" w:lineRule="auto"/>
       </w:pPr>
       <w:r>
         <w:rPr>
@@ -297,12 +284,12 @@
     </w:p>
     <w:p>
       <w:pPr>
-        <w:spacing w:after="80"/>
-      </w:pPr>
-    </w:p>
-    <w:p>
-      <w:pPr>
-        <w:spacing w:after="160" w:line="276" w:lineRule="auto"/>
+        <w:spacing w:before="0" w:after="80" w:line="269" w:lineRule="auto"/>
+      </w:pPr>
+    </w:p>
+    <w:p>
+      <w:pPr>
+        <w:spacing w:before="0" w:after="120" w:line="269" w:lineRule="auto"/>
       </w:pPr>
       <w:r>
         <w:rPr>
@@ -315,12 +302,12 @@
     </w:p>
     <w:p>
       <w:pPr>
-        <w:spacing w:after="80"/>
-      </w:pPr>
-    </w:p>
-    <w:p>
-      <w:pPr>
-        <w:spacing w:after="160" w:line="276" w:lineRule="auto"/>
+        <w:spacing w:before="0" w:after="80" w:line="269" w:lineRule="auto"/>
+      </w:pPr>
+    </w:p>
+    <w:p>
+      <w:pPr>
+        <w:spacing w:before="0" w:after="40" w:line="269" w:lineRule="auto"/>
       </w:pPr>
       <w:r>
         <w:rPr>
@@ -333,12 +320,12 @@
     </w:p>
     <w:p>
       <w:pPr>
-        <w:spacing w:after="80"/>
-      </w:pPr>
-    </w:p>
-    <w:p>
-      <w:pPr>
-        <w:spacing w:after="160" w:line="276" w:lineRule="auto"/>
+        <w:spacing w:before="0" w:after="80" w:line="269" w:lineRule="auto"/>
+      </w:pPr>
+    </w:p>
+    <w:p>
+      <w:pPr>
+        <w:spacing w:before="0" w:after="20" w:line="269" w:lineRule="auto"/>
       </w:pPr>
       <w:r>
         <w:rPr>
@@ -351,22 +338,22 @@
     </w:p>
     <w:p>
       <w:pPr>
-        <w:spacing w:after="80"/>
-      </w:pPr>
-    </w:p>
-    <w:p>
-      <w:pPr>
-        <w:spacing w:after="80"/>
-      </w:pPr>
-    </w:p>
-    <w:p>
-      <w:pPr>
-        <w:spacing w:after="80"/>
-      </w:pPr>
-    </w:p>
-    <w:p>
-      <w:pPr>
-        <w:spacing w:after="160" w:line="276" w:lineRule="auto"/>
+        <w:spacing w:before="0" w:after="80" w:line="269" w:lineRule="auto"/>
+      </w:pPr>
+    </w:p>
+    <w:p>
+      <w:pPr>
+        <w:spacing w:before="0" w:after="80" w:line="269" w:lineRule="auto"/>
+      </w:pPr>
+    </w:p>
+    <w:p>
+      <w:pPr>
+        <w:spacing w:before="0" w:after="80" w:line="269" w:lineRule="auto"/>
+      </w:pPr>
+    </w:p>
+    <w:p>
+      <w:pPr>
+        <w:spacing w:before="200" w:after="80" w:line="269" w:lineRule="auto"/>
       </w:pPr>
       <w:r>
         <w:rPr>
@@ -379,12 +366,12 @@
     </w:p>
     <w:p>
       <w:pPr>
-        <w:spacing w:after="80"/>
-      </w:pPr>
-    </w:p>
-    <w:p>
-      <w:pPr>
-        <w:spacing w:after="160" w:line="276" w:lineRule="auto"/>
+        <w:spacing w:before="0" w:after="80" w:line="269" w:lineRule="auto"/>
+      </w:pPr>
+    </w:p>
+    <w:p>
+      <w:pPr>
+        <w:spacing w:before="0" w:after="80" w:line="269" w:lineRule="auto"/>
       </w:pPr>
       <w:r>
         <w:rPr>
@@ -397,12 +384,12 @@
     </w:p>
     <w:p>
       <w:pPr>
-        <w:spacing w:after="80"/>
-      </w:pPr>
-    </w:p>
-    <w:p>
-      <w:pPr>
-        <w:spacing w:after="160" w:line="276" w:lineRule="auto"/>
+        <w:spacing w:before="0" w:after="80" w:line="269" w:lineRule="auto"/>
+      </w:pPr>
+    </w:p>
+    <w:p>
+      <w:pPr>
+        <w:spacing w:before="0" w:after="40" w:line="269" w:lineRule="auto"/>
       </w:pPr>
       <w:r>
         <w:rPr>
@@ -415,12 +402,12 @@
     </w:p>
     <w:p>
       <w:pPr>
-        <w:spacing w:after="80"/>
-      </w:pPr>
-    </w:p>
-    <w:p>
-      <w:pPr>
-        <w:spacing w:after="160" w:line="276" w:lineRule="auto"/>
+        <w:spacing w:before="0" w:after="80" w:line="269" w:lineRule="auto"/>
+      </w:pPr>
+    </w:p>
+    <w:p>
+      <w:pPr>
+        <w:spacing w:before="0" w:after="20" w:line="269" w:lineRule="auto"/>
       </w:pPr>
       <w:r>
         <w:rPr>
@@ -433,22 +420,22 @@
     </w:p>
     <w:p>
       <w:pPr>
-        <w:spacing w:after="80"/>
-      </w:pPr>
-    </w:p>
-    <w:p>
-      <w:pPr>
-        <w:spacing w:after="80"/>
-      </w:pPr>
-    </w:p>
-    <w:p>
-      <w:pPr>
-        <w:spacing w:after="80"/>
-      </w:pPr>
-    </w:p>
-    <w:p>
-      <w:pPr>
-        <w:spacing w:after="160" w:line="276" w:lineRule="auto"/>
+        <w:spacing w:before="0" w:after="80" w:line="269" w:lineRule="auto"/>
+      </w:pPr>
+    </w:p>
+    <w:p>
+      <w:pPr>
+        <w:spacing w:before="0" w:after="80" w:line="269" w:lineRule="auto"/>
+      </w:pPr>
+    </w:p>
+    <w:p>
+      <w:pPr>
+        <w:spacing w:before="0" w:after="80" w:line="269" w:lineRule="auto"/>
+      </w:pPr>
+    </w:p>
+    <w:p>
+      <w:pPr>
+        <w:spacing w:before="200" w:after="80" w:line="269" w:lineRule="auto"/>
       </w:pPr>
       <w:r>
         <w:rPr>
@@ -461,12 +448,12 @@
     </w:p>
     <w:p>
       <w:pPr>
-        <w:spacing w:after="80"/>
-      </w:pPr>
-    </w:p>
-    <w:p>
-      <w:pPr>
-        <w:spacing w:after="160" w:line="276" w:lineRule="auto"/>
+        <w:spacing w:before="0" w:after="80" w:line="269" w:lineRule="auto"/>
+      </w:pPr>
+    </w:p>
+    <w:p>
+      <w:pPr>
+        <w:spacing w:before="0" w:after="80" w:line="269" w:lineRule="auto"/>
       </w:pPr>
       <w:r>
         <w:rPr>
@@ -479,12 +466,12 @@
     </w:p>
     <w:p>
       <w:pPr>
-        <w:spacing w:after="80"/>
-      </w:pPr>
-    </w:p>
-    <w:p>
-      <w:pPr>
-        <w:spacing w:after="160" w:line="276" w:lineRule="auto"/>
+        <w:spacing w:before="0" w:after="80" w:line="269" w:lineRule="auto"/>
+      </w:pPr>
+    </w:p>
+    <w:p>
+      <w:pPr>
+        <w:spacing w:before="0" w:after="120" w:line="269" w:lineRule="auto"/>
       </w:pPr>
       <w:r>
         <w:rPr>
@@ -497,12 +484,12 @@
     </w:p>
     <w:p>
       <w:pPr>
-        <w:spacing w:after="80"/>
-      </w:pPr>
-    </w:p>
-    <w:p>
-      <w:pPr>
-        <w:spacing w:after="160" w:line="276" w:lineRule="auto"/>
+        <w:spacing w:before="0" w:after="80" w:line="269" w:lineRule="auto"/>
+      </w:pPr>
+    </w:p>
+    <w:p>
+      <w:pPr>
+        <w:spacing w:before="0" w:after="120" w:line="269" w:lineRule="auto"/>
       </w:pPr>
       <w:r>
         <w:rPr>
@@ -515,12 +502,12 @@
     </w:p>
     <w:p>
       <w:pPr>
-        <w:spacing w:after="80"/>
-      </w:pPr>
-    </w:p>
-    <w:p>
-      <w:pPr>
-        <w:spacing w:after="160" w:line="276" w:lineRule="auto"/>
+        <w:spacing w:before="0" w:after="80" w:line="269" w:lineRule="auto"/>
+      </w:pPr>
+    </w:p>
+    <w:p>
+      <w:pPr>
+        <w:spacing w:before="0" w:after="120" w:line="269" w:lineRule="auto"/>
       </w:pPr>
       <w:r>
         <w:rPr>
@@ -533,12 +520,12 @@
     </w:p>
     <w:p>
       <w:pPr>
-        <w:spacing w:after="80"/>
-      </w:pPr>
-    </w:p>
-    <w:p>
-      <w:pPr>
-        <w:spacing w:after="160" w:line="276" w:lineRule="auto"/>
+        <w:spacing w:before="0" w:after="80" w:line="269" w:lineRule="auto"/>
+      </w:pPr>
+    </w:p>
+    <w:p>
+      <w:pPr>
+        <w:spacing w:before="0" w:after="120" w:line="269" w:lineRule="auto"/>
       </w:pPr>
       <w:r>
         <w:rPr>
@@ -551,22 +538,22 @@
     </w:p>
     <w:p>
       <w:pPr>
-        <w:spacing w:after="80"/>
-      </w:pPr>
-    </w:p>
-    <w:p>
-      <w:pPr>
-        <w:spacing w:after="80"/>
-      </w:pPr>
-    </w:p>
-    <w:p>
-      <w:pPr>
-        <w:spacing w:after="80"/>
-      </w:pPr>
-    </w:p>
-    <w:p>
-      <w:pPr>
-        <w:spacing w:after="160" w:line="276" w:lineRule="auto"/>
+        <w:spacing w:before="0" w:after="80" w:line="269" w:lineRule="auto"/>
+      </w:pPr>
+    </w:p>
+    <w:p>
+      <w:pPr>
+        <w:spacing w:before="0" w:after="80" w:line="269" w:lineRule="auto"/>
+      </w:pPr>
+    </w:p>
+    <w:p>
+      <w:pPr>
+        <w:spacing w:before="0" w:after="80" w:line="269" w:lineRule="auto"/>
+      </w:pPr>
+    </w:p>
+    <w:p>
+      <w:pPr>
+        <w:spacing w:before="200" w:after="80" w:line="269" w:lineRule="auto"/>
       </w:pPr>
       <w:r>
         <w:rPr>
@@ -579,12 +566,12 @@
     </w:p>
     <w:p>
       <w:pPr>
-        <w:spacing w:after="80"/>
-      </w:pPr>
-    </w:p>
-    <w:p>
-      <w:pPr>
-        <w:spacing w:after="160" w:line="276" w:lineRule="auto"/>
+        <w:spacing w:before="0" w:after="80" w:line="269" w:lineRule="auto"/>
+      </w:pPr>
+    </w:p>
+    <w:p>
+      <w:pPr>
+        <w:spacing w:before="0" w:after="80" w:line="269" w:lineRule="auto"/>
       </w:pPr>
       <w:r>
         <w:rPr>
@@ -597,12 +584,12 @@
     </w:p>
     <w:p>
       <w:pPr>
-        <w:spacing w:after="80"/>
-      </w:pPr>
-    </w:p>
-    <w:p>
-      <w:pPr>
-        <w:spacing w:after="160" w:line="276" w:lineRule="auto"/>
+        <w:spacing w:before="0" w:after="80" w:line="269" w:lineRule="auto"/>
+      </w:pPr>
+    </w:p>
+    <w:p>
+      <w:pPr>
+        <w:spacing w:before="0" w:after="80" w:line="269" w:lineRule="auto"/>
       </w:pPr>
       <w:r>
         <w:rPr>
@@ -615,12 +602,12 @@
     </w:p>
     <w:p>
       <w:pPr>
-        <w:spacing w:after="80"/>
-      </w:pPr>
-    </w:p>
-    <w:p>
-      <w:pPr>
-        <w:spacing w:after="160" w:line="276" w:lineRule="auto"/>
+        <w:spacing w:before="0" w:after="80" w:line="269" w:lineRule="auto"/>
+      </w:pPr>
+    </w:p>
+    <w:p>
+      <w:pPr>
+        <w:spacing w:before="0" w:after="120" w:line="269" w:lineRule="auto"/>
       </w:pPr>
       <w:r>
         <w:rPr>
@@ -633,12 +620,12 @@
     </w:p>
     <w:p>
       <w:pPr>
-        <w:spacing w:after="80"/>
-      </w:pPr>
-    </w:p>
-    <w:p>
-      <w:pPr>
-        <w:spacing w:after="160" w:line="276" w:lineRule="auto"/>
+        <w:spacing w:before="0" w:after="80" w:line="269" w:lineRule="auto"/>
+      </w:pPr>
+    </w:p>
+    <w:p>
+      <w:pPr>
+        <w:spacing w:before="0" w:after="80" w:line="269" w:lineRule="auto"/>
       </w:pPr>
       <w:r>
         <w:rPr>
@@ -651,12 +638,12 @@
     </w:p>
     <w:p>
       <w:pPr>
-        <w:spacing w:after="80"/>
-      </w:pPr>
-    </w:p>
-    <w:p>
-      <w:pPr>
-        <w:spacing w:after="160" w:line="276" w:lineRule="auto"/>
+        <w:spacing w:before="0" w:after="80" w:line="269" w:lineRule="auto"/>
+      </w:pPr>
+    </w:p>
+    <w:p>
+      <w:pPr>
+        <w:spacing w:before="0" w:after="120" w:line="269" w:lineRule="auto"/>
       </w:pPr>
       <w:r>
         <w:rPr>
@@ -669,12 +656,12 @@
     </w:p>
     <w:p>
       <w:pPr>
-        <w:spacing w:after="80"/>
-      </w:pPr>
-    </w:p>
-    <w:p>
-      <w:pPr>
-        <w:spacing w:after="160" w:line="276" w:lineRule="auto"/>
+        <w:spacing w:before="0" w:after="80" w:line="269" w:lineRule="auto"/>
+      </w:pPr>
+    </w:p>
+    <w:p>
+      <w:pPr>
+        <w:spacing w:before="0" w:after="80" w:line="269" w:lineRule="auto"/>
       </w:pPr>
       <w:r>
         <w:rPr>
@@ -687,12 +674,12 @@
     </w:p>
     <w:p>
       <w:pPr>
-        <w:spacing w:after="80"/>
-      </w:pPr>
-    </w:p>
-    <w:p>
-      <w:pPr>
-        <w:spacing w:after="160" w:line="276" w:lineRule="auto"/>
+        <w:spacing w:before="0" w:after="80" w:line="269" w:lineRule="auto"/>
+      </w:pPr>
+    </w:p>
+    <w:p>
+      <w:pPr>
+        <w:spacing w:before="0" w:after="120" w:line="269" w:lineRule="auto"/>
       </w:pPr>
       <w:r>
         <w:rPr>
@@ -705,12 +692,12 @@
     </w:p>
     <w:p>
       <w:pPr>
-        <w:spacing w:after="80"/>
-      </w:pPr>
-    </w:p>
-    <w:p>
-      <w:pPr>
-        <w:spacing w:after="160" w:line="276" w:lineRule="auto"/>
+        <w:spacing w:before="0" w:after="80" w:line="269" w:lineRule="auto"/>
+      </w:pPr>
+    </w:p>
+    <w:p>
+      <w:pPr>
+        <w:spacing w:before="0" w:after="80" w:line="269" w:lineRule="auto"/>
       </w:pPr>
       <w:r>
         <w:rPr>
@@ -723,12 +710,12 @@
     </w:p>
     <w:p>
       <w:pPr>
-        <w:spacing w:after="80"/>
-      </w:pPr>
-    </w:p>
-    <w:p>
-      <w:pPr>
-        <w:spacing w:after="160" w:line="276" w:lineRule="auto"/>
+        <w:spacing w:before="0" w:after="80" w:line="269" w:lineRule="auto"/>
+      </w:pPr>
+    </w:p>
+    <w:p>
+      <w:pPr>
+        <w:spacing w:before="0" w:after="120" w:line="269" w:lineRule="auto"/>
       </w:pPr>
       <w:r>
         <w:rPr>
@@ -741,12 +728,12 @@
     </w:p>
     <w:p>
       <w:pPr>
-        <w:spacing w:after="80"/>
-      </w:pPr>
-    </w:p>
-    <w:p>
-      <w:pPr>
-        <w:spacing w:after="160" w:line="276" w:lineRule="auto"/>
+        <w:spacing w:before="0" w:after="80" w:line="269" w:lineRule="auto"/>
+      </w:pPr>
+    </w:p>
+    <w:p>
+      <w:pPr>
+        <w:spacing w:before="0" w:after="80" w:line="269" w:lineRule="auto"/>
       </w:pPr>
       <w:r>
         <w:rPr>
@@ -759,12 +746,12 @@
     </w:p>
     <w:p>
       <w:pPr>
-        <w:spacing w:after="80"/>
-      </w:pPr>
-    </w:p>
-    <w:p>
-      <w:pPr>
-        <w:spacing w:after="160" w:line="276" w:lineRule="auto"/>
+        <w:spacing w:before="0" w:after="80" w:line="269" w:lineRule="auto"/>
+      </w:pPr>
+    </w:p>
+    <w:p>
+      <w:pPr>
+        <w:spacing w:before="0" w:after="120" w:line="269" w:lineRule="auto"/>
       </w:pPr>
       <w:r>
         <w:rPr>
@@ -777,12 +764,12 @@
     </w:p>
     <w:p>
       <w:pPr>
-        <w:spacing w:after="80"/>
-      </w:pPr>
-    </w:p>
-    <w:p>
-      <w:pPr>
-        <w:spacing w:after="160" w:line="276" w:lineRule="auto"/>
+        <w:spacing w:before="0" w:after="80" w:line="269" w:lineRule="auto"/>
+      </w:pPr>
+    </w:p>
+    <w:p>
+      <w:pPr>
+        <w:spacing w:before="0" w:after="80" w:line="269" w:lineRule="auto"/>
       </w:pPr>
       <w:r>
         <w:rPr>
@@ -795,12 +782,12 @@
     </w:p>
     <w:p>
       <w:pPr>
-        <w:spacing w:after="80"/>
-      </w:pPr>
-    </w:p>
-    <w:p>
-      <w:pPr>
-        <w:spacing w:after="160" w:line="276" w:lineRule="auto"/>
+        <w:spacing w:before="0" w:after="80" w:line="269" w:lineRule="auto"/>
+      </w:pPr>
+    </w:p>
+    <w:p>
+      <w:pPr>
+        <w:spacing w:before="0" w:after="120" w:line="269" w:lineRule="auto"/>
       </w:pPr>
       <w:r>
         <w:rPr>
@@ -813,22 +800,22 @@
     </w:p>
     <w:p>
       <w:pPr>
-        <w:spacing w:after="80"/>
-      </w:pPr>
-    </w:p>
-    <w:p>
-      <w:pPr>
-        <w:spacing w:after="80"/>
-      </w:pPr>
-    </w:p>
-    <w:p>
-      <w:pPr>
-        <w:spacing w:after="80"/>
-      </w:pPr>
-    </w:p>
-    <w:p>
-      <w:pPr>
-        <w:spacing w:after="160" w:line="276" w:lineRule="auto"/>
+        <w:spacing w:before="0" w:after="80" w:line="269" w:lineRule="auto"/>
+      </w:pPr>
+    </w:p>
+    <w:p>
+      <w:pPr>
+        <w:spacing w:before="0" w:after="80" w:line="269" w:lineRule="auto"/>
+      </w:pPr>
+    </w:p>
+    <w:p>
+      <w:pPr>
+        <w:spacing w:before="0" w:after="80" w:line="269" w:lineRule="auto"/>
+      </w:pPr>
+    </w:p>
+    <w:p>
+      <w:pPr>
+        <w:spacing w:before="200" w:after="80" w:line="269" w:lineRule="auto"/>
       </w:pPr>
       <w:r>
         <w:rPr>
@@ -841,12 +828,12 @@
     </w:p>
     <w:p>
       <w:pPr>
-        <w:spacing w:after="80"/>
-      </w:pPr>
-    </w:p>
-    <w:p>
-      <w:pPr>
-        <w:spacing w:after="160" w:line="276" w:lineRule="auto"/>
+        <w:spacing w:before="0" w:after="80" w:line="269" w:lineRule="auto"/>
+      </w:pPr>
+    </w:p>
+    <w:p>
+      <w:pPr>
+        <w:spacing w:before="0" w:after="80" w:line="269" w:lineRule="auto"/>
       </w:pPr>
       <w:r>
         <w:rPr>
@@ -859,12 +846,12 @@
     </w:p>
     <w:p>
       <w:pPr>
-        <w:spacing w:after="80"/>
-      </w:pPr>
-    </w:p>
-    <w:p>
-      <w:pPr>
-        <w:spacing w:after="160" w:line="276" w:lineRule="auto"/>
+        <w:spacing w:before="0" w:after="80" w:line="269" w:lineRule="auto"/>
+      </w:pPr>
+    </w:p>
+    <w:p>
+      <w:pPr>
+        <w:spacing w:before="0" w:after="80" w:line="269" w:lineRule="auto"/>
       </w:pPr>
       <w:r>
         <w:rPr>
@@ -877,12 +864,12 @@
     </w:p>
     <w:p>
       <w:pPr>
-        <w:spacing w:after="80"/>
-      </w:pPr>
-    </w:p>
-    <w:p>
-      <w:pPr>
-        <w:spacing w:after="160" w:line="276" w:lineRule="auto"/>
+        <w:spacing w:before="0" w:after="80" w:line="269" w:lineRule="auto"/>
+      </w:pPr>
+    </w:p>
+    <w:p>
+      <w:pPr>
+        <w:spacing w:before="0" w:after="80" w:line="269" w:lineRule="auto"/>
       </w:pPr>
       <w:r>
         <w:rPr>
@@ -895,12 +882,12 @@
     </w:p>
     <w:p>
       <w:pPr>
-        <w:spacing w:after="80"/>
-      </w:pPr>
-    </w:p>
-    <w:p>
-      <w:pPr>
-        <w:spacing w:after="160" w:line="276" w:lineRule="auto"/>
+        <w:spacing w:before="0" w:after="80" w:line="269" w:lineRule="auto"/>
+      </w:pPr>
+    </w:p>
+    <w:p>
+      <w:pPr>
+        <w:spacing w:before="0" w:after="120" w:line="269" w:lineRule="auto"/>
       </w:pPr>
       <w:r>
         <w:rPr>
@@ -913,12 +900,12 @@
     </w:p>
     <w:p>
       <w:pPr>
-        <w:spacing w:after="80"/>
-      </w:pPr>
-    </w:p>
-    <w:p>
-      <w:pPr>
-        <w:spacing w:after="160" w:line="276" w:lineRule="auto"/>
+        <w:spacing w:before="0" w:after="80" w:line="269" w:lineRule="auto"/>
+      </w:pPr>
+    </w:p>
+    <w:p>
+      <w:pPr>
+        <w:spacing w:before="0" w:after="80" w:line="269" w:lineRule="auto"/>
       </w:pPr>
       <w:r>
         <w:rPr>
@@ -931,12 +918,12 @@
     </w:p>
     <w:p>
       <w:pPr>
-        <w:spacing w:after="80"/>
-      </w:pPr>
-    </w:p>
-    <w:p>
-      <w:pPr>
-        <w:spacing w:after="160" w:line="276" w:lineRule="auto"/>
+        <w:spacing w:before="0" w:after="80" w:line="269" w:lineRule="auto"/>
+      </w:pPr>
+    </w:p>
+    <w:p>
+      <w:pPr>
+        <w:spacing w:before="0" w:after="120" w:line="269" w:lineRule="auto"/>
       </w:pPr>
       <w:r>
         <w:rPr>
@@ -949,12 +936,12 @@
     </w:p>
     <w:p>
       <w:pPr>
-        <w:spacing w:after="80"/>
-      </w:pPr>
-    </w:p>
-    <w:p>
-      <w:pPr>
-        <w:spacing w:after="160" w:line="276" w:lineRule="auto"/>
+        <w:spacing w:before="0" w:after="80" w:line="269" w:lineRule="auto"/>
+      </w:pPr>
+    </w:p>
+    <w:p>
+      <w:pPr>
+        <w:spacing w:before="0" w:after="80" w:line="269" w:lineRule="auto"/>
       </w:pPr>
       <w:r>
         <w:rPr>
@@ -967,12 +954,12 @@
     </w:p>
     <w:p>
       <w:pPr>
-        <w:spacing w:after="80"/>
-      </w:pPr>
-    </w:p>
-    <w:p>
-      <w:pPr>
-        <w:spacing w:after="160" w:line="276" w:lineRule="auto"/>
+        <w:spacing w:before="0" w:after="80" w:line="269" w:lineRule="auto"/>
+      </w:pPr>
+    </w:p>
+    <w:p>
+      <w:pPr>
+        <w:spacing w:before="0" w:after="120" w:line="269" w:lineRule="auto"/>
       </w:pPr>
       <w:r>
         <w:rPr>
@@ -985,12 +972,12 @@
     </w:p>
     <w:p>
       <w:pPr>
-        <w:spacing w:after="80"/>
-      </w:pPr>
-    </w:p>
-    <w:p>
-      <w:pPr>
-        <w:spacing w:after="160" w:line="276" w:lineRule="auto"/>
+        <w:spacing w:before="0" w:after="80" w:line="269" w:lineRule="auto"/>
+      </w:pPr>
+    </w:p>
+    <w:p>
+      <w:pPr>
+        <w:spacing w:before="0" w:after="80" w:line="269" w:lineRule="auto"/>
       </w:pPr>
       <w:r>
         <w:rPr>
@@ -1003,12 +990,12 @@
     </w:p>
     <w:p>
       <w:pPr>
-        <w:spacing w:after="80"/>
-      </w:pPr>
-    </w:p>
-    <w:p>
-      <w:pPr>
-        <w:spacing w:after="160" w:line="276" w:lineRule="auto"/>
+        <w:spacing w:before="0" w:after="80" w:line="269" w:lineRule="auto"/>
+      </w:pPr>
+    </w:p>
+    <w:p>
+      <w:pPr>
+        <w:spacing w:before="0" w:after="120" w:line="269" w:lineRule="auto"/>
       </w:pPr>
       <w:r>
         <w:rPr>
@@ -1021,12 +1008,12 @@
     </w:p>
     <w:p>
       <w:pPr>
-        <w:spacing w:after="80"/>
-      </w:pPr>
-    </w:p>
-    <w:p>
-      <w:pPr>
-        <w:spacing w:after="160" w:line="276" w:lineRule="auto"/>
+        <w:spacing w:before="0" w:after="80" w:line="269" w:lineRule="auto"/>
+      </w:pPr>
+    </w:p>
+    <w:p>
+      <w:pPr>
+        <w:spacing w:before="0" w:after="80" w:line="269" w:lineRule="auto"/>
       </w:pPr>
       <w:r>
         <w:rPr>
@@ -1039,12 +1026,12 @@
     </w:p>
     <w:p>
       <w:pPr>
-        <w:spacing w:after="80"/>
-      </w:pPr>
-    </w:p>
-    <w:p>
-      <w:pPr>
-        <w:spacing w:after="160" w:line="276" w:lineRule="auto"/>
+        <w:spacing w:before="0" w:after="80" w:line="269" w:lineRule="auto"/>
+      </w:pPr>
+    </w:p>
+    <w:p>
+      <w:pPr>
+        <w:spacing w:before="0" w:after="120" w:line="269" w:lineRule="auto"/>
       </w:pPr>
       <w:r>
         <w:rPr>
@@ -1057,12 +1044,12 @@
     </w:p>
     <w:p>
       <w:pPr>
-        <w:spacing w:after="80"/>
-      </w:pPr>
-    </w:p>
-    <w:p>
-      <w:pPr>
-        <w:spacing w:after="160" w:line="276" w:lineRule="auto"/>
+        <w:spacing w:before="0" w:after="80" w:line="269" w:lineRule="auto"/>
+      </w:pPr>
+    </w:p>
+    <w:p>
+      <w:pPr>
+        <w:spacing w:before="0" w:after="80" w:line="269" w:lineRule="auto"/>
       </w:pPr>
       <w:r>
         <w:rPr>
@@ -1075,12 +1062,12 @@
     </w:p>
     <w:p>
       <w:pPr>
-        <w:spacing w:after="80"/>
-      </w:pPr>
-    </w:p>
-    <w:p>
-      <w:pPr>
-        <w:spacing w:after="160" w:line="276" w:lineRule="auto"/>
+        <w:spacing w:before="0" w:after="80" w:line="269" w:lineRule="auto"/>
+      </w:pPr>
+    </w:p>
+    <w:p>
+      <w:pPr>
+        <w:spacing w:before="0" w:after="120" w:line="269" w:lineRule="auto"/>
       </w:pPr>
       <w:r>
         <w:rPr>
@@ -1093,22 +1080,22 @@
     </w:p>
     <w:p>
       <w:pPr>
-        <w:spacing w:after="80"/>
-      </w:pPr>
-    </w:p>
-    <w:p>
-      <w:pPr>
-        <w:spacing w:after="80"/>
-      </w:pPr>
-    </w:p>
-    <w:p>
-      <w:pPr>
-        <w:spacing w:after="80"/>
-      </w:pPr>
-    </w:p>
-    <w:p>
-      <w:pPr>
-        <w:spacing w:after="160" w:line="276" w:lineRule="auto"/>
+        <w:spacing w:before="0" w:after="80" w:line="269" w:lineRule="auto"/>
+      </w:pPr>
+    </w:p>
+    <w:p>
+      <w:pPr>
+        <w:spacing w:before="0" w:after="80" w:line="269" w:lineRule="auto"/>
+      </w:pPr>
+    </w:p>
+    <w:p>
+      <w:pPr>
+        <w:spacing w:before="0" w:after="80" w:line="269" w:lineRule="auto"/>
+      </w:pPr>
+    </w:p>
+    <w:p>
+      <w:pPr>
+        <w:spacing w:before="200" w:after="80" w:line="269" w:lineRule="auto"/>
       </w:pPr>
       <w:r>
         <w:rPr>
@@ -1121,12 +1108,12 @@
     </w:p>
     <w:p>
       <w:pPr>
-        <w:spacing w:after="80"/>
-      </w:pPr>
-    </w:p>
-    <w:p>
-      <w:pPr>
-        <w:spacing w:after="160" w:line="276" w:lineRule="auto"/>
+        <w:spacing w:before="0" w:after="80" w:line="269" w:lineRule="auto"/>
+      </w:pPr>
+    </w:p>
+    <w:p>
+      <w:pPr>
+        <w:spacing w:before="0" w:after="80" w:line="269" w:lineRule="auto"/>
       </w:pPr>
       <w:r>
         <w:rPr>
@@ -1139,12 +1126,12 @@
     </w:p>
     <w:p>
       <w:pPr>
-        <w:spacing w:after="80"/>
-      </w:pPr>
-    </w:p>
-    <w:p>
-      <w:pPr>
-        <w:spacing w:after="160" w:line="276" w:lineRule="auto"/>
+        <w:spacing w:before="0" w:after="80" w:line="269" w:lineRule="auto"/>
+      </w:pPr>
+    </w:p>
+    <w:p>
+      <w:pPr>
+        <w:spacing w:before="0" w:after="80" w:line="269" w:lineRule="auto"/>
       </w:pPr>
       <w:r>
         <w:rPr>
@@ -1157,12 +1144,12 @@
     </w:p>
     <w:p>
       <w:pPr>
-        <w:spacing w:after="80"/>
-      </w:pPr>
-    </w:p>
-    <w:p>
-      <w:pPr>
-        <w:spacing w:after="160" w:line="276" w:lineRule="auto"/>
+        <w:spacing w:before="0" w:after="80" w:line="269" w:lineRule="auto"/>
+      </w:pPr>
+    </w:p>
+    <w:p>
+      <w:pPr>
+        <w:spacing w:before="0" w:after="120" w:line="269" w:lineRule="auto"/>
       </w:pPr>
       <w:r>
         <w:rPr>
@@ -1175,12 +1162,12 @@
     </w:p>
     <w:p>
       <w:pPr>
-        <w:spacing w:after="80"/>
-      </w:pPr>
-    </w:p>
-    <w:p>
-      <w:pPr>
-        <w:spacing w:after="160" w:line="276" w:lineRule="auto"/>
+        <w:spacing w:before="0" w:after="80" w:line="269" w:lineRule="auto"/>
+      </w:pPr>
+    </w:p>
+    <w:p>
+      <w:pPr>
+        <w:spacing w:before="0" w:after="120" w:line="269" w:lineRule="auto"/>
       </w:pPr>
       <w:r>
         <w:rPr>
@@ -1193,12 +1180,12 @@
     </w:p>
     <w:p>
       <w:pPr>
-        <w:spacing w:after="80"/>
-      </w:pPr>
-    </w:p>
-    <w:p>
-      <w:pPr>
-        <w:spacing w:after="160" w:line="276" w:lineRule="auto"/>
+        <w:spacing w:before="0" w:after="80" w:line="269" w:lineRule="auto"/>
+      </w:pPr>
+    </w:p>
+    <w:p>
+      <w:pPr>
+        <w:spacing w:before="0" w:after="20" w:line="269" w:lineRule="auto"/>
       </w:pPr>
       <w:r>
         <w:rPr>
@@ -1211,12 +1198,12 @@
     </w:p>
     <w:p>
       <w:pPr>
-        <w:spacing w:after="80"/>
-      </w:pPr>
-    </w:p>
-    <w:p>
-      <w:pPr>
-        <w:spacing w:after="160" w:line="276" w:lineRule="auto"/>
+        <w:spacing w:before="0" w:after="80" w:line="269" w:lineRule="auto"/>
+      </w:pPr>
+    </w:p>
+    <w:p>
+      <w:pPr>
+        <w:spacing w:before="0" w:after="120" w:line="269" w:lineRule="auto"/>
       </w:pPr>
       <w:r>
         <w:rPr>
@@ -1229,12 +1216,12 @@
     </w:p>
     <w:p>
       <w:pPr>
-        <w:spacing w:after="80"/>
-      </w:pPr>
-    </w:p>
-    <w:p>
-      <w:pPr>
-        <w:spacing w:after="160" w:line="276" w:lineRule="auto"/>
+        <w:spacing w:before="0" w:after="80" w:line="269" w:lineRule="auto"/>
+      </w:pPr>
+    </w:p>
+    <w:p>
+      <w:pPr>
+        <w:spacing w:before="0" w:after="20" w:line="269" w:lineRule="auto"/>
       </w:pPr>
       <w:r>
         <w:rPr>
@@ -1247,12 +1234,12 @@
     </w:p>
     <w:p>
       <w:pPr>
-        <w:spacing w:after="80"/>
-      </w:pPr>
-    </w:p>
-    <w:p>
-      <w:pPr>
-        <w:spacing w:after="160" w:line="276" w:lineRule="auto"/>
+        <w:spacing w:before="0" w:after="80" w:line="269" w:lineRule="auto"/>
+      </w:pPr>
+    </w:p>
+    <w:p>
+      <w:pPr>
+        <w:spacing w:before="0" w:after="80" w:line="269" w:lineRule="auto"/>
       </w:pPr>
       <w:r>
         <w:rPr>
@@ -1265,12 +1252,12 @@
     </w:p>
     <w:p>
       <w:pPr>
-        <w:spacing w:after="80"/>
-      </w:pPr>
-    </w:p>
-    <w:p>
-      <w:pPr>
-        <w:spacing w:after="160" w:line="276" w:lineRule="auto"/>
+        <w:spacing w:before="0" w:after="80" w:line="269" w:lineRule="auto"/>
+      </w:pPr>
+    </w:p>
+    <w:p>
+      <w:pPr>
+        <w:spacing w:before="0" w:after="120" w:line="269" w:lineRule="auto"/>
       </w:pPr>
       <w:r>
         <w:rPr>
@@ -1283,12 +1270,12 @@
     </w:p>
     <w:p>
       <w:pPr>
-        <w:spacing w:after="80"/>
-      </w:pPr>
-    </w:p>
-    <w:p>
-      <w:pPr>
-        <w:spacing w:after="160" w:line="276" w:lineRule="auto"/>
+        <w:spacing w:before="0" w:after="80" w:line="269" w:lineRule="auto"/>
+      </w:pPr>
+    </w:p>
+    <w:p>
+      <w:pPr>
+        <w:spacing w:before="0" w:after="120" w:line="269" w:lineRule="auto"/>
       </w:pPr>
       <w:r>
         <w:rPr>
@@ -1301,12 +1288,12 @@
     </w:p>
     <w:p>
       <w:pPr>
-        <w:spacing w:after="80"/>
-      </w:pPr>
-    </w:p>
-    <w:p>
-      <w:pPr>
-        <w:spacing w:after="160" w:line="276" w:lineRule="auto"/>
+        <w:spacing w:before="0" w:after="80" w:line="269" w:lineRule="auto"/>
+      </w:pPr>
+    </w:p>
+    <w:p>
+      <w:pPr>
+        <w:spacing w:before="0" w:after="20" w:line="269" w:lineRule="auto"/>
       </w:pPr>
       <w:r>
         <w:rPr>
@@ -1319,12 +1306,12 @@
     </w:p>
     <w:p>
       <w:pPr>
-        <w:spacing w:after="80"/>
-      </w:pPr>
-    </w:p>
-    <w:p>
-      <w:pPr>
-        <w:spacing w:after="160" w:line="276" w:lineRule="auto"/>
+        <w:spacing w:before="0" w:after="80" w:line="269" w:lineRule="auto"/>
+      </w:pPr>
+    </w:p>
+    <w:p>
+      <w:pPr>
+        <w:spacing w:before="0" w:after="120" w:line="269" w:lineRule="auto"/>
       </w:pPr>
       <w:r>
         <w:rPr>
@@ -1337,12 +1324,12 @@
     </w:p>
     <w:p>
       <w:pPr>
-        <w:spacing w:after="80"/>
-      </w:pPr>
-    </w:p>
-    <w:p>
-      <w:pPr>
-        <w:spacing w:after="160" w:line="276" w:lineRule="auto"/>
+        <w:spacing w:before="0" w:after="80" w:line="269" w:lineRule="auto"/>
+      </w:pPr>
+    </w:p>
+    <w:p>
+      <w:pPr>
+        <w:spacing w:before="0" w:after="20" w:line="269" w:lineRule="auto"/>
       </w:pPr>
       <w:r>
         <w:rPr>
@@ -1355,22 +1342,22 @@
     </w:p>
     <w:p>
       <w:pPr>
-        <w:spacing w:after="80"/>
-      </w:pPr>
-    </w:p>
-    <w:p>
-      <w:pPr>
-        <w:spacing w:after="80"/>
-      </w:pPr>
-    </w:p>
-    <w:p>
-      <w:pPr>
-        <w:spacing w:after="80"/>
-      </w:pPr>
-    </w:p>
-    <w:p>
-      <w:pPr>
-        <w:spacing w:after="160" w:line="276" w:lineRule="auto"/>
+        <w:spacing w:before="0" w:after="80" w:line="269" w:lineRule="auto"/>
+      </w:pPr>
+    </w:p>
+    <w:p>
+      <w:pPr>
+        <w:spacing w:before="0" w:after="80" w:line="269" w:lineRule="auto"/>
+      </w:pPr>
+    </w:p>
+    <w:p>
+      <w:pPr>
+        <w:spacing w:before="0" w:after="80" w:line="269" w:lineRule="auto"/>
+      </w:pPr>
+    </w:p>
+    <w:p>
+      <w:pPr>
+        <w:spacing w:before="200" w:after="80" w:line="269" w:lineRule="auto"/>
       </w:pPr>
       <w:r>
         <w:rPr>
@@ -1383,12 +1370,12 @@
     </w:p>
     <w:p>
       <w:pPr>
-        <w:spacing w:after="80"/>
-      </w:pPr>
-    </w:p>
-    <w:p>
-      <w:pPr>
-        <w:spacing w:after="160" w:line="276" w:lineRule="auto"/>
+        <w:spacing w:before="0" w:after="80" w:line="269" w:lineRule="auto"/>
+      </w:pPr>
+    </w:p>
+    <w:p>
+      <w:pPr>
+        <w:spacing w:before="0" w:after="80" w:line="269" w:lineRule="auto"/>
       </w:pPr>
       <w:r>
         <w:rPr>
@@ -1401,12 +1388,12 @@
     </w:p>
     <w:p>
       <w:pPr>
-        <w:spacing w:after="80"/>
-      </w:pPr>
-    </w:p>
-    <w:p>
-      <w:pPr>
-        <w:spacing w:after="160" w:line="276" w:lineRule="auto"/>
+        <w:spacing w:before="0" w:after="80" w:line="269" w:lineRule="auto"/>
+      </w:pPr>
+    </w:p>
+    <w:p>
+      <w:pPr>
+        <w:spacing w:before="0" w:after="80" w:line="269" w:lineRule="auto"/>
       </w:pPr>
       <w:r>
         <w:rPr>
@@ -1419,12 +1406,12 @@
     </w:p>
     <w:p>
       <w:pPr>
-        <w:spacing w:after="80"/>
-      </w:pPr>
-    </w:p>
-    <w:p>
-      <w:pPr>
-        <w:spacing w:after="160" w:line="276" w:lineRule="auto"/>
+        <w:spacing w:before="0" w:after="80" w:line="269" w:lineRule="auto"/>
+      </w:pPr>
+    </w:p>
+    <w:p>
+      <w:pPr>
+        <w:spacing w:before="0" w:after="80" w:line="269" w:lineRule="auto"/>
       </w:pPr>
       <w:r>
         <w:rPr>
@@ -1437,12 +1424,12 @@
     </w:p>
     <w:p>
       <w:pPr>
-        <w:spacing w:after="80"/>
-      </w:pPr>
-    </w:p>
-    <w:p>
-      <w:pPr>
-        <w:spacing w:after="160" w:line="276" w:lineRule="auto"/>
+        <w:spacing w:before="0" w:after="80" w:line="269" w:lineRule="auto"/>
+      </w:pPr>
+    </w:p>
+    <w:p>
+      <w:pPr>
+        <w:spacing w:before="0" w:after="120" w:line="269" w:lineRule="auto"/>
       </w:pPr>
       <w:r>
         <w:rPr>
@@ -1455,12 +1442,12 @@
     </w:p>
     <w:p>
       <w:pPr>
-        <w:spacing w:after="80"/>
-      </w:pPr>
-    </w:p>
-    <w:p>
-      <w:pPr>
-        <w:spacing w:after="160" w:line="276" w:lineRule="auto"/>
+        <w:spacing w:before="0" w:after="80" w:line="269" w:lineRule="auto"/>
+      </w:pPr>
+    </w:p>
+    <w:p>
+      <w:pPr>
+        <w:spacing w:before="0" w:after="80" w:line="269" w:lineRule="auto"/>
       </w:pPr>
       <w:r>
         <w:rPr>
@@ -1473,12 +1460,12 @@
     </w:p>
     <w:p>
       <w:pPr>
-        <w:spacing w:after="80"/>
-      </w:pPr>
-    </w:p>
-    <w:p>
-      <w:pPr>
-        <w:spacing w:after="160" w:line="276" w:lineRule="auto"/>
+        <w:spacing w:before="0" w:after="80" w:line="269" w:lineRule="auto"/>
+      </w:pPr>
+    </w:p>
+    <w:p>
+      <w:pPr>
+        <w:spacing w:before="0" w:after="120" w:line="269" w:lineRule="auto"/>
       </w:pPr>
       <w:r>
         <w:rPr>
@@ -1491,12 +1478,12 @@
     </w:p>
     <w:p>
       <w:pPr>
-        <w:spacing w:after="80"/>
-      </w:pPr>
-    </w:p>
-    <w:p>
-      <w:pPr>
-        <w:spacing w:after="160" w:line="276" w:lineRule="auto"/>
+        <w:spacing w:before="0" w:after="80" w:line="269" w:lineRule="auto"/>
+      </w:pPr>
+    </w:p>
+    <w:p>
+      <w:pPr>
+        <w:spacing w:before="0" w:after="80" w:line="269" w:lineRule="auto"/>
       </w:pPr>
       <w:r>
         <w:rPr>
@@ -1509,12 +1496,12 @@
     </w:p>
     <w:p>
       <w:pPr>
-        <w:spacing w:after="80"/>
-      </w:pPr>
-    </w:p>
-    <w:p>
-      <w:pPr>
-        <w:spacing w:after="160" w:line="276" w:lineRule="auto"/>
+        <w:spacing w:before="0" w:after="80" w:line="269" w:lineRule="auto"/>
+      </w:pPr>
+    </w:p>
+    <w:p>
+      <w:pPr>
+        <w:spacing w:before="0" w:after="120" w:line="269" w:lineRule="auto"/>
       </w:pPr>
       <w:r>
         <w:rPr>
@@ -1527,12 +1514,12 @@
     </w:p>
     <w:p>
       <w:pPr>
-        <w:spacing w:after="80"/>
-      </w:pPr>
-    </w:p>
-    <w:p>
-      <w:pPr>
-        <w:spacing w:after="160" w:line="276" w:lineRule="auto"/>
+        <w:spacing w:before="0" w:after="80" w:line="269" w:lineRule="auto"/>
+      </w:pPr>
+    </w:p>
+    <w:p>
+      <w:pPr>
+        <w:spacing w:before="0" w:after="80" w:line="269" w:lineRule="auto"/>
       </w:pPr>
       <w:r>
         <w:rPr>
@@ -1545,12 +1532,12 @@
     </w:p>
     <w:p>
       <w:pPr>
-        <w:spacing w:after="80"/>
-      </w:pPr>
-    </w:p>
-    <w:p>
-      <w:pPr>
-        <w:spacing w:after="160" w:line="276" w:lineRule="auto"/>
+        <w:spacing w:before="0" w:after="80" w:line="269" w:lineRule="auto"/>
+      </w:pPr>
+    </w:p>
+    <w:p>
+      <w:pPr>
+        <w:spacing w:before="0" w:after="120" w:line="269" w:lineRule="auto"/>
       </w:pPr>
       <w:r>
         <w:rPr>
@@ -1563,12 +1550,12 @@
     </w:p>
     <w:p>
       <w:pPr>
-        <w:spacing w:after="80"/>
-      </w:pPr>
-    </w:p>
-    <w:p>
-      <w:pPr>
-        <w:spacing w:after="160" w:line="276" w:lineRule="auto"/>
+        <w:spacing w:before="0" w:after="80" w:line="269" w:lineRule="auto"/>
+      </w:pPr>
+    </w:p>
+    <w:p>
+      <w:pPr>
+        <w:spacing w:before="0" w:after="80" w:line="269" w:lineRule="auto"/>
       </w:pPr>
       <w:r>
         <w:rPr>
@@ -1581,12 +1568,12 @@
     </w:p>
     <w:p>
       <w:pPr>
-        <w:spacing w:after="80"/>
-      </w:pPr>
-    </w:p>
-    <w:p>
-      <w:pPr>
-        <w:spacing w:after="160" w:line="276" w:lineRule="auto"/>
+        <w:spacing w:before="0" w:after="80" w:line="269" w:lineRule="auto"/>
+      </w:pPr>
+    </w:p>
+    <w:p>
+      <w:pPr>
+        <w:spacing w:before="0" w:after="120" w:line="269" w:lineRule="auto"/>
       </w:pPr>
       <w:r>
         <w:rPr>
@@ -1599,12 +1586,12 @@
     </w:p>
     <w:p>
       <w:pPr>
-        <w:spacing w:after="80"/>
-      </w:pPr>
-    </w:p>
-    <w:p>
-      <w:pPr>
-        <w:spacing w:after="160" w:line="276" w:lineRule="auto"/>
+        <w:spacing w:before="0" w:after="80" w:line="269" w:lineRule="auto"/>
+      </w:pPr>
+    </w:p>
+    <w:p>
+      <w:pPr>
+        <w:spacing w:before="0" w:after="80" w:line="269" w:lineRule="auto"/>
       </w:pPr>
       <w:r>
         <w:rPr>
@@ -1617,12 +1604,12 @@
     </w:p>
     <w:p>
       <w:pPr>
-        <w:spacing w:after="80"/>
-      </w:pPr>
-    </w:p>
-    <w:p>
-      <w:pPr>
-        <w:spacing w:after="160" w:line="276" w:lineRule="auto"/>
+        <w:spacing w:before="0" w:after="80" w:line="269" w:lineRule="auto"/>
+      </w:pPr>
+    </w:p>
+    <w:p>
+      <w:pPr>
+        <w:spacing w:before="0" w:after="120" w:line="269" w:lineRule="auto"/>
       </w:pPr>
       <w:r>
         <w:rPr>
@@ -1635,22 +1622,22 @@
     </w:p>
     <w:p>
       <w:pPr>
-        <w:spacing w:after="80"/>
-      </w:pPr>
-    </w:p>
-    <w:p>
-      <w:pPr>
-        <w:spacing w:after="80"/>
-      </w:pPr>
-    </w:p>
-    <w:p>
-      <w:pPr>
-        <w:spacing w:after="80"/>
-      </w:pPr>
-    </w:p>
-    <w:p>
-      <w:pPr>
-        <w:spacing w:after="160" w:line="276" w:lineRule="auto"/>
+        <w:spacing w:before="0" w:after="80" w:line="269" w:lineRule="auto"/>
+      </w:pPr>
+    </w:p>
+    <w:p>
+      <w:pPr>
+        <w:spacing w:before="0" w:after="80" w:line="269" w:lineRule="auto"/>
+      </w:pPr>
+    </w:p>
+    <w:p>
+      <w:pPr>
+        <w:spacing w:before="0" w:after="80" w:line="269" w:lineRule="auto"/>
+      </w:pPr>
+    </w:p>
+    <w:p>
+      <w:pPr>
+        <w:spacing w:before="200" w:after="80" w:line="269" w:lineRule="auto"/>
       </w:pPr>
       <w:r>
         <w:rPr>
@@ -1663,12 +1650,12 @@
     </w:p>
     <w:p>
       <w:pPr>
-        <w:spacing w:after="80"/>
-      </w:pPr>
-    </w:p>
-    <w:p>
-      <w:pPr>
-        <w:spacing w:after="160" w:line="276" w:lineRule="auto"/>
+        <w:spacing w:before="0" w:after="80" w:line="269" w:lineRule="auto"/>
+      </w:pPr>
+    </w:p>
+    <w:p>
+      <w:pPr>
+        <w:spacing w:before="0" w:after="80" w:line="269" w:lineRule="auto"/>
       </w:pPr>
       <w:r>
         <w:rPr>
@@ -1681,12 +1668,12 @@
     </w:p>
     <w:p>
       <w:pPr>
-        <w:spacing w:after="80"/>
-      </w:pPr>
-    </w:p>
-    <w:p>
-      <w:pPr>
-        <w:spacing w:after="160" w:line="276" w:lineRule="auto"/>
+        <w:spacing w:before="0" w:after="80" w:line="269" w:lineRule="auto"/>
+      </w:pPr>
+    </w:p>
+    <w:p>
+      <w:pPr>
+        <w:spacing w:before="0" w:after="80" w:line="269" w:lineRule="auto"/>
       </w:pPr>
       <w:r>
         <w:rPr>
@@ -1699,12 +1686,12 @@
     </w:p>
     <w:p>
       <w:pPr>
-        <w:spacing w:after="80"/>
-      </w:pPr>
-    </w:p>
-    <w:p>
-      <w:pPr>
-        <w:spacing w:after="160" w:line="276" w:lineRule="auto"/>
+        <w:spacing w:before="0" w:after="80" w:line="269" w:lineRule="auto"/>
+      </w:pPr>
+    </w:p>
+    <w:p>
+      <w:pPr>
+        <w:spacing w:before="0" w:after="120" w:line="269" w:lineRule="auto"/>
       </w:pPr>
       <w:r>
         <w:rPr>
@@ -1717,12 +1704,12 @@
     </w:p>
     <w:p>
       <w:pPr>
-        <w:spacing w:after="80"/>
-      </w:pPr>
-    </w:p>
-    <w:p>
-      <w:pPr>
-        <w:spacing w:after="160" w:line="276" w:lineRule="auto"/>
+        <w:spacing w:before="0" w:after="80" w:line="269" w:lineRule="auto"/>
+      </w:pPr>
+    </w:p>
+    <w:p>
+      <w:pPr>
+        <w:spacing w:before="0" w:after="80" w:line="269" w:lineRule="auto"/>
       </w:pPr>
       <w:r>
         <w:rPr>
@@ -1735,12 +1722,12 @@
     </w:p>
     <w:p>
       <w:pPr>
-        <w:spacing w:after="80"/>
-      </w:pPr>
-    </w:p>
-    <w:p>
-      <w:pPr>
-        <w:spacing w:after="160" w:line="276" w:lineRule="auto"/>
+        <w:spacing w:before="0" w:after="80" w:line="269" w:lineRule="auto"/>
+      </w:pPr>
+    </w:p>
+    <w:p>
+      <w:pPr>
+        <w:spacing w:before="0" w:after="120" w:line="269" w:lineRule="auto"/>
       </w:pPr>
       <w:r>
         <w:rPr>
@@ -1753,12 +1740,12 @@
     </w:p>
     <w:p>
       <w:pPr>
-        <w:spacing w:after="80"/>
-      </w:pPr>
-    </w:p>
-    <w:p>
-      <w:pPr>
-        <w:spacing w:after="160" w:line="276" w:lineRule="auto"/>
+        <w:spacing w:before="0" w:after="80" w:line="269" w:lineRule="auto"/>
+      </w:pPr>
+    </w:p>
+    <w:p>
+      <w:pPr>
+        <w:spacing w:before="0" w:after="80" w:line="269" w:lineRule="auto"/>
       </w:pPr>
       <w:r>
         <w:rPr>
@@ -1771,12 +1758,12 @@
     </w:p>
     <w:p>
       <w:pPr>
-        <w:spacing w:after="80"/>
-      </w:pPr>
-    </w:p>
-    <w:p>
-      <w:pPr>
-        <w:spacing w:after="160" w:line="276" w:lineRule="auto"/>
+        <w:spacing w:before="0" w:after="80" w:line="269" w:lineRule="auto"/>
+      </w:pPr>
+    </w:p>
+    <w:p>
+      <w:pPr>
+        <w:spacing w:before="0" w:after="120" w:line="269" w:lineRule="auto"/>
       </w:pPr>
       <w:r>
         <w:rPr>
@@ -1789,12 +1776,12 @@
     </w:p>
     <w:p>
       <w:pPr>
-        <w:spacing w:after="80"/>
-      </w:pPr>
-    </w:p>
-    <w:p>
-      <w:pPr>
-        <w:spacing w:after="160" w:line="276" w:lineRule="auto"/>
+        <w:spacing w:before="0" w:after="80" w:line="269" w:lineRule="auto"/>
+      </w:pPr>
+    </w:p>
+    <w:p>
+      <w:pPr>
+        <w:spacing w:before="0" w:after="80" w:line="269" w:lineRule="auto"/>
       </w:pPr>
       <w:r>
         <w:rPr>
@@ -1807,12 +1794,12 @@
     </w:p>
     <w:p>
       <w:pPr>
-        <w:spacing w:after="80"/>
-      </w:pPr>
-    </w:p>
-    <w:p>
-      <w:pPr>
-        <w:spacing w:after="160" w:line="276" w:lineRule="auto"/>
+        <w:spacing w:before="0" w:after="80" w:line="269" w:lineRule="auto"/>
+      </w:pPr>
+    </w:p>
+    <w:p>
+      <w:pPr>
+        <w:spacing w:before="0" w:after="120" w:line="269" w:lineRule="auto"/>
       </w:pPr>
       <w:r>
         <w:rPr>
@@ -1825,12 +1812,12 @@
     </w:p>
     <w:p>
       <w:pPr>
-        <w:spacing w:after="80"/>
-      </w:pPr>
-    </w:p>
-    <w:p>
-      <w:pPr>
-        <w:spacing w:after="160" w:line="276" w:lineRule="auto"/>
+        <w:spacing w:before="0" w:after="80" w:line="269" w:lineRule="auto"/>
+      </w:pPr>
+    </w:p>
+    <w:p>
+      <w:pPr>
+        <w:spacing w:before="0" w:after="80" w:line="269" w:lineRule="auto"/>
       </w:pPr>
       <w:r>
         <w:rPr>
@@ -1843,12 +1830,12 @@
     </w:p>
     <w:p>
       <w:pPr>
-        <w:spacing w:after="80"/>
-      </w:pPr>
-    </w:p>
-    <w:p>
-      <w:pPr>
-        <w:spacing w:after="160" w:line="276" w:lineRule="auto"/>
+        <w:spacing w:before="0" w:after="80" w:line="269" w:lineRule="auto"/>
+      </w:pPr>
+    </w:p>
+    <w:p>
+      <w:pPr>
+        <w:spacing w:before="0" w:after="120" w:line="269" w:lineRule="auto"/>
       </w:pPr>
       <w:r>
         <w:rPr>
@@ -1861,22 +1848,22 @@
     </w:p>
     <w:p>
       <w:pPr>
-        <w:spacing w:after="80"/>
-      </w:pPr>
-    </w:p>
-    <w:p>
-      <w:pPr>
-        <w:spacing w:after="80"/>
-      </w:pPr>
-    </w:p>
-    <w:p>
-      <w:pPr>
-        <w:spacing w:after="80"/>
-      </w:pPr>
-    </w:p>
-    <w:p>
-      <w:pPr>
-        <w:spacing w:after="160" w:line="276" w:lineRule="auto"/>
+        <w:spacing w:before="0" w:after="80" w:line="269" w:lineRule="auto"/>
+      </w:pPr>
+    </w:p>
+    <w:p>
+      <w:pPr>
+        <w:spacing w:before="0" w:after="80" w:line="269" w:lineRule="auto"/>
+      </w:pPr>
+    </w:p>
+    <w:p>
+      <w:pPr>
+        <w:spacing w:before="0" w:after="80" w:line="269" w:lineRule="auto"/>
+      </w:pPr>
+    </w:p>
+    <w:p>
+      <w:pPr>
+        <w:spacing w:before="200" w:after="80" w:line="269" w:lineRule="auto"/>
       </w:pPr>
       <w:r>
         <w:rPr>
@@ -1889,12 +1876,12 @@
     </w:p>
     <w:p>
       <w:pPr>
-        <w:spacing w:after="80"/>
-      </w:pPr>
-    </w:p>
-    <w:p>
-      <w:pPr>
-        <w:spacing w:after="160" w:line="276" w:lineRule="auto"/>
+        <w:spacing w:before="0" w:after="80" w:line="269" w:lineRule="auto"/>
+      </w:pPr>
+    </w:p>
+    <w:p>
+      <w:pPr>
+        <w:spacing w:before="0" w:after="80" w:line="269" w:lineRule="auto"/>
       </w:pPr>
       <w:r>
         <w:rPr>
@@ -1907,12 +1894,12 @@
     </w:p>
     <w:p>
       <w:pPr>
-        <w:spacing w:after="80"/>
-      </w:pPr>
-    </w:p>
-    <w:p>
-      <w:pPr>
-        <w:spacing w:after="160" w:line="276" w:lineRule="auto"/>
+        <w:spacing w:before="0" w:after="80" w:line="269" w:lineRule="auto"/>
+      </w:pPr>
+    </w:p>
+    <w:p>
+      <w:pPr>
+        <w:spacing w:before="0" w:after="80" w:line="269" w:lineRule="auto"/>
       </w:pPr>
       <w:r>
         <w:rPr>
@@ -1925,12 +1912,12 @@
     </w:p>
     <w:p>
       <w:pPr>
-        <w:spacing w:after="80"/>
-      </w:pPr>
-    </w:p>
-    <w:p>
-      <w:pPr>
-        <w:spacing w:after="160" w:line="276" w:lineRule="auto"/>
+        <w:spacing w:before="0" w:after="80" w:line="269" w:lineRule="auto"/>
+      </w:pPr>
+    </w:p>
+    <w:p>
+      <w:pPr>
+        <w:spacing w:before="0" w:after="120" w:line="269" w:lineRule="auto"/>
       </w:pPr>
       <w:r>
         <w:rPr>
@@ -1943,12 +1930,12 @@
     </w:p>
     <w:p>
       <w:pPr>
-        <w:spacing w:after="80"/>
-      </w:pPr>
-    </w:p>
-    <w:p>
-      <w:pPr>
-        <w:spacing w:after="160" w:line="276" w:lineRule="auto"/>
+        <w:spacing w:before="0" w:after="80" w:line="269" w:lineRule="auto"/>
+      </w:pPr>
+    </w:p>
+    <w:p>
+      <w:pPr>
+        <w:spacing w:before="0" w:after="40" w:line="269" w:lineRule="auto"/>
       </w:pPr>
       <w:r>
         <w:rPr>
@@ -1961,12 +1948,12 @@
     </w:p>
     <w:p>
       <w:pPr>
-        <w:spacing w:after="80"/>
-      </w:pPr>
-    </w:p>
-    <w:p>
-      <w:pPr>
-        <w:spacing w:after="160" w:line="276" w:lineRule="auto"/>
+        <w:spacing w:before="0" w:after="80" w:line="269" w:lineRule="auto"/>
+      </w:pPr>
+    </w:p>
+    <w:p>
+      <w:pPr>
+        <w:spacing w:before="0" w:after="20" w:line="269" w:lineRule="auto"/>
       </w:pPr>
       <w:r>
         <w:rPr>
@@ -1979,12 +1966,12 @@
     </w:p>
     <w:p>
       <w:pPr>
-        <w:spacing w:after="80"/>
-      </w:pPr>
-    </w:p>
-    <w:p>
-      <w:pPr>
-        <w:spacing w:after="160" w:line="276" w:lineRule="auto"/>
+        <w:spacing w:before="0" w:after="80" w:line="269" w:lineRule="auto"/>
+      </w:pPr>
+    </w:p>
+    <w:p>
+      <w:pPr>
+        <w:spacing w:before="0" w:after="80" w:line="269" w:lineRule="auto"/>
       </w:pPr>
       <w:r>
         <w:rPr>
@@ -1997,12 +1984,12 @@
     </w:p>
     <w:p>
       <w:pPr>
-        <w:spacing w:after="80"/>
-      </w:pPr>
-    </w:p>
-    <w:p>
-      <w:pPr>
-        <w:spacing w:after="160" w:line="276" w:lineRule="auto"/>
+        <w:spacing w:before="0" w:after="80" w:line="269" w:lineRule="auto"/>
+      </w:pPr>
+    </w:p>
+    <w:p>
+      <w:pPr>
+        <w:spacing w:before="0" w:after="120" w:line="269" w:lineRule="auto"/>
       </w:pPr>
       <w:r>
         <w:rPr>
@@ -2015,12 +2002,12 @@
     </w:p>
     <w:p>
       <w:pPr>
-        <w:spacing w:after="80"/>
-      </w:pPr>
-    </w:p>
-    <w:p>
-      <w:pPr>
-        <w:spacing w:after="160" w:line="276" w:lineRule="auto"/>
+        <w:spacing w:before="0" w:after="80" w:line="269" w:lineRule="auto"/>
+      </w:pPr>
+    </w:p>
+    <w:p>
+      <w:pPr>
+        <w:spacing w:before="0" w:after="40" w:line="269" w:lineRule="auto"/>
       </w:pPr>
       <w:r>
         <w:rPr>
@@ -2033,12 +2020,12 @@
     </w:p>
     <w:p>
       <w:pPr>
-        <w:spacing w:after="80"/>
-      </w:pPr>
-    </w:p>
-    <w:p>
-      <w:pPr>
-        <w:spacing w:after="160" w:line="276" w:lineRule="auto"/>
+        <w:spacing w:before="0" w:after="80" w:line="269" w:lineRule="auto"/>
+      </w:pPr>
+    </w:p>
+    <w:p>
+      <w:pPr>
+        <w:spacing w:before="0" w:after="20" w:line="269" w:lineRule="auto"/>
       </w:pPr>
       <w:r>
         <w:rPr>
@@ -2051,12 +2038,12 @@
     </w:p>
     <w:p>
       <w:pPr>
-        <w:spacing w:after="80"/>
-      </w:pPr>
-    </w:p>
-    <w:p>
-      <w:pPr>
-        <w:spacing w:after="160" w:line="276" w:lineRule="auto"/>
+        <w:spacing w:before="0" w:after="80" w:line="269" w:lineRule="auto"/>
+      </w:pPr>
+    </w:p>
+    <w:p>
+      <w:pPr>
+        <w:spacing w:before="0" w:after="80" w:line="269" w:lineRule="auto"/>
       </w:pPr>
       <w:r>
         <w:rPr>
@@ -2069,12 +2056,12 @@
     </w:p>
     <w:p>
       <w:pPr>
-        <w:spacing w:after="80"/>
-      </w:pPr>
-    </w:p>
-    <w:p>
-      <w:pPr>
-        <w:spacing w:after="160" w:line="276" w:lineRule="auto"/>
+        <w:spacing w:before="0" w:after="80" w:line="269" w:lineRule="auto"/>
+      </w:pPr>
+    </w:p>
+    <w:p>
+      <w:pPr>
+        <w:spacing w:before="0" w:after="120" w:line="269" w:lineRule="auto"/>
       </w:pPr>
       <w:r>
         <w:rPr>
@@ -2087,12 +2074,12 @@
     </w:p>
     <w:p>
       <w:pPr>
-        <w:spacing w:after="80"/>
-      </w:pPr>
-    </w:p>
-    <w:p>
-      <w:pPr>
-        <w:spacing w:after="160" w:line="276" w:lineRule="auto"/>
+        <w:spacing w:before="0" w:after="80" w:line="269" w:lineRule="auto"/>
+      </w:pPr>
+    </w:p>
+    <w:p>
+      <w:pPr>
+        <w:spacing w:before="0" w:after="40" w:line="269" w:lineRule="auto"/>
       </w:pPr>
       <w:r>
         <w:rPr>
@@ -2105,12 +2092,12 @@
     </w:p>
     <w:p>
       <w:pPr>
-        <w:spacing w:after="80"/>
-      </w:pPr>
-    </w:p>
-    <w:p>
-      <w:pPr>
-        <w:spacing w:after="160" w:line="276" w:lineRule="auto"/>
+        <w:spacing w:before="0" w:after="80" w:line="269" w:lineRule="auto"/>
+      </w:pPr>
+    </w:p>
+    <w:p>
+      <w:pPr>
+        <w:spacing w:before="0" w:after="20" w:line="269" w:lineRule="auto"/>
       </w:pPr>
       <w:r>
         <w:rPr>
@@ -2123,22 +2110,22 @@
     </w:p>
     <w:p>
       <w:pPr>
-        <w:spacing w:after="80"/>
-      </w:pPr>
-    </w:p>
-    <w:p>
-      <w:pPr>
-        <w:spacing w:after="80"/>
-      </w:pPr>
-    </w:p>
-    <w:p>
-      <w:pPr>
-        <w:spacing w:after="80"/>
-      </w:pPr>
-    </w:p>
-    <w:p>
-      <w:pPr>
-        <w:spacing w:after="160" w:line="276" w:lineRule="auto"/>
+        <w:spacing w:before="0" w:after="80" w:line="269" w:lineRule="auto"/>
+      </w:pPr>
+    </w:p>
+    <w:p>
+      <w:pPr>
+        <w:spacing w:before="0" w:after="80" w:line="269" w:lineRule="auto"/>
+      </w:pPr>
+    </w:p>
+    <w:p>
+      <w:pPr>
+        <w:spacing w:before="0" w:after="80" w:line="269" w:lineRule="auto"/>
+      </w:pPr>
+    </w:p>
+    <w:p>
+      <w:pPr>
+        <w:spacing w:before="200" w:after="80" w:line="269" w:lineRule="auto"/>
       </w:pPr>
       <w:r>
         <w:rPr>
@@ -2151,12 +2138,12 @@
     </w:p>
     <w:p>
       <w:pPr>
-        <w:spacing w:after="80"/>
-      </w:pPr>
-    </w:p>
-    <w:p>
-      <w:pPr>
-        <w:spacing w:after="160" w:line="276" w:lineRule="auto"/>
+        <w:spacing w:before="0" w:after="80" w:line="269" w:lineRule="auto"/>
+      </w:pPr>
+    </w:p>
+    <w:p>
+      <w:pPr>
+        <w:spacing w:before="0" w:after="80" w:line="269" w:lineRule="auto"/>
       </w:pPr>
       <w:r>
         <w:rPr>
@@ -2169,12 +2156,12 @@
     </w:p>
     <w:p>
       <w:pPr>
-        <w:spacing w:after="80"/>
-      </w:pPr>
-    </w:p>
-    <w:p>
-      <w:pPr>
-        <w:spacing w:after="160" w:line="276" w:lineRule="auto"/>
+        <w:spacing w:before="0" w:after="80" w:line="269" w:lineRule="auto"/>
+      </w:pPr>
+    </w:p>
+    <w:p>
+      <w:pPr>
+        <w:spacing w:before="0" w:after="40" w:line="269" w:lineRule="auto"/>
       </w:pPr>
       <w:r>
         <w:rPr>
@@ -2187,12 +2174,12 @@
     </w:p>
     <w:p>
       <w:pPr>
-        <w:spacing w:after="80"/>
-      </w:pPr>
-    </w:p>
-    <w:p>
-      <w:pPr>
-        <w:spacing w:after="160" w:line="276" w:lineRule="auto"/>
+        <w:spacing w:before="0" w:after="80" w:line="269" w:lineRule="auto"/>
+      </w:pPr>
+    </w:p>
+    <w:p>
+      <w:pPr>
+        <w:spacing w:before="0" w:after="20" w:line="269" w:lineRule="auto"/>
       </w:pPr>
       <w:r>
         <w:rPr>
@@ -2205,12 +2192,12 @@
     </w:p>
     <w:p>
       <w:pPr>
-        <w:spacing w:after="80"/>
-      </w:pPr>
-    </w:p>
-    <w:p>
-      <w:pPr>
-        <w:spacing w:after="160" w:line="276" w:lineRule="auto"/>
+        <w:spacing w:before="0" w:after="80" w:line="269" w:lineRule="auto"/>
+      </w:pPr>
+    </w:p>
+    <w:p>
+      <w:pPr>
+        <w:spacing w:before="0" w:after="20" w:line="269" w:lineRule="auto"/>
       </w:pPr>
       <w:r>
         <w:rPr>
@@ -2223,12 +2210,12 @@
     </w:p>
     <w:p>
       <w:pPr>
-        <w:spacing w:after="80"/>
-      </w:pPr>
-    </w:p>
-    <w:p>
-      <w:pPr>
-        <w:spacing w:after="160" w:line="276" w:lineRule="auto"/>
+        <w:spacing w:before="0" w:after="80" w:line="269" w:lineRule="auto"/>
+      </w:pPr>
+    </w:p>
+    <w:p>
+      <w:pPr>
+        <w:spacing w:before="0" w:after="20" w:line="269" w:lineRule="auto"/>
       </w:pPr>
       <w:r>
         <w:rPr>
@@ -2241,17 +2228,17 @@
     </w:p>
     <w:p>
       <w:pPr>
-        <w:spacing w:after="80"/>
-      </w:pPr>
-    </w:p>
-    <w:p>
-      <w:pPr>
-        <w:spacing w:after="80"/>
-      </w:pPr>
-    </w:p>
-    <w:p>
-      <w:pPr>
-        <w:spacing w:after="80"/>
+        <w:spacing w:before="0" w:after="80" w:line="269" w:lineRule="auto"/>
+      </w:pPr>
+    </w:p>
+    <w:p>
+      <w:pPr>
+        <w:spacing w:before="0" w:after="80" w:line="269" w:lineRule="auto"/>
+      </w:pPr>
+    </w:p>
+    <w:p>
+      <w:pPr>
+        <w:spacing w:before="0" w:after="80" w:line="269" w:lineRule="auto"/>
       </w:pPr>
     </w:p>
     <w:p>
@@ -2261,7 +2248,7 @@
     </w:p>
     <w:p>
       <w:pPr>
-        <w:spacing w:after="160" w:line="276" w:lineRule="auto"/>
+        <w:spacing w:before="0" w:after="200" w:line="269" w:lineRule="auto"/>
       </w:pPr>
       <w:r>
         <w:rPr>
@@ -2274,12 +2261,12 @@
     </w:p>
     <w:p>
       <w:pPr>
-        <w:spacing w:after="80"/>
-      </w:pPr>
-    </w:p>
-    <w:p>
-      <w:pPr>
-        <w:spacing w:after="160" w:line="276" w:lineRule="auto"/>
+        <w:spacing w:before="0" w:after="80" w:line="269" w:lineRule="auto"/>
+      </w:pPr>
+    </w:p>
+    <w:p>
+      <w:pPr>
+        <w:spacing w:before="200" w:after="80" w:line="269" w:lineRule="auto"/>
       </w:pPr>
       <w:r>
         <w:rPr>
@@ -2292,12 +2279,12 @@
     </w:p>
     <w:p>
       <w:pPr>
-        <w:spacing w:after="80"/>
-      </w:pPr>
-    </w:p>
-    <w:p>
-      <w:pPr>
-        <w:spacing w:after="160" w:line="276" w:lineRule="auto"/>
+        <w:spacing w:before="0" w:after="80" w:line="269" w:lineRule="auto"/>
+      </w:pPr>
+    </w:p>
+    <w:p>
+      <w:pPr>
+        <w:spacing w:before="0" w:after="0" w:line="269" w:lineRule="auto"/>
       </w:pPr>
       <w:r>
         <w:rPr>
@@ -2310,12 +2297,12 @@
     </w:p>
     <w:p>
       <w:pPr>
-        <w:spacing w:after="80"/>
-      </w:pPr>
-    </w:p>
-    <w:p>
-      <w:pPr>
-        <w:spacing w:after="160" w:line="276" w:lineRule="auto"/>
+        <w:spacing w:before="0" w:after="80" w:line="269" w:lineRule="auto"/>
+      </w:pPr>
+    </w:p>
+    <w:p>
+      <w:pPr>
+        <w:spacing w:before="0" w:after="80" w:line="269" w:lineRule="auto"/>
       </w:pPr>
       <w:r>
         <w:rPr>
@@ -2328,7 +2315,7 @@
     </w:p>
     <w:p>
       <w:pPr>
-        <w:spacing w:after="160" w:line="276" w:lineRule="auto"/>
+        <w:spacing w:before="0" w:after="80" w:line="269" w:lineRule="auto"/>
       </w:pPr>
       <w:r>
         <w:rPr>
@@ -2341,12 +2328,12 @@
     </w:p>
     <w:p>
       <w:pPr>
-        <w:spacing w:after="80"/>
-      </w:pPr>
-    </w:p>
-    <w:p>
-      <w:pPr>
-        <w:spacing w:after="160" w:line="276" w:lineRule="auto"/>
+        <w:spacing w:before="0" w:after="80" w:line="269" w:lineRule="auto"/>
+      </w:pPr>
+    </w:p>
+    <w:p>
+      <w:pPr>
+        <w:spacing w:before="0" w:after="0" w:line="269" w:lineRule="auto"/>
       </w:pPr>
       <w:r>
         <w:rPr>
@@ -2359,7 +2346,7 @@
     </w:p>
     <w:p>
       <w:pPr>
-        <w:spacing w:after="160" w:line="276" w:lineRule="auto"/>
+        <w:spacing w:before="0" w:after="80" w:line="269" w:lineRule="auto"/>
       </w:pPr>
       <w:r>
         <w:rPr>
@@ -2372,12 +2359,12 @@
     </w:p>
     <w:p>
       <w:pPr>
-        <w:spacing w:after="80"/>
-      </w:pPr>
-    </w:p>
-    <w:p>
-      <w:pPr>
-        <w:spacing w:after="160" w:line="276" w:lineRule="auto"/>
+        <w:spacing w:before="0" w:after="80" w:line="269" w:lineRule="auto"/>
+      </w:pPr>
+    </w:p>
+    <w:p>
+      <w:pPr>
+        <w:spacing w:before="200" w:after="80" w:line="269" w:lineRule="auto"/>
       </w:pPr>
       <w:r>
         <w:rPr>
@@ -2390,12 +2377,12 @@
     </w:p>
     <w:p>
       <w:pPr>
-        <w:spacing w:after="80"/>
-      </w:pPr>
-    </w:p>
-    <w:p>
-      <w:pPr>
-        <w:spacing w:after="160" w:line="276" w:lineRule="auto"/>
+        <w:spacing w:before="0" w:after="80" w:line="269" w:lineRule="auto"/>
+      </w:pPr>
+    </w:p>
+    <w:p>
+      <w:pPr>
+        <w:spacing w:before="0" w:after="0" w:line="269" w:lineRule="auto"/>
       </w:pPr>
       <w:r>
         <w:rPr>
@@ -2408,12 +2395,12 @@
     </w:p>
     <w:p>
       <w:pPr>
-        <w:spacing w:after="80"/>
-      </w:pPr>
-    </w:p>
-    <w:p>
-      <w:pPr>
-        <w:spacing w:after="160" w:line="276" w:lineRule="auto"/>
+        <w:spacing w:before="0" w:after="80" w:line="269" w:lineRule="auto"/>
+      </w:pPr>
+    </w:p>
+    <w:p>
+      <w:pPr>
+        <w:spacing w:before="0" w:after="80" w:line="269" w:lineRule="auto"/>
       </w:pPr>
       <w:r>
         <w:rPr>
@@ -2426,12 +2413,12 @@
     </w:p>
     <w:p>
       <w:pPr>
-        <w:spacing w:after="80"/>
-      </w:pPr>
-    </w:p>
-    <w:p>
-      <w:pPr>
-        <w:spacing w:after="160" w:line="276" w:lineRule="auto"/>
+        <w:spacing w:before="0" w:after="80" w:line="269" w:lineRule="auto"/>
+      </w:pPr>
+    </w:p>
+    <w:p>
+      <w:pPr>
+        <w:spacing w:before="0" w:after="0" w:line="269" w:lineRule="auto"/>
       </w:pPr>
       <w:r>
         <w:rPr>
@@ -2444,7 +2431,7 @@
     </w:p>
     <w:p>
       <w:pPr>
-        <w:spacing w:after="160" w:line="276" w:lineRule="auto"/>
+        <w:spacing w:before="0" w:after="80" w:line="269" w:lineRule="auto"/>
       </w:pPr>
       <w:r>
         <w:rPr>
@@ -2457,12 +2444,12 @@
     </w:p>
     <w:p>
       <w:pPr>
-        <w:spacing w:after="80"/>
-      </w:pPr>
-    </w:p>
-    <w:p>
-      <w:pPr>
-        <w:spacing w:after="160" w:line="276" w:lineRule="auto"/>
+        <w:spacing w:before="0" w:after="80" w:line="269" w:lineRule="auto"/>
+      </w:pPr>
+    </w:p>
+    <w:p>
+      <w:pPr>
+        <w:spacing w:before="200" w:after="80" w:line="269" w:lineRule="auto"/>
       </w:pPr>
       <w:r>
         <w:rPr>
@@ -2475,12 +2462,12 @@
     </w:p>
     <w:p>
       <w:pPr>
-        <w:spacing w:after="80"/>
-      </w:pPr>
-    </w:p>
-    <w:p>
-      <w:pPr>
-        <w:spacing w:after="160" w:line="276" w:lineRule="auto"/>
+        <w:spacing w:before="0" w:after="80" w:line="269" w:lineRule="auto"/>
+      </w:pPr>
+    </w:p>
+    <w:p>
+      <w:pPr>
+        <w:spacing w:before="0" w:after="0" w:line="269" w:lineRule="auto"/>
       </w:pPr>
       <w:r>
         <w:rPr>
@@ -2493,12 +2480,12 @@
     </w:p>
     <w:p>
       <w:pPr>
-        <w:spacing w:after="80"/>
-      </w:pPr>
-    </w:p>
-    <w:p>
-      <w:pPr>
-        <w:spacing w:after="160" w:line="276" w:lineRule="auto"/>
+        <w:spacing w:before="0" w:after="80" w:line="269" w:lineRule="auto"/>
+      </w:pPr>
+    </w:p>
+    <w:p>
+      <w:pPr>
+        <w:spacing w:before="0" w:after="80" w:line="269" w:lineRule="auto"/>
       </w:pPr>
       <w:r>
         <w:rPr>
@@ -2511,12 +2498,12 @@
     </w:p>
     <w:p>
       <w:pPr>
-        <w:spacing w:after="80"/>
-      </w:pPr>
-    </w:p>
-    <w:p>
-      <w:pPr>
-        <w:spacing w:after="160" w:line="276" w:lineRule="auto"/>
+        <w:spacing w:before="0" w:after="80" w:line="269" w:lineRule="auto"/>
+      </w:pPr>
+    </w:p>
+    <w:p>
+      <w:pPr>
+        <w:spacing w:before="0" w:after="0" w:line="269" w:lineRule="auto"/>
       </w:pPr>
       <w:r>
         <w:rPr>
@@ -2529,7 +2516,7 @@
     </w:p>
     <w:p>
       <w:pPr>
-        <w:spacing w:after="160" w:line="276" w:lineRule="auto"/>
+        <w:spacing w:before="0" w:after="80" w:line="269" w:lineRule="auto"/>
       </w:pPr>
       <w:r>
         <w:rPr>
@@ -2542,12 +2529,12 @@
     </w:p>
     <w:p>
       <w:pPr>
-        <w:spacing w:after="80"/>
-      </w:pPr>
-    </w:p>
-    <w:p>
-      <w:pPr>
-        <w:spacing w:after="160" w:line="276" w:lineRule="auto"/>
+        <w:spacing w:before="0" w:after="80" w:line="269" w:lineRule="auto"/>
+      </w:pPr>
+    </w:p>
+    <w:p>
+      <w:pPr>
+        <w:spacing w:before="200" w:after="80" w:line="269" w:lineRule="auto"/>
       </w:pPr>
       <w:r>
         <w:rPr>
@@ -2560,12 +2547,12 @@
     </w:p>
     <w:p>
       <w:pPr>
-        <w:spacing w:after="80"/>
-      </w:pPr>
-    </w:p>
-    <w:p>
-      <w:pPr>
-        <w:spacing w:after="160" w:line="276" w:lineRule="auto"/>
+        <w:spacing w:before="0" w:after="80" w:line="269" w:lineRule="auto"/>
+      </w:pPr>
+    </w:p>
+    <w:p>
+      <w:pPr>
+        <w:spacing w:before="0" w:after="0" w:line="269" w:lineRule="auto"/>
       </w:pPr>
       <w:r>
         <w:rPr>
@@ -2578,12 +2565,12 @@
     </w:p>
     <w:p>
       <w:pPr>
-        <w:spacing w:after="80"/>
-      </w:pPr>
-    </w:p>
-    <w:p>
-      <w:pPr>
-        <w:spacing w:after="160" w:line="276" w:lineRule="auto"/>
+        <w:spacing w:before="0" w:after="80" w:line="269" w:lineRule="auto"/>
+      </w:pPr>
+    </w:p>
+    <w:p>
+      <w:pPr>
+        <w:spacing w:before="0" w:after="80" w:line="269" w:lineRule="auto"/>
       </w:pPr>
       <w:r>
         <w:rPr>
@@ -2596,7 +2583,7 @@
     </w:p>
     <w:p>
       <w:pPr>
-        <w:spacing w:after="160" w:line="276" w:lineRule="auto"/>
+        <w:spacing w:before="0" w:after="80" w:line="269" w:lineRule="auto"/>
       </w:pPr>
       <w:r>
         <w:rPr>
@@ -2609,7 +2596,7 @@
     </w:p>
     <w:p>
       <w:pPr>
-        <w:spacing w:after="160" w:line="276" w:lineRule="auto"/>
+        <w:spacing w:before="0" w:after="80" w:line="269" w:lineRule="auto"/>
       </w:pPr>
       <w:r>
         <w:rPr>
@@ -2622,7 +2609,7 @@
     </w:p>
     <w:p>
       <w:pPr>
-        <w:spacing w:after="160" w:line="276" w:lineRule="auto"/>
+        <w:spacing w:before="0" w:after="80" w:line="269" w:lineRule="auto"/>
       </w:pPr>
       <w:r>
         <w:rPr>
@@ -2635,7 +2622,7 @@
     </w:p>
     <w:p>
       <w:pPr>
-        <w:spacing w:after="160" w:line="276" w:lineRule="auto"/>
+        <w:spacing w:before="0" w:after="80" w:line="269" w:lineRule="auto"/>
       </w:pPr>
       <w:r>
         <w:rPr>
@@ -2648,7 +2635,7 @@
     </w:p>
     <w:p>
       <w:pPr>
-        <w:spacing w:after="160" w:line="276" w:lineRule="auto"/>
+        <w:spacing w:before="0" w:after="80" w:line="269" w:lineRule="auto"/>
       </w:pPr>
       <w:r>
         <w:rPr>
@@ -2661,12 +2648,12 @@
     </w:p>
     <w:p>
       <w:pPr>
-        <w:spacing w:after="80"/>
-      </w:pPr>
-    </w:p>
-    <w:p>
-      <w:pPr>
-        <w:spacing w:after="160" w:line="276" w:lineRule="auto"/>
+        <w:spacing w:before="0" w:after="80" w:line="269" w:lineRule="auto"/>
+      </w:pPr>
+    </w:p>
+    <w:p>
+      <w:pPr>
+        <w:spacing w:before="0" w:after="0" w:line="269" w:lineRule="auto"/>
       </w:pPr>
       <w:r>
         <w:rPr>
@@ -2679,7 +2666,7 @@
     </w:p>
     <w:p>
       <w:pPr>
-        <w:spacing w:after="160" w:line="276" w:lineRule="auto"/>
+        <w:spacing w:before="0" w:after="80" w:line="269" w:lineRule="auto"/>
       </w:pPr>
       <w:r>
         <w:rPr>
@@ -2692,12 +2679,12 @@
     </w:p>
     <w:p>
       <w:pPr>
-        <w:spacing w:after="80"/>
-      </w:pPr>
-    </w:p>
-    <w:p>
-      <w:pPr>
-        <w:spacing w:after="160" w:line="276" w:lineRule="auto"/>
+        <w:spacing w:before="0" w:after="80" w:line="269" w:lineRule="auto"/>
+      </w:pPr>
+    </w:p>
+    <w:p>
+      <w:pPr>
+        <w:spacing w:before="200" w:after="80" w:line="269" w:lineRule="auto"/>
       </w:pPr>
       <w:r>
         <w:rPr>
@@ -2710,12 +2697,12 @@
     </w:p>
     <w:p>
       <w:pPr>
-        <w:spacing w:after="80"/>
-      </w:pPr>
-    </w:p>
-    <w:p>
-      <w:pPr>
-        <w:spacing w:after="160" w:line="276" w:lineRule="auto"/>
+        <w:spacing w:before="0" w:after="80" w:line="269" w:lineRule="auto"/>
+      </w:pPr>
+    </w:p>
+    <w:p>
+      <w:pPr>
+        <w:spacing w:before="0" w:after="0" w:line="269" w:lineRule="auto"/>
       </w:pPr>
       <w:r>
         <w:rPr>
@@ -2728,12 +2715,12 @@
     </w:p>
     <w:p>
       <w:pPr>
-        <w:spacing w:after="80"/>
-      </w:pPr>
-    </w:p>
-    <w:p>
-      <w:pPr>
-        <w:spacing w:after="160" w:line="276" w:lineRule="auto"/>
+        <w:spacing w:before="0" w:after="80" w:line="269" w:lineRule="auto"/>
+      </w:pPr>
+    </w:p>
+    <w:p>
+      <w:pPr>
+        <w:spacing w:before="0" w:after="80" w:line="269" w:lineRule="auto"/>
       </w:pPr>
       <w:r>
         <w:rPr>
@@ -2746,7 +2733,7 @@
     </w:p>
     <w:p>
       <w:pPr>
-        <w:spacing w:after="160" w:line="276" w:lineRule="auto"/>
+        <w:spacing w:before="0" w:after="80" w:line="269" w:lineRule="auto"/>
       </w:pPr>
       <w:r>
         <w:rPr>
@@ -2759,7 +2746,7 @@
     </w:p>
     <w:p>
       <w:pPr>
-        <w:spacing w:after="160" w:line="276" w:lineRule="auto"/>
+        <w:spacing w:before="0" w:after="80" w:line="269" w:lineRule="auto"/>
       </w:pPr>
       <w:r>
         <w:rPr>
@@ -2772,7 +2759,7 @@
     </w:p>
     <w:p>
       <w:pPr>
-        <w:spacing w:after="160" w:line="276" w:lineRule="auto"/>
+        <w:spacing w:before="0" w:after="80" w:line="269" w:lineRule="auto"/>
       </w:pPr>
       <w:r>
         <w:rPr>
@@ -2785,7 +2772,7 @@
     </w:p>
     <w:p>
       <w:pPr>
-        <w:spacing w:after="160" w:line="276" w:lineRule="auto"/>
+        <w:spacing w:before="0" w:after="80" w:line="269" w:lineRule="auto"/>
       </w:pPr>
       <w:r>
         <w:rPr>
@@ -2798,7 +2785,7 @@
     </w:p>
     <w:p>
       <w:pPr>
-        <w:spacing w:after="160" w:line="276" w:lineRule="auto"/>
+        <w:spacing w:before="0" w:after="80" w:line="269" w:lineRule="auto"/>
       </w:pPr>
       <w:r>
         <w:rPr>
@@ -2811,12 +2798,12 @@
     </w:p>
     <w:p>
       <w:pPr>
-        <w:spacing w:after="80"/>
-      </w:pPr>
-    </w:p>
-    <w:p>
-      <w:pPr>
-        <w:spacing w:after="160" w:line="276" w:lineRule="auto"/>
+        <w:spacing w:before="0" w:after="80" w:line="269" w:lineRule="auto"/>
+      </w:pPr>
+    </w:p>
+    <w:p>
+      <w:pPr>
+        <w:spacing w:before="0" w:after="0" w:line="269" w:lineRule="auto"/>
       </w:pPr>
       <w:r>
         <w:rPr>
@@ -2829,7 +2816,7 @@
     </w:p>
     <w:p>
       <w:pPr>
-        <w:spacing w:after="160" w:line="276" w:lineRule="auto"/>
+        <w:spacing w:before="0" w:after="80" w:line="269" w:lineRule="auto"/>
       </w:pPr>
       <w:r>
         <w:rPr>
@@ -2842,12 +2829,12 @@
     </w:p>
     <w:p>
       <w:pPr>
-        <w:spacing w:after="80"/>
-      </w:pPr>
-    </w:p>
-    <w:p>
-      <w:pPr>
-        <w:spacing w:after="160" w:line="276" w:lineRule="auto"/>
+        <w:spacing w:before="0" w:after="80" w:line="269" w:lineRule="auto"/>
+      </w:pPr>
+    </w:p>
+    <w:p>
+      <w:pPr>
+        <w:spacing w:before="200" w:after="80" w:line="269" w:lineRule="auto"/>
       </w:pPr>
       <w:r>
         <w:rPr>
@@ -2860,12 +2847,12 @@
     </w:p>
     <w:p>
       <w:pPr>
-        <w:spacing w:after="80"/>
-      </w:pPr>
-    </w:p>
-    <w:p>
-      <w:pPr>
-        <w:spacing w:after="160" w:line="276" w:lineRule="auto"/>
+        <w:spacing w:before="0" w:after="80" w:line="269" w:lineRule="auto"/>
+      </w:pPr>
+    </w:p>
+    <w:p>
+      <w:pPr>
+        <w:spacing w:before="0" w:after="0" w:line="269" w:lineRule="auto"/>
       </w:pPr>
       <w:r>
         <w:rPr>
@@ -2878,12 +2865,12 @@
     </w:p>
     <w:p>
       <w:pPr>
-        <w:spacing w:after="80"/>
-      </w:pPr>
-    </w:p>
-    <w:p>
-      <w:pPr>
-        <w:spacing w:after="160" w:line="276" w:lineRule="auto"/>
+        <w:spacing w:before="0" w:after="80" w:line="269" w:lineRule="auto"/>
+      </w:pPr>
+    </w:p>
+    <w:p>
+      <w:pPr>
+        <w:spacing w:before="0" w:after="80" w:line="269" w:lineRule="auto"/>
       </w:pPr>
       <w:r>
         <w:rPr>
@@ -2896,7 +2883,7 @@
     </w:p>
     <w:p>
       <w:pPr>
-        <w:spacing w:after="160" w:line="276" w:lineRule="auto"/>
+        <w:spacing w:before="0" w:after="80" w:line="269" w:lineRule="auto"/>
       </w:pPr>
       <w:r>
         <w:rPr>
@@ -2909,12 +2896,12 @@
     </w:p>
     <w:p>
       <w:pPr>
-        <w:spacing w:after="80"/>
-      </w:pPr>
-    </w:p>
-    <w:p>
-      <w:pPr>
-        <w:spacing w:after="160" w:line="276" w:lineRule="auto"/>
+        <w:spacing w:before="0" w:after="80" w:line="269" w:lineRule="auto"/>
+      </w:pPr>
+    </w:p>
+    <w:p>
+      <w:pPr>
+        <w:spacing w:before="0" w:after="80" w:line="269" w:lineRule="auto"/>
       </w:pPr>
       <w:r>
         <w:rPr>
@@ -2927,7 +2914,7 @@
     </w:p>
     <w:p>
       <w:pPr>
-        <w:spacing w:after="160" w:line="276" w:lineRule="auto"/>
+        <w:spacing w:before="0" w:after="80" w:line="269" w:lineRule="auto"/>
       </w:pPr>
       <w:r>
         <w:rPr>
@@ -2940,12 +2927,12 @@
     </w:p>
     <w:p>
       <w:pPr>
-        <w:spacing w:after="80"/>
-      </w:pPr>
-    </w:p>
-    <w:p>
-      <w:pPr>
-        <w:spacing w:after="160" w:line="276" w:lineRule="auto"/>
+        <w:spacing w:before="0" w:after="80" w:line="269" w:lineRule="auto"/>
+      </w:pPr>
+    </w:p>
+    <w:p>
+      <w:pPr>
+        <w:spacing w:before="0" w:after="0" w:line="269" w:lineRule="auto"/>
       </w:pPr>
       <w:r>
         <w:rPr>
@@ -2958,7 +2945,7 @@
     </w:p>
     <w:p>
       <w:pPr>
-        <w:spacing w:after="160" w:line="276" w:lineRule="auto"/>
+        <w:spacing w:before="0" w:after="80" w:line="269" w:lineRule="auto"/>
       </w:pPr>
       <w:r>
         <w:rPr>
@@ -2971,12 +2958,12 @@
     </w:p>
     <w:p>
       <w:pPr>
-        <w:spacing w:after="80"/>
-      </w:pPr>
-    </w:p>
-    <w:p>
-      <w:pPr>
-        <w:spacing w:after="160" w:line="276" w:lineRule="auto"/>
+        <w:spacing w:before="0" w:after="80" w:line="269" w:lineRule="auto"/>
+      </w:pPr>
+    </w:p>
+    <w:p>
+      <w:pPr>
+        <w:spacing w:before="200" w:after="80" w:line="269" w:lineRule="auto"/>
       </w:pPr>
       <w:r>
         <w:rPr>
@@ -2989,12 +2976,12 @@
     </w:p>
     <w:p>
       <w:pPr>
-        <w:spacing w:after="80"/>
-      </w:pPr>
-    </w:p>
-    <w:p>
-      <w:pPr>
-        <w:spacing w:after="160" w:line="276" w:lineRule="auto"/>
+        <w:spacing w:before="0" w:after="80" w:line="269" w:lineRule="auto"/>
+      </w:pPr>
+    </w:p>
+    <w:p>
+      <w:pPr>
+        <w:spacing w:before="0" w:after="0" w:line="269" w:lineRule="auto"/>
       </w:pPr>
       <w:r>
         <w:rPr>
@@ -3007,12 +2994,12 @@
     </w:p>
     <w:p>
       <w:pPr>
-        <w:spacing w:after="80"/>
-      </w:pPr>
-    </w:p>
-    <w:p>
-      <w:pPr>
-        <w:spacing w:after="160" w:line="276" w:lineRule="auto"/>
+        <w:spacing w:before="0" w:after="80" w:line="269" w:lineRule="auto"/>
+      </w:pPr>
+    </w:p>
+    <w:p>
+      <w:pPr>
+        <w:spacing w:before="0" w:after="80" w:line="269" w:lineRule="auto"/>
       </w:pPr>
       <w:r>
         <w:rPr>
@@ -3025,7 +3012,7 @@
     </w:p>
     <w:p>
       <w:pPr>
-        <w:spacing w:after="160" w:line="276" w:lineRule="auto"/>
+        <w:spacing w:before="0" w:after="80" w:line="269" w:lineRule="auto"/>
       </w:pPr>
       <w:r>
         <w:rPr>
@@ -3038,7 +3025,7 @@
     </w:p>
     <w:p>
       <w:pPr>
-        <w:spacing w:after="160" w:line="276" w:lineRule="auto"/>
+        <w:spacing w:before="0" w:after="80" w:line="269" w:lineRule="auto"/>
       </w:pPr>
       <w:r>
         <w:rPr>
@@ -3051,7 +3038,7 @@
     </w:p>
     <w:p>
       <w:pPr>
-        <w:spacing w:after="160" w:line="276" w:lineRule="auto"/>
+        <w:spacing w:before="0" w:after="80" w:line="269" w:lineRule="auto"/>
       </w:pPr>
       <w:r>
         <w:rPr>
@@ -3064,7 +3051,7 @@
     </w:p>
     <w:p>
       <w:pPr>
-        <w:spacing w:after="160" w:line="276" w:lineRule="auto"/>
+        <w:spacing w:before="0" w:after="80" w:line="269" w:lineRule="auto"/>
       </w:pPr>
       <w:r>
         <w:rPr>
@@ -3077,7 +3064,7 @@
     </w:p>
     <w:p>
       <w:pPr>
-        <w:spacing w:after="160" w:line="276" w:lineRule="auto"/>
+        <w:spacing w:before="0" w:after="80" w:line="269" w:lineRule="auto"/>
       </w:pPr>
       <w:r>
         <w:rPr>
@@ -3090,12 +3077,12 @@
     </w:p>
     <w:p>
       <w:pPr>
-        <w:spacing w:after="80"/>
-      </w:pPr>
-    </w:p>
-    <w:p>
-      <w:pPr>
-        <w:spacing w:after="160" w:line="276" w:lineRule="auto"/>
+        <w:spacing w:before="0" w:after="80" w:line="269" w:lineRule="auto"/>
+      </w:pPr>
+    </w:p>
+    <w:p>
+      <w:pPr>
+        <w:spacing w:before="0" w:after="0" w:line="269" w:lineRule="auto"/>
       </w:pPr>
       <w:r>
         <w:rPr>
@@ -3108,7 +3095,7 @@
     </w:p>
     <w:p>
       <w:pPr>
-        <w:spacing w:after="160" w:line="276" w:lineRule="auto"/>
+        <w:spacing w:before="0" w:after="80" w:line="269" w:lineRule="auto"/>
       </w:pPr>
       <w:r>
         <w:rPr>
@@ -3121,12 +3108,12 @@
     </w:p>
     <w:p>
       <w:pPr>
-        <w:spacing w:after="80"/>
-      </w:pPr>
-    </w:p>
-    <w:p>
-      <w:pPr>
-        <w:spacing w:after="160" w:line="276" w:lineRule="auto"/>
+        <w:spacing w:before="0" w:after="80" w:line="269" w:lineRule="auto"/>
+      </w:pPr>
+    </w:p>
+    <w:p>
+      <w:pPr>
+        <w:spacing w:before="200" w:after="80" w:line="269" w:lineRule="auto"/>
       </w:pPr>
       <w:r>
         <w:rPr>
@@ -3139,12 +3126,12 @@
     </w:p>
     <w:p>
       <w:pPr>
-        <w:spacing w:after="80"/>
-      </w:pPr>
-    </w:p>
-    <w:p>
-      <w:pPr>
-        <w:spacing w:after="160" w:line="276" w:lineRule="auto"/>
+        <w:spacing w:before="0" w:after="80" w:line="269" w:lineRule="auto"/>
+      </w:pPr>
+    </w:p>
+    <w:p>
+      <w:pPr>
+        <w:spacing w:before="0" w:after="0" w:line="269" w:lineRule="auto"/>
       </w:pPr>
       <w:r>
         <w:rPr>
@@ -3157,12 +3144,12 @@
     </w:p>
     <w:p>
       <w:pPr>
-        <w:spacing w:after="80"/>
-      </w:pPr>
-    </w:p>
-    <w:p>
-      <w:pPr>
-        <w:spacing w:after="160" w:line="276" w:lineRule="auto"/>
+        <w:spacing w:before="0" w:after="80" w:line="269" w:lineRule="auto"/>
+      </w:pPr>
+    </w:p>
+    <w:p>
+      <w:pPr>
+        <w:spacing w:before="0" w:after="80" w:line="269" w:lineRule="auto"/>
       </w:pPr>
       <w:r>
         <w:rPr>
@@ -3175,7 +3162,7 @@
     </w:p>
     <w:p>
       <w:pPr>
-        <w:spacing w:after="160" w:line="276" w:lineRule="auto"/>
+        <w:spacing w:before="0" w:after="80" w:line="269" w:lineRule="auto"/>
       </w:pPr>
       <w:r>
         <w:rPr>
@@ -3188,7 +3175,7 @@
     </w:p>
     <w:p>
       <w:pPr>
-        <w:spacing w:after="160" w:line="276" w:lineRule="auto"/>
+        <w:spacing w:before="0" w:after="80" w:line="269" w:lineRule="auto"/>
       </w:pPr>
       <w:r>
         <w:rPr>
@@ -3201,7 +3188,7 @@
     </w:p>
     <w:p>
       <w:pPr>
-        <w:spacing w:after="160" w:line="276" w:lineRule="auto"/>
+        <w:spacing w:before="0" w:after="80" w:line="269" w:lineRule="auto"/>
       </w:pPr>
       <w:r>
         <w:rPr>
@@ -3214,7 +3201,7 @@
     </w:p>
     <w:p>
       <w:pPr>
-        <w:spacing w:after="160" w:line="276" w:lineRule="auto"/>
+        <w:spacing w:before="0" w:after="80" w:line="269" w:lineRule="auto"/>
       </w:pPr>
       <w:r>
         <w:rPr>
@@ -3227,12 +3214,12 @@
     </w:p>
     <w:p>
       <w:pPr>
-        <w:spacing w:after="80"/>
-      </w:pPr>
-    </w:p>
-    <w:p>
-      <w:pPr>
-        <w:spacing w:after="160" w:line="276" w:lineRule="auto"/>
+        <w:spacing w:before="0" w:after="80" w:line="269" w:lineRule="auto"/>
+      </w:pPr>
+    </w:p>
+    <w:p>
+      <w:pPr>
+        <w:spacing w:before="0" w:after="0" w:line="269" w:lineRule="auto"/>
       </w:pPr>
       <w:r>
         <w:rPr>
@@ -3245,7 +3232,7 @@
     </w:p>
     <w:p>
       <w:pPr>
-        <w:spacing w:after="160" w:line="276" w:lineRule="auto"/>
+        <w:spacing w:before="0" w:after="80" w:line="269" w:lineRule="auto"/>
       </w:pPr>
       <w:r>
         <w:rPr>
@@ -3258,12 +3245,12 @@
     </w:p>
     <w:p>
       <w:pPr>
-        <w:spacing w:after="80"/>
-      </w:pPr>
-    </w:p>
-    <w:p>
-      <w:pPr>
-        <w:spacing w:after="160" w:line="276" w:lineRule="auto"/>
+        <w:spacing w:before="0" w:after="80" w:line="269" w:lineRule="auto"/>
+      </w:pPr>
+    </w:p>
+    <w:p>
+      <w:pPr>
+        <w:spacing w:before="200" w:after="80" w:line="269" w:lineRule="auto"/>
       </w:pPr>
       <w:r>
         <w:rPr>
@@ -3276,12 +3263,12 @@
     </w:p>
     <w:p>
       <w:pPr>
-        <w:spacing w:after="80"/>
-      </w:pPr>
-    </w:p>
-    <w:p>
-      <w:pPr>
-        <w:spacing w:after="160" w:line="276" w:lineRule="auto"/>
+        <w:spacing w:before="0" w:after="80" w:line="269" w:lineRule="auto"/>
+      </w:pPr>
+    </w:p>
+    <w:p>
+      <w:pPr>
+        <w:spacing w:before="0" w:after="0" w:line="269" w:lineRule="auto"/>
       </w:pPr>
       <w:r>
         <w:rPr>
@@ -3294,12 +3281,12 @@
     </w:p>
     <w:p>
       <w:pPr>
-        <w:spacing w:after="80"/>
-      </w:pPr>
-    </w:p>
-    <w:p>
-      <w:pPr>
-        <w:spacing w:after="160" w:line="276" w:lineRule="auto"/>
+        <w:spacing w:before="0" w:after="80" w:line="269" w:lineRule="auto"/>
+      </w:pPr>
+    </w:p>
+    <w:p>
+      <w:pPr>
+        <w:spacing w:before="0" w:after="80" w:line="269" w:lineRule="auto"/>
       </w:pPr>
       <w:r>
         <w:rPr>
@@ -3312,7 +3299,7 @@
     </w:p>
     <w:p>
       <w:pPr>
-        <w:spacing w:after="160" w:line="276" w:lineRule="auto"/>
+        <w:spacing w:before="0" w:after="80" w:line="269" w:lineRule="auto"/>
       </w:pPr>
       <w:r>
         <w:rPr>
@@ -3325,7 +3312,7 @@
     </w:p>
     <w:p>
       <w:pPr>
-        <w:spacing w:after="160" w:line="276" w:lineRule="auto"/>
+        <w:spacing w:before="0" w:after="80" w:line="269" w:lineRule="auto"/>
       </w:pPr>
       <w:r>
         <w:rPr>
@@ -3338,12 +3325,12 @@
     </w:p>
     <w:p>
       <w:pPr>
-        <w:spacing w:after="80"/>
-      </w:pPr>
-    </w:p>
-    <w:p>
-      <w:pPr>
-        <w:spacing w:after="160" w:line="276" w:lineRule="auto"/>
+        <w:spacing w:before="0" w:after="80" w:line="269" w:lineRule="auto"/>
+      </w:pPr>
+    </w:p>
+    <w:p>
+      <w:pPr>
+        <w:spacing w:before="0" w:after="0" w:line="269" w:lineRule="auto"/>
       </w:pPr>
       <w:r>
         <w:rPr>
@@ -3356,7 +3343,7 @@
     </w:p>
     <w:p>
       <w:pPr>
-        <w:spacing w:after="160" w:line="276" w:lineRule="auto"/>
+        <w:spacing w:before="0" w:after="80" w:line="269" w:lineRule="auto"/>
       </w:pPr>
       <w:r>
         <w:rPr>
@@ -3369,12 +3356,12 @@
     </w:p>
     <w:p>
       <w:pPr>
-        <w:spacing w:after="80"/>
-      </w:pPr>
-    </w:p>
-    <w:p>
-      <w:pPr>
-        <w:spacing w:after="160" w:line="276" w:lineRule="auto"/>
+        <w:spacing w:before="0" w:after="80" w:line="269" w:lineRule="auto"/>
+      </w:pPr>
+    </w:p>
+    <w:p>
+      <w:pPr>
+        <w:spacing w:before="200" w:after="80" w:line="269" w:lineRule="auto"/>
       </w:pPr>
       <w:r>
         <w:rPr>
@@ -3387,12 +3374,12 @@
     </w:p>
     <w:p>
       <w:pPr>
-        <w:spacing w:after="80"/>
-      </w:pPr>
-    </w:p>
-    <w:p>
-      <w:pPr>
-        <w:spacing w:after="160" w:line="276" w:lineRule="auto"/>
+        <w:spacing w:before="0" w:after="80" w:line="269" w:lineRule="auto"/>
+      </w:pPr>
+    </w:p>
+    <w:p>
+      <w:pPr>
+        <w:spacing w:before="0" w:after="0" w:line="269" w:lineRule="auto"/>
       </w:pPr>
       <w:r>
         <w:rPr>
@@ -3405,12 +3392,12 @@
     </w:p>
     <w:p>
       <w:pPr>
-        <w:spacing w:after="80"/>
-      </w:pPr>
-    </w:p>
-    <w:p>
-      <w:pPr>
-        <w:spacing w:after="160" w:line="276" w:lineRule="auto"/>
+        <w:spacing w:before="0" w:after="80" w:line="269" w:lineRule="auto"/>
+      </w:pPr>
+    </w:p>
+    <w:p>
+      <w:pPr>
+        <w:spacing w:before="0" w:after="80" w:line="269" w:lineRule="auto"/>
       </w:pPr>
       <w:r>
         <w:rPr>
@@ -3423,12 +3410,12 @@
     </w:p>
     <w:p>
       <w:pPr>
-        <w:spacing w:after="80"/>
-      </w:pPr>
-    </w:p>
-    <w:p>
-      <w:pPr>
-        <w:spacing w:after="160" w:line="276" w:lineRule="auto"/>
+        <w:spacing w:before="0" w:after="80" w:line="269" w:lineRule="auto"/>
+      </w:pPr>
+    </w:p>
+    <w:p>
+      <w:pPr>
+        <w:spacing w:before="0" w:after="0" w:line="269" w:lineRule="auto"/>
       </w:pPr>
       <w:r>
         <w:rPr>
@@ -3441,7 +3428,7 @@
     </w:p>
     <w:p>
       <w:pPr>
-        <w:spacing w:after="160" w:line="276" w:lineRule="auto"/>
+        <w:spacing w:before="0" w:after="80" w:line="269" w:lineRule="auto"/>
       </w:pPr>
       <w:r>
         <w:rPr>
@@ -3454,7 +3441,7 @@
     </w:p>
     <w:sectPr>
       <w:pgSz w:w="12240" w:h="15840"/>
-      <w:pgMar w:top="1440" w:right="1440" w:bottom="1440" w:left="1440" w:header="708" w:footer="708" w:gutter="0"/>
+      <w:pgMar w:top="792" w:right="936" w:bottom="792" w:left="936" w:header="720" w:footer="720" w:gutter="0"/>
     </w:sectPr>
   </w:body>
 </w:document>
@@ -3465,9 +3452,10 @@
   <w:docDefaults>
     <w:rPrDefault>
       <w:rPr>
-        <w:rFonts w:ascii="Arial" w:hAnsi="Arial"/>
+        <w:rFonts w:asciiTheme="minorHAnsi" w:eastAsiaTheme="minorEastAsia" w:hAnsiTheme="minorHAnsi" w:cstheme="minorBidi"/>
         <w:sz w:val="22"/>
         <w:szCs w:val="22"/>
+        <w:lang w:val="en-US" w:eastAsia="en-US" w:bidi="ar-SA"/>
       </w:rPr>
     </w:rPrDefault>
     <w:pPrDefault>

</xml_diff>

<commit_message>
Fix English exam emphasis and spacing
</commit_message>
<xml_diff>
--- a/docs/provas/ingles/p2/simulados/simulado-p2-ingles-02.docx
+++ b/docs/provas/ingles/p2/simulados/simulado-p2-ingles-02.docx
@@ -43,41 +43,15 @@
     </w:p>
     <w:p>
       <w:pPr>
-        <w:spacing w:before="0" w:after="80" w:line="269" w:lineRule="auto"/>
-      </w:pPr>
-    </w:p>
-    <w:p>
-      <w:pPr>
-        <w:spacing w:before="0" w:after="80" w:line="269" w:lineRule="auto"/>
-      </w:pPr>
-    </w:p>
-    <w:p>
-      <w:pPr>
-        <w:spacing w:before="0" w:after="80" w:line="269" w:lineRule="auto"/>
-      </w:pPr>
-    </w:p>
-    <w:p>
-      <w:pPr>
-        <w:spacing w:before="0" w:after="80" w:line="269" w:lineRule="auto"/>
-      </w:pPr>
-    </w:p>
-    <w:p>
-      <w:pPr>
-        <w:spacing w:before="0" w:after="120" w:line="269" w:lineRule="auto"/>
-      </w:pPr>
-      <w:r>
-        <w:rPr>
-          <w:b/>
+        <w:spacing w:before="0" w:after="120" w:line="269" w:lineRule="auto"/>
+      </w:pPr>
+      <w:r>
+        <w:rPr>
           <w:sz w:val="22"/>
           <w:szCs w:val="22"/>
         </w:rPr>
         <w:t xml:space="preserve">ANSWER QUESTIONS 01, 02 AND 03 IN ENGLISH BASED ON THE TEXT BELOW.</w:t>
       </w:r>
-    </w:p>
-    <w:p>
-      <w:pPr>
-        <w:spacing w:before="0" w:after="80" w:line="269" w:lineRule="auto"/>
-      </w:pPr>
     </w:p>
     <w:p>
       <w:pPr>
@@ -96,14 +70,8 @@
       <w:pPr>
         <w:spacing w:before="0" w:after="80" w:line="269" w:lineRule="auto"/>
       </w:pPr>
-    </w:p>
-    <w:p>
-      <w:pPr>
-        <w:spacing w:before="0" w:after="80" w:line="269" w:lineRule="auto"/>
-      </w:pPr>
-      <w:r>
-        <w:rPr>
-          <w:b/>
+      <w:r>
+        <w:rPr>
           <w:sz w:val="22"/>
           <w:szCs w:val="22"/>
         </w:rPr>
@@ -112,16 +80,10 @@
     </w:p>
     <w:p>
       <w:pPr>
-        <w:spacing w:before="0" w:after="80" w:line="269" w:lineRule="auto"/>
-      </w:pPr>
-    </w:p>
-    <w:p>
-      <w:pPr>
-        <w:spacing w:before="0" w:after="120" w:line="269" w:lineRule="auto"/>
-      </w:pPr>
-      <w:r>
-        <w:rPr>
-          <w:b/>
+        <w:spacing w:before="0" w:after="120" w:line="269" w:lineRule="auto"/>
+      </w:pPr>
+      <w:r>
+        <w:rPr>
           <w:sz w:val="22"/>
           <w:szCs w:val="22"/>
         </w:rPr>
@@ -130,36 +92,15 @@
     </w:p>
     <w:p>
       <w:pPr>
-        <w:spacing w:before="0" w:after="80" w:line="269" w:lineRule="auto"/>
-      </w:pPr>
-    </w:p>
-    <w:p>
-      <w:pPr>
-        <w:spacing w:before="0" w:after="120" w:line="269" w:lineRule="auto"/>
-      </w:pPr>
-      <w:r>
-        <w:rPr>
-          <w:b/>
+        <w:spacing w:before="0" w:after="120" w:line="269" w:lineRule="auto"/>
+      </w:pPr>
+      <w:r>
+        <w:rPr>
           <w:sz w:val="22"/>
           <w:szCs w:val="22"/>
         </w:rPr>
         <w:t xml:space="preserve">In the evening, Emma came back home. She sat in her bedroom, wrote about her day in her notebook and did a painting of the park.</w:t>
       </w:r>
-    </w:p>
-    <w:p>
-      <w:pPr>
-        <w:spacing w:before="0" w:after="80" w:line="269" w:lineRule="auto"/>
-      </w:pPr>
-    </w:p>
-    <w:p>
-      <w:pPr>
-        <w:spacing w:before="0" w:after="80" w:line="269" w:lineRule="auto"/>
-      </w:pPr>
-    </w:p>
-    <w:p>
-      <w:pPr>
-        <w:spacing w:before="0" w:after="80" w:line="269" w:lineRule="auto"/>
-      </w:pPr>
     </w:p>
     <w:p>
       <w:pPr>
@@ -178,14 +119,8 @@
       <w:pPr>
         <w:spacing w:before="0" w:after="80" w:line="269" w:lineRule="auto"/>
       </w:pPr>
-    </w:p>
-    <w:p>
-      <w:pPr>
-        <w:spacing w:before="0" w:after="80" w:line="269" w:lineRule="auto"/>
-      </w:pPr>
-      <w:r>
-        <w:rPr>
-          <w:b/>
+      <w:r>
+        <w:rPr>
           <w:sz w:val="22"/>
           <w:szCs w:val="22"/>
         </w:rPr>
@@ -194,12 +129,7 @@
     </w:p>
     <w:p>
       <w:pPr>
-        <w:spacing w:before="0" w:after="80" w:line="269" w:lineRule="auto"/>
-      </w:pPr>
-    </w:p>
-    <w:p>
-      <w:pPr>
-        <w:spacing w:before="0" w:after="80" w:line="269" w:lineRule="auto"/>
+        <w:spacing w:before="0" w:after="40" w:line="269" w:lineRule="auto"/>
       </w:pPr>
       <w:r>
         <w:rPr>
@@ -212,16 +142,10 @@
     </w:p>
     <w:p>
       <w:pPr>
-        <w:spacing w:before="0" w:after="80" w:line="269" w:lineRule="auto"/>
-      </w:pPr>
-    </w:p>
-    <w:p>
-      <w:pPr>
-        <w:spacing w:before="0" w:after="120" w:line="269" w:lineRule="auto"/>
-      </w:pPr>
-      <w:r>
-        <w:rPr>
-          <w:b/>
+        <w:spacing w:before="0" w:after="120" w:line="269" w:lineRule="auto"/>
+      </w:pPr>
+      <w:r>
+        <w:rPr>
           <w:sz w:val="22"/>
           <w:szCs w:val="22"/>
         </w:rPr>
@@ -230,11 +154,6 @@
     </w:p>
     <w:p>
       <w:pPr>
-        <w:spacing w:before="0" w:after="80" w:line="269" w:lineRule="auto"/>
-      </w:pPr>
-    </w:p>
-    <w:p>
-      <w:pPr>
         <w:spacing w:before="0" w:after="40" w:line="269" w:lineRule="auto"/>
       </w:pPr>
       <w:r>
@@ -248,16 +167,10 @@
     </w:p>
     <w:p>
       <w:pPr>
-        <w:spacing w:before="0" w:after="80" w:line="269" w:lineRule="auto"/>
-      </w:pPr>
-    </w:p>
-    <w:p>
-      <w:pPr>
         <w:spacing w:before="0" w:after="20" w:line="269" w:lineRule="auto"/>
       </w:pPr>
       <w:r>
         <w:rPr>
-          <w:b/>
           <w:sz w:val="20"/>
           <w:szCs w:val="20"/>
         </w:rPr>
@@ -266,12 +179,7 @@
     </w:p>
     <w:p>
       <w:pPr>
-        <w:spacing w:before="0" w:after="80" w:line="269" w:lineRule="auto"/>
-      </w:pPr>
-    </w:p>
-    <w:p>
-      <w:pPr>
-        <w:spacing w:before="0" w:after="80" w:line="269" w:lineRule="auto"/>
+        <w:spacing w:before="0" w:after="40" w:line="269" w:lineRule="auto"/>
       </w:pPr>
       <w:r>
         <w:rPr>
@@ -284,16 +192,10 @@
     </w:p>
     <w:p>
       <w:pPr>
-        <w:spacing w:before="0" w:after="80" w:line="269" w:lineRule="auto"/>
-      </w:pPr>
-    </w:p>
-    <w:p>
-      <w:pPr>
-        <w:spacing w:before="0" w:after="120" w:line="269" w:lineRule="auto"/>
-      </w:pPr>
-      <w:r>
-        <w:rPr>
-          <w:b/>
+        <w:spacing w:before="0" w:after="120" w:line="269" w:lineRule="auto"/>
+      </w:pPr>
+      <w:r>
+        <w:rPr>
           <w:sz w:val="22"/>
           <w:szCs w:val="22"/>
         </w:rPr>
@@ -302,11 +204,6 @@
     </w:p>
     <w:p>
       <w:pPr>
-        <w:spacing w:before="0" w:after="80" w:line="269" w:lineRule="auto"/>
-      </w:pPr>
-    </w:p>
-    <w:p>
-      <w:pPr>
         <w:spacing w:before="0" w:after="40" w:line="269" w:lineRule="auto"/>
       </w:pPr>
       <w:r>
@@ -320,36 +217,15 @@
     </w:p>
     <w:p>
       <w:pPr>
-        <w:spacing w:before="0" w:after="80" w:line="269" w:lineRule="auto"/>
-      </w:pPr>
-    </w:p>
-    <w:p>
-      <w:pPr>
         <w:spacing w:before="0" w:after="20" w:line="269" w:lineRule="auto"/>
       </w:pPr>
       <w:r>
         <w:rPr>
-          <w:b/>
           <w:sz w:val="20"/>
           <w:szCs w:val="20"/>
         </w:rPr>
         <w:t xml:space="preserve">_____________________________________________________________________________________________</w:t>
       </w:r>
-    </w:p>
-    <w:p>
-      <w:pPr>
-        <w:spacing w:before="0" w:after="80" w:line="269" w:lineRule="auto"/>
-      </w:pPr>
-    </w:p>
-    <w:p>
-      <w:pPr>
-        <w:spacing w:before="0" w:after="80" w:line="269" w:lineRule="auto"/>
-      </w:pPr>
-    </w:p>
-    <w:p>
-      <w:pPr>
-        <w:spacing w:before="0" w:after="80" w:line="269" w:lineRule="auto"/>
-      </w:pPr>
     </w:p>
     <w:p>
       <w:pPr>
@@ -368,14 +244,8 @@
       <w:pPr>
         <w:spacing w:before="0" w:after="80" w:line="269" w:lineRule="auto"/>
       </w:pPr>
-    </w:p>
-    <w:p>
-      <w:pPr>
-        <w:spacing w:before="0" w:after="80" w:line="269" w:lineRule="auto"/>
-      </w:pPr>
-      <w:r>
-        <w:rPr>
-          <w:b/>
+      <w:r>
+        <w:rPr>
           <w:sz w:val="22"/>
           <w:szCs w:val="22"/>
         </w:rPr>
@@ -384,11 +254,6 @@
     </w:p>
     <w:p>
       <w:pPr>
-        <w:spacing w:before="0" w:after="80" w:line="269" w:lineRule="auto"/>
-      </w:pPr>
-    </w:p>
-    <w:p>
-      <w:pPr>
         <w:spacing w:before="0" w:after="40" w:line="269" w:lineRule="auto"/>
       </w:pPr>
       <w:r>
@@ -402,36 +267,15 @@
     </w:p>
     <w:p>
       <w:pPr>
-        <w:spacing w:before="0" w:after="80" w:line="269" w:lineRule="auto"/>
-      </w:pPr>
-    </w:p>
-    <w:p>
-      <w:pPr>
         <w:spacing w:before="0" w:after="20" w:line="269" w:lineRule="auto"/>
       </w:pPr>
       <w:r>
         <w:rPr>
-          <w:b/>
           <w:sz w:val="20"/>
           <w:szCs w:val="20"/>
         </w:rPr>
         <w:t xml:space="preserve">_____________________________________________________________________________________________</w:t>
       </w:r>
-    </w:p>
-    <w:p>
-      <w:pPr>
-        <w:spacing w:before="0" w:after="80" w:line="269" w:lineRule="auto"/>
-      </w:pPr>
-    </w:p>
-    <w:p>
-      <w:pPr>
-        <w:spacing w:before="0" w:after="80" w:line="269" w:lineRule="auto"/>
-      </w:pPr>
-    </w:p>
-    <w:p>
-      <w:pPr>
-        <w:spacing w:before="0" w:after="80" w:line="269" w:lineRule="auto"/>
-      </w:pPr>
     </w:p>
     <w:p>
       <w:pPr>
@@ -450,14 +294,8 @@
       <w:pPr>
         <w:spacing w:before="0" w:after="80" w:line="269" w:lineRule="auto"/>
       </w:pPr>
-    </w:p>
-    <w:p>
-      <w:pPr>
-        <w:spacing w:before="0" w:after="80" w:line="269" w:lineRule="auto"/>
-      </w:pPr>
-      <w:r>
-        <w:rPr>
-          <w:b/>
+      <w:r>
+        <w:rPr>
           <w:sz w:val="22"/>
           <w:szCs w:val="22"/>
         </w:rPr>
@@ -466,16 +304,10 @@
     </w:p>
     <w:p>
       <w:pPr>
-        <w:spacing w:before="0" w:after="80" w:line="269" w:lineRule="auto"/>
-      </w:pPr>
-    </w:p>
-    <w:p>
-      <w:pPr>
-        <w:spacing w:before="0" w:after="120" w:line="269" w:lineRule="auto"/>
-      </w:pPr>
-      <w:r>
-        <w:rPr>
-          <w:b/>
+        <w:spacing w:before="0" w:after="120" w:line="269" w:lineRule="auto"/>
+      </w:pPr>
+      <w:r>
+        <w:rPr>
           <w:sz w:val="22"/>
           <w:szCs w:val="22"/>
         </w:rPr>
@@ -484,16 +316,10 @@
     </w:p>
     <w:p>
       <w:pPr>
-        <w:spacing w:before="0" w:after="80" w:line="269" w:lineRule="auto"/>
-      </w:pPr>
-    </w:p>
-    <w:p>
-      <w:pPr>
-        <w:spacing w:before="0" w:after="120" w:line="269" w:lineRule="auto"/>
-      </w:pPr>
-      <w:r>
-        <w:rPr>
-          <w:b/>
+        <w:spacing w:before="0" w:after="120" w:line="269" w:lineRule="auto"/>
+      </w:pPr>
+      <w:r>
+        <w:rPr>
           <w:sz w:val="22"/>
           <w:szCs w:val="22"/>
         </w:rPr>
@@ -502,16 +328,10 @@
     </w:p>
     <w:p>
       <w:pPr>
-        <w:spacing w:before="0" w:after="80" w:line="269" w:lineRule="auto"/>
-      </w:pPr>
-    </w:p>
-    <w:p>
-      <w:pPr>
-        <w:spacing w:before="0" w:after="120" w:line="269" w:lineRule="auto"/>
-      </w:pPr>
-      <w:r>
-        <w:rPr>
-          <w:b/>
+        <w:spacing w:before="0" w:after="120" w:line="269" w:lineRule="auto"/>
+      </w:pPr>
+      <w:r>
+        <w:rPr>
           <w:sz w:val="22"/>
           <w:szCs w:val="22"/>
         </w:rPr>
@@ -520,36 +340,15 @@
     </w:p>
     <w:p>
       <w:pPr>
-        <w:spacing w:before="0" w:after="80" w:line="269" w:lineRule="auto"/>
-      </w:pPr>
-    </w:p>
-    <w:p>
-      <w:pPr>
-        <w:spacing w:before="0" w:after="120" w:line="269" w:lineRule="auto"/>
-      </w:pPr>
-      <w:r>
-        <w:rPr>
-          <w:b/>
+        <w:spacing w:before="0" w:after="120" w:line="269" w:lineRule="auto"/>
+      </w:pPr>
+      <w:r>
+        <w:rPr>
           <w:sz w:val="22"/>
           <w:szCs w:val="22"/>
         </w:rPr>
         <w:t xml:space="preserve">(   ) Emma did a painting of the park in the evening.</w:t>
       </w:r>
-    </w:p>
-    <w:p>
-      <w:pPr>
-        <w:spacing w:before="0" w:after="80" w:line="269" w:lineRule="auto"/>
-      </w:pPr>
-    </w:p>
-    <w:p>
-      <w:pPr>
-        <w:spacing w:before="0" w:after="80" w:line="269" w:lineRule="auto"/>
-      </w:pPr>
-    </w:p>
-    <w:p>
-      <w:pPr>
-        <w:spacing w:before="0" w:after="80" w:line="269" w:lineRule="auto"/>
-      </w:pPr>
     </w:p>
     <w:p>
       <w:pPr>
@@ -568,14 +367,8 @@
       <w:pPr>
         <w:spacing w:before="0" w:after="80" w:line="269" w:lineRule="auto"/>
       </w:pPr>
-    </w:p>
-    <w:p>
-      <w:pPr>
-        <w:spacing w:before="0" w:after="80" w:line="269" w:lineRule="auto"/>
-      </w:pPr>
-      <w:r>
-        <w:rPr>
-          <w:b/>
+      <w:r>
+        <w:rPr>
           <w:sz w:val="22"/>
           <w:szCs w:val="22"/>
         </w:rPr>
@@ -584,12 +377,7 @@
     </w:p>
     <w:p>
       <w:pPr>
-        <w:spacing w:before="0" w:after="80" w:line="269" w:lineRule="auto"/>
-      </w:pPr>
-    </w:p>
-    <w:p>
-      <w:pPr>
-        <w:spacing w:before="0" w:after="80" w:line="269" w:lineRule="auto"/>
+        <w:spacing w:before="0" w:after="40" w:line="269" w:lineRule="auto"/>
       </w:pPr>
       <w:r>
         <w:rPr>
@@ -602,16 +390,10 @@
     </w:p>
     <w:p>
       <w:pPr>
-        <w:spacing w:before="0" w:after="80" w:line="269" w:lineRule="auto"/>
-      </w:pPr>
-    </w:p>
-    <w:p>
-      <w:pPr>
-        <w:spacing w:before="0" w:after="120" w:line="269" w:lineRule="auto"/>
-      </w:pPr>
-      <w:r>
-        <w:rPr>
-          <w:b/>
+        <w:spacing w:before="0" w:after="120" w:line="269" w:lineRule="auto"/>
+      </w:pPr>
+      <w:r>
+        <w:rPr>
           <w:sz w:val="22"/>
           <w:szCs w:val="22"/>
         </w:rPr>
@@ -620,12 +402,7 @@
     </w:p>
     <w:p>
       <w:pPr>
-        <w:spacing w:before="0" w:after="80" w:line="269" w:lineRule="auto"/>
-      </w:pPr>
-    </w:p>
-    <w:p>
-      <w:pPr>
-        <w:spacing w:before="0" w:after="80" w:line="269" w:lineRule="auto"/>
+        <w:spacing w:before="0" w:after="40" w:line="269" w:lineRule="auto"/>
       </w:pPr>
       <w:r>
         <w:rPr>
@@ -638,16 +415,10 @@
     </w:p>
     <w:p>
       <w:pPr>
-        <w:spacing w:before="0" w:after="80" w:line="269" w:lineRule="auto"/>
-      </w:pPr>
-    </w:p>
-    <w:p>
-      <w:pPr>
-        <w:spacing w:before="0" w:after="120" w:line="269" w:lineRule="auto"/>
-      </w:pPr>
-      <w:r>
-        <w:rPr>
-          <w:b/>
+        <w:spacing w:before="0" w:after="120" w:line="269" w:lineRule="auto"/>
+      </w:pPr>
+      <w:r>
+        <w:rPr>
           <w:sz w:val="22"/>
           <w:szCs w:val="22"/>
         </w:rPr>
@@ -656,12 +427,7 @@
     </w:p>
     <w:p>
       <w:pPr>
-        <w:spacing w:before="0" w:after="80" w:line="269" w:lineRule="auto"/>
-      </w:pPr>
-    </w:p>
-    <w:p>
-      <w:pPr>
-        <w:spacing w:before="0" w:after="80" w:line="269" w:lineRule="auto"/>
+        <w:spacing w:before="0" w:after="40" w:line="269" w:lineRule="auto"/>
       </w:pPr>
       <w:r>
         <w:rPr>
@@ -674,16 +440,10 @@
     </w:p>
     <w:p>
       <w:pPr>
-        <w:spacing w:before="0" w:after="80" w:line="269" w:lineRule="auto"/>
-      </w:pPr>
-    </w:p>
-    <w:p>
-      <w:pPr>
-        <w:spacing w:before="0" w:after="120" w:line="269" w:lineRule="auto"/>
-      </w:pPr>
-      <w:r>
-        <w:rPr>
-          <w:b/>
+        <w:spacing w:before="0" w:after="120" w:line="269" w:lineRule="auto"/>
+      </w:pPr>
+      <w:r>
+        <w:rPr>
           <w:sz w:val="22"/>
           <w:szCs w:val="22"/>
         </w:rPr>
@@ -692,12 +452,7 @@
     </w:p>
     <w:p>
       <w:pPr>
-        <w:spacing w:before="0" w:after="80" w:line="269" w:lineRule="auto"/>
-      </w:pPr>
-    </w:p>
-    <w:p>
-      <w:pPr>
-        <w:spacing w:before="0" w:after="80" w:line="269" w:lineRule="auto"/>
+        <w:spacing w:before="0" w:after="40" w:line="269" w:lineRule="auto"/>
       </w:pPr>
       <w:r>
         <w:rPr>
@@ -710,16 +465,10 @@
     </w:p>
     <w:p>
       <w:pPr>
-        <w:spacing w:before="0" w:after="80" w:line="269" w:lineRule="auto"/>
-      </w:pPr>
-    </w:p>
-    <w:p>
-      <w:pPr>
-        <w:spacing w:before="0" w:after="120" w:line="269" w:lineRule="auto"/>
-      </w:pPr>
-      <w:r>
-        <w:rPr>
-          <w:b/>
+        <w:spacing w:before="0" w:after="120" w:line="269" w:lineRule="auto"/>
+      </w:pPr>
+      <w:r>
+        <w:rPr>
           <w:sz w:val="22"/>
           <w:szCs w:val="22"/>
         </w:rPr>
@@ -728,12 +477,7 @@
     </w:p>
     <w:p>
       <w:pPr>
-        <w:spacing w:before="0" w:after="80" w:line="269" w:lineRule="auto"/>
-      </w:pPr>
-    </w:p>
-    <w:p>
-      <w:pPr>
-        <w:spacing w:before="0" w:after="80" w:line="269" w:lineRule="auto"/>
+        <w:spacing w:before="0" w:after="40" w:line="269" w:lineRule="auto"/>
       </w:pPr>
       <w:r>
         <w:rPr>
@@ -746,16 +490,10 @@
     </w:p>
     <w:p>
       <w:pPr>
-        <w:spacing w:before="0" w:after="80" w:line="269" w:lineRule="auto"/>
-      </w:pPr>
-    </w:p>
-    <w:p>
-      <w:pPr>
-        <w:spacing w:before="0" w:after="120" w:line="269" w:lineRule="auto"/>
-      </w:pPr>
-      <w:r>
-        <w:rPr>
-          <w:b/>
+        <w:spacing w:before="0" w:after="120" w:line="269" w:lineRule="auto"/>
+      </w:pPr>
+      <w:r>
+        <w:rPr>
           <w:sz w:val="22"/>
           <w:szCs w:val="22"/>
         </w:rPr>
@@ -764,12 +502,7 @@
     </w:p>
     <w:p>
       <w:pPr>
-        <w:spacing w:before="0" w:after="80" w:line="269" w:lineRule="auto"/>
-      </w:pPr>
-    </w:p>
-    <w:p>
-      <w:pPr>
-        <w:spacing w:before="0" w:after="80" w:line="269" w:lineRule="auto"/>
+        <w:spacing w:before="0" w:after="40" w:line="269" w:lineRule="auto"/>
       </w:pPr>
       <w:r>
         <w:rPr>
@@ -782,36 +515,15 @@
     </w:p>
     <w:p>
       <w:pPr>
-        <w:spacing w:before="0" w:after="80" w:line="269" w:lineRule="auto"/>
-      </w:pPr>
-    </w:p>
-    <w:p>
-      <w:pPr>
-        <w:spacing w:before="0" w:after="120" w:line="269" w:lineRule="auto"/>
-      </w:pPr>
-      <w:r>
-        <w:rPr>
-          <w:b/>
+        <w:spacing w:before="0" w:after="120" w:line="269" w:lineRule="auto"/>
+      </w:pPr>
+      <w:r>
+        <w:rPr>
           <w:sz w:val="22"/>
           <w:szCs w:val="22"/>
         </w:rPr>
         <w:t xml:space="preserve">merry-go-round: ______________________________</w:t>
       </w:r>
-    </w:p>
-    <w:p>
-      <w:pPr>
-        <w:spacing w:before="0" w:after="80" w:line="269" w:lineRule="auto"/>
-      </w:pPr>
-    </w:p>
-    <w:p>
-      <w:pPr>
-        <w:spacing w:before="0" w:after="80" w:line="269" w:lineRule="auto"/>
-      </w:pPr>
-    </w:p>
-    <w:p>
-      <w:pPr>
-        <w:spacing w:before="0" w:after="80" w:line="269" w:lineRule="auto"/>
-      </w:pPr>
     </w:p>
     <w:p>
       <w:pPr>
@@ -830,14 +542,8 @@
       <w:pPr>
         <w:spacing w:before="0" w:after="80" w:line="269" w:lineRule="auto"/>
       </w:pPr>
-    </w:p>
-    <w:p>
-      <w:pPr>
-        <w:spacing w:before="0" w:after="80" w:line="269" w:lineRule="auto"/>
-      </w:pPr>
-      <w:r>
-        <w:rPr>
-          <w:b/>
+      <w:r>
+        <w:rPr>
           <w:sz w:val="22"/>
           <w:szCs w:val="22"/>
         </w:rPr>
@@ -846,12 +552,7 @@
     </w:p>
     <w:p>
       <w:pPr>
-        <w:spacing w:before="0" w:after="80" w:line="269" w:lineRule="auto"/>
-      </w:pPr>
-    </w:p>
-    <w:p>
-      <w:pPr>
-        <w:spacing w:before="0" w:after="80" w:line="269" w:lineRule="auto"/>
+        <w:spacing w:before="0" w:after="120" w:line="269" w:lineRule="auto"/>
       </w:pPr>
       <w:r>
         <w:rPr>
@@ -864,12 +565,7 @@
     </w:p>
     <w:p>
       <w:pPr>
-        <w:spacing w:before="0" w:after="80" w:line="269" w:lineRule="auto"/>
-      </w:pPr>
-    </w:p>
-    <w:p>
-      <w:pPr>
-        <w:spacing w:before="0" w:after="80" w:line="269" w:lineRule="auto"/>
+        <w:spacing w:before="0" w:after="40" w:line="269" w:lineRule="auto"/>
       </w:pPr>
       <w:r>
         <w:rPr>
@@ -882,16 +578,10 @@
     </w:p>
     <w:p>
       <w:pPr>
-        <w:spacing w:before="0" w:after="80" w:line="269" w:lineRule="auto"/>
-      </w:pPr>
-    </w:p>
-    <w:p>
-      <w:pPr>
-        <w:spacing w:before="0" w:after="120" w:line="269" w:lineRule="auto"/>
-      </w:pPr>
-      <w:r>
-        <w:rPr>
-          <w:b/>
+        <w:spacing w:before="0" w:after="120" w:line="269" w:lineRule="auto"/>
+      </w:pPr>
+      <w:r>
+        <w:rPr>
           <w:sz w:val="22"/>
           <w:szCs w:val="22"/>
         </w:rPr>
@@ -900,12 +590,7 @@
     </w:p>
     <w:p>
       <w:pPr>
-        <w:spacing w:before="0" w:after="80" w:line="269" w:lineRule="auto"/>
-      </w:pPr>
-    </w:p>
-    <w:p>
-      <w:pPr>
-        <w:spacing w:before="0" w:after="80" w:line="269" w:lineRule="auto"/>
+        <w:spacing w:before="0" w:after="40" w:line="269" w:lineRule="auto"/>
       </w:pPr>
       <w:r>
         <w:rPr>
@@ -918,16 +603,10 @@
     </w:p>
     <w:p>
       <w:pPr>
-        <w:spacing w:before="0" w:after="80" w:line="269" w:lineRule="auto"/>
-      </w:pPr>
-    </w:p>
-    <w:p>
-      <w:pPr>
-        <w:spacing w:before="0" w:after="120" w:line="269" w:lineRule="auto"/>
-      </w:pPr>
-      <w:r>
-        <w:rPr>
-          <w:b/>
+        <w:spacing w:before="0" w:after="120" w:line="269" w:lineRule="auto"/>
+      </w:pPr>
+      <w:r>
+        <w:rPr>
           <w:sz w:val="22"/>
           <w:szCs w:val="22"/>
         </w:rPr>
@@ -936,12 +615,7 @@
     </w:p>
     <w:p>
       <w:pPr>
-        <w:spacing w:before="0" w:after="80" w:line="269" w:lineRule="auto"/>
-      </w:pPr>
-    </w:p>
-    <w:p>
-      <w:pPr>
-        <w:spacing w:before="0" w:after="80" w:line="269" w:lineRule="auto"/>
+        <w:spacing w:before="0" w:after="40" w:line="269" w:lineRule="auto"/>
       </w:pPr>
       <w:r>
         <w:rPr>
@@ -954,16 +628,10 @@
     </w:p>
     <w:p>
       <w:pPr>
-        <w:spacing w:before="0" w:after="80" w:line="269" w:lineRule="auto"/>
-      </w:pPr>
-    </w:p>
-    <w:p>
-      <w:pPr>
-        <w:spacing w:before="0" w:after="120" w:line="269" w:lineRule="auto"/>
-      </w:pPr>
-      <w:r>
-        <w:rPr>
-          <w:b/>
+        <w:spacing w:before="0" w:after="120" w:line="269" w:lineRule="auto"/>
+      </w:pPr>
+      <w:r>
+        <w:rPr>
           <w:sz w:val="22"/>
           <w:szCs w:val="22"/>
         </w:rPr>
@@ -972,12 +640,7 @@
     </w:p>
     <w:p>
       <w:pPr>
-        <w:spacing w:before="0" w:after="80" w:line="269" w:lineRule="auto"/>
-      </w:pPr>
-    </w:p>
-    <w:p>
-      <w:pPr>
-        <w:spacing w:before="0" w:after="80" w:line="269" w:lineRule="auto"/>
+        <w:spacing w:before="0" w:after="40" w:line="269" w:lineRule="auto"/>
       </w:pPr>
       <w:r>
         <w:rPr>
@@ -990,16 +653,10 @@
     </w:p>
     <w:p>
       <w:pPr>
-        <w:spacing w:before="0" w:after="80" w:line="269" w:lineRule="auto"/>
-      </w:pPr>
-    </w:p>
-    <w:p>
-      <w:pPr>
-        <w:spacing w:before="0" w:after="120" w:line="269" w:lineRule="auto"/>
-      </w:pPr>
-      <w:r>
-        <w:rPr>
-          <w:b/>
+        <w:spacing w:before="0" w:after="120" w:line="269" w:lineRule="auto"/>
+      </w:pPr>
+      <w:r>
+        <w:rPr>
           <w:sz w:val="22"/>
           <w:szCs w:val="22"/>
         </w:rPr>
@@ -1008,12 +665,7 @@
     </w:p>
     <w:p>
       <w:pPr>
-        <w:spacing w:before="0" w:after="80" w:line="269" w:lineRule="auto"/>
-      </w:pPr>
-    </w:p>
-    <w:p>
-      <w:pPr>
-        <w:spacing w:before="0" w:after="80" w:line="269" w:lineRule="auto"/>
+        <w:spacing w:before="0" w:after="40" w:line="269" w:lineRule="auto"/>
       </w:pPr>
       <w:r>
         <w:rPr>
@@ -1026,16 +678,10 @@
     </w:p>
     <w:p>
       <w:pPr>
-        <w:spacing w:before="0" w:after="80" w:line="269" w:lineRule="auto"/>
-      </w:pPr>
-    </w:p>
-    <w:p>
-      <w:pPr>
-        <w:spacing w:before="0" w:after="120" w:line="269" w:lineRule="auto"/>
-      </w:pPr>
-      <w:r>
-        <w:rPr>
-          <w:b/>
+        <w:spacing w:before="0" w:after="120" w:line="269" w:lineRule="auto"/>
+      </w:pPr>
+      <w:r>
+        <w:rPr>
           <w:sz w:val="22"/>
           <w:szCs w:val="22"/>
         </w:rPr>
@@ -1044,12 +690,7 @@
     </w:p>
     <w:p>
       <w:pPr>
-        <w:spacing w:before="0" w:after="80" w:line="269" w:lineRule="auto"/>
-      </w:pPr>
-    </w:p>
-    <w:p>
-      <w:pPr>
-        <w:spacing w:before="0" w:after="80" w:line="269" w:lineRule="auto"/>
+        <w:spacing w:before="0" w:after="40" w:line="269" w:lineRule="auto"/>
       </w:pPr>
       <w:r>
         <w:rPr>
@@ -1062,36 +703,15 @@
     </w:p>
     <w:p>
       <w:pPr>
-        <w:spacing w:before="0" w:after="80" w:line="269" w:lineRule="auto"/>
-      </w:pPr>
-    </w:p>
-    <w:p>
-      <w:pPr>
-        <w:spacing w:before="0" w:after="120" w:line="269" w:lineRule="auto"/>
-      </w:pPr>
-      <w:r>
-        <w:rPr>
-          <w:b/>
+        <w:spacing w:before="0" w:after="120" w:line="269" w:lineRule="auto"/>
+      </w:pPr>
+      <w:r>
+        <w:rPr>
           <w:sz w:val="22"/>
           <w:szCs w:val="22"/>
         </w:rPr>
         <w:t xml:space="preserve">My brother ____________________ on the bench after lunch.</w:t>
       </w:r>
-    </w:p>
-    <w:p>
-      <w:pPr>
-        <w:spacing w:before="0" w:after="80" w:line="269" w:lineRule="auto"/>
-      </w:pPr>
-    </w:p>
-    <w:p>
-      <w:pPr>
-        <w:spacing w:before="0" w:after="80" w:line="269" w:lineRule="auto"/>
-      </w:pPr>
-    </w:p>
-    <w:p>
-      <w:pPr>
-        <w:spacing w:before="0" w:after="80" w:line="269" w:lineRule="auto"/>
-      </w:pPr>
     </w:p>
     <w:p>
       <w:pPr>
@@ -1110,14 +730,8 @@
       <w:pPr>
         <w:spacing w:before="0" w:after="80" w:line="269" w:lineRule="auto"/>
       </w:pPr>
-    </w:p>
-    <w:p>
-      <w:pPr>
-        <w:spacing w:before="0" w:after="80" w:line="269" w:lineRule="auto"/>
-      </w:pPr>
-      <w:r>
-        <w:rPr>
-          <w:b/>
+      <w:r>
+        <w:rPr>
           <w:sz w:val="22"/>
           <w:szCs w:val="22"/>
         </w:rPr>
@@ -1126,12 +740,7 @@
     </w:p>
     <w:p>
       <w:pPr>
-        <w:spacing w:before="0" w:after="80" w:line="269" w:lineRule="auto"/>
-      </w:pPr>
-    </w:p>
-    <w:p>
-      <w:pPr>
-        <w:spacing w:before="0" w:after="80" w:line="269" w:lineRule="auto"/>
+        <w:spacing w:before="0" w:after="40" w:line="269" w:lineRule="auto"/>
       </w:pPr>
       <w:r>
         <w:rPr>
@@ -1144,16 +753,10 @@
     </w:p>
     <w:p>
       <w:pPr>
-        <w:spacing w:before="0" w:after="80" w:line="269" w:lineRule="auto"/>
-      </w:pPr>
-    </w:p>
-    <w:p>
-      <w:pPr>
-        <w:spacing w:before="0" w:after="120" w:line="269" w:lineRule="auto"/>
-      </w:pPr>
-      <w:r>
-        <w:rPr>
-          <w:b/>
+        <w:spacing w:before="0" w:after="120" w:line="269" w:lineRule="auto"/>
+      </w:pPr>
+      <w:r>
+        <w:rPr>
           <w:sz w:val="22"/>
           <w:szCs w:val="22"/>
         </w:rPr>
@@ -1162,34 +765,23 @@
     </w:p>
     <w:p>
       <w:pPr>
-        <w:spacing w:before="0" w:after="80" w:line="269" w:lineRule="auto"/>
-      </w:pPr>
-    </w:p>
-    <w:p>
-      <w:pPr>
-        <w:spacing w:before="0" w:after="120" w:line="269" w:lineRule="auto"/>
-      </w:pPr>
-      <w:r>
-        <w:rPr>
-          <w:b/>
-          <w:sz w:val="22"/>
-          <w:szCs w:val="22"/>
+        <w:spacing w:before="0" w:after="40" w:line="269" w:lineRule="auto"/>
+      </w:pPr>
+      <w:r>
+        <w:rPr>
+          <w:b/>
+          <w:sz w:val="20"/>
+          <w:szCs w:val="20"/>
         </w:rPr>
         <w:t xml:space="preserve">NEGATIVE:</w:t>
       </w:r>
     </w:p>
     <w:p>
       <w:pPr>
-        <w:spacing w:before="0" w:after="80" w:line="269" w:lineRule="auto"/>
-      </w:pPr>
-    </w:p>
-    <w:p>
-      <w:pPr>
         <w:spacing w:before="0" w:after="20" w:line="269" w:lineRule="auto"/>
       </w:pPr>
       <w:r>
         <w:rPr>
-          <w:b/>
           <w:sz w:val="20"/>
           <w:szCs w:val="20"/>
         </w:rPr>
@@ -1198,34 +790,23 @@
     </w:p>
     <w:p>
       <w:pPr>
-        <w:spacing w:before="0" w:after="80" w:line="269" w:lineRule="auto"/>
-      </w:pPr>
-    </w:p>
-    <w:p>
-      <w:pPr>
-        <w:spacing w:before="0" w:after="120" w:line="269" w:lineRule="auto"/>
-      </w:pPr>
-      <w:r>
-        <w:rPr>
-          <w:b/>
-          <w:sz w:val="22"/>
-          <w:szCs w:val="22"/>
+        <w:spacing w:before="0" w:after="40" w:line="269" w:lineRule="auto"/>
+      </w:pPr>
+      <w:r>
+        <w:rPr>
+          <w:b/>
+          <w:sz w:val="20"/>
+          <w:szCs w:val="20"/>
         </w:rPr>
         <w:t xml:space="preserve">INTERROGATIVE:</w:t>
       </w:r>
     </w:p>
     <w:p>
       <w:pPr>
-        <w:spacing w:before="0" w:after="80" w:line="269" w:lineRule="auto"/>
-      </w:pPr>
-    </w:p>
-    <w:p>
-      <w:pPr>
         <w:spacing w:before="0" w:after="20" w:line="269" w:lineRule="auto"/>
       </w:pPr>
       <w:r>
         <w:rPr>
-          <w:b/>
           <w:sz w:val="20"/>
           <w:szCs w:val="20"/>
         </w:rPr>
@@ -1234,12 +815,7 @@
     </w:p>
     <w:p>
       <w:pPr>
-        <w:spacing w:before="0" w:after="80" w:line="269" w:lineRule="auto"/>
-      </w:pPr>
-    </w:p>
-    <w:p>
-      <w:pPr>
-        <w:spacing w:before="0" w:after="80" w:line="269" w:lineRule="auto"/>
+        <w:spacing w:before="0" w:after="40" w:line="269" w:lineRule="auto"/>
       </w:pPr>
       <w:r>
         <w:rPr>
@@ -1252,16 +828,10 @@
     </w:p>
     <w:p>
       <w:pPr>
-        <w:spacing w:before="0" w:after="80" w:line="269" w:lineRule="auto"/>
-      </w:pPr>
-    </w:p>
-    <w:p>
-      <w:pPr>
-        <w:spacing w:before="0" w:after="120" w:line="269" w:lineRule="auto"/>
-      </w:pPr>
-      <w:r>
-        <w:rPr>
-          <w:b/>
+        <w:spacing w:before="0" w:after="120" w:line="269" w:lineRule="auto"/>
+      </w:pPr>
+      <w:r>
+        <w:rPr>
           <w:sz w:val="22"/>
           <w:szCs w:val="22"/>
         </w:rPr>
@@ -1270,34 +840,23 @@
     </w:p>
     <w:p>
       <w:pPr>
-        <w:spacing w:before="0" w:after="80" w:line="269" w:lineRule="auto"/>
-      </w:pPr>
-    </w:p>
-    <w:p>
-      <w:pPr>
-        <w:spacing w:before="0" w:after="120" w:line="269" w:lineRule="auto"/>
-      </w:pPr>
-      <w:r>
-        <w:rPr>
-          <w:b/>
-          <w:sz w:val="22"/>
-          <w:szCs w:val="22"/>
+        <w:spacing w:before="0" w:after="40" w:line="269" w:lineRule="auto"/>
+      </w:pPr>
+      <w:r>
+        <w:rPr>
+          <w:b/>
+          <w:sz w:val="20"/>
+          <w:szCs w:val="20"/>
         </w:rPr>
         <w:t xml:space="preserve">NEGATIVE:</w:t>
       </w:r>
     </w:p>
     <w:p>
       <w:pPr>
-        <w:spacing w:before="0" w:after="80" w:line="269" w:lineRule="auto"/>
-      </w:pPr>
-    </w:p>
-    <w:p>
-      <w:pPr>
         <w:spacing w:before="0" w:after="20" w:line="269" w:lineRule="auto"/>
       </w:pPr>
       <w:r>
         <w:rPr>
-          <w:b/>
           <w:sz w:val="20"/>
           <w:szCs w:val="20"/>
         </w:rPr>
@@ -1306,54 +865,28 @@
     </w:p>
     <w:p>
       <w:pPr>
-        <w:spacing w:before="0" w:after="80" w:line="269" w:lineRule="auto"/>
-      </w:pPr>
-    </w:p>
-    <w:p>
-      <w:pPr>
-        <w:spacing w:before="0" w:after="120" w:line="269" w:lineRule="auto"/>
-      </w:pPr>
-      <w:r>
-        <w:rPr>
-          <w:b/>
-          <w:sz w:val="22"/>
-          <w:szCs w:val="22"/>
+        <w:spacing w:before="0" w:after="40" w:line="269" w:lineRule="auto"/>
+      </w:pPr>
+      <w:r>
+        <w:rPr>
+          <w:b/>
+          <w:sz w:val="20"/>
+          <w:szCs w:val="20"/>
         </w:rPr>
         <w:t xml:space="preserve">INTERROGATIVE:</w:t>
       </w:r>
     </w:p>
     <w:p>
       <w:pPr>
-        <w:spacing w:before="0" w:after="80" w:line="269" w:lineRule="auto"/>
-      </w:pPr>
-    </w:p>
-    <w:p>
-      <w:pPr>
         <w:spacing w:before="0" w:after="20" w:line="269" w:lineRule="auto"/>
       </w:pPr>
       <w:r>
         <w:rPr>
-          <w:b/>
           <w:sz w:val="20"/>
           <w:szCs w:val="20"/>
         </w:rPr>
         <w:t xml:space="preserve">_____________________________________________________________________________________________</w:t>
       </w:r>
-    </w:p>
-    <w:p>
-      <w:pPr>
-        <w:spacing w:before="0" w:after="80" w:line="269" w:lineRule="auto"/>
-      </w:pPr>
-    </w:p>
-    <w:p>
-      <w:pPr>
-        <w:spacing w:before="0" w:after="80" w:line="269" w:lineRule="auto"/>
-      </w:pPr>
-    </w:p>
-    <w:p>
-      <w:pPr>
-        <w:spacing w:before="0" w:after="80" w:line="269" w:lineRule="auto"/>
-      </w:pPr>
     </w:p>
     <w:p>
       <w:pPr>
@@ -1372,14 +905,8 @@
       <w:pPr>
         <w:spacing w:before="0" w:after="80" w:line="269" w:lineRule="auto"/>
       </w:pPr>
-    </w:p>
-    <w:p>
-      <w:pPr>
-        <w:spacing w:before="0" w:after="80" w:line="269" w:lineRule="auto"/>
-      </w:pPr>
-      <w:r>
-        <w:rPr>
-          <w:b/>
+      <w:r>
+        <w:rPr>
           <w:sz w:val="22"/>
           <w:szCs w:val="22"/>
         </w:rPr>
@@ -1388,12 +915,7 @@
     </w:p>
     <w:p>
       <w:pPr>
-        <w:spacing w:before="0" w:after="80" w:line="269" w:lineRule="auto"/>
-      </w:pPr>
-    </w:p>
-    <w:p>
-      <w:pPr>
-        <w:spacing w:before="0" w:after="80" w:line="269" w:lineRule="auto"/>
+        <w:spacing w:before="0" w:after="120" w:line="269" w:lineRule="auto"/>
       </w:pPr>
       <w:r>
         <w:rPr>
@@ -1406,12 +928,7 @@
     </w:p>
     <w:p>
       <w:pPr>
-        <w:spacing w:before="0" w:after="80" w:line="269" w:lineRule="auto"/>
-      </w:pPr>
-    </w:p>
-    <w:p>
-      <w:pPr>
-        <w:spacing w:before="0" w:after="80" w:line="269" w:lineRule="auto"/>
+        <w:spacing w:before="0" w:after="40" w:line="269" w:lineRule="auto"/>
       </w:pPr>
       <w:r>
         <w:rPr>
@@ -1424,16 +941,10 @@
     </w:p>
     <w:p>
       <w:pPr>
-        <w:spacing w:before="0" w:after="80" w:line="269" w:lineRule="auto"/>
-      </w:pPr>
-    </w:p>
-    <w:p>
-      <w:pPr>
-        <w:spacing w:before="0" w:after="120" w:line="269" w:lineRule="auto"/>
-      </w:pPr>
-      <w:r>
-        <w:rPr>
-          <w:b/>
+        <w:spacing w:before="0" w:after="120" w:line="269" w:lineRule="auto"/>
+      </w:pPr>
+      <w:r>
+        <w:rPr>
           <w:sz w:val="22"/>
           <w:szCs w:val="22"/>
         </w:rPr>
@@ -1442,12 +953,7 @@
     </w:p>
     <w:p>
       <w:pPr>
-        <w:spacing w:before="0" w:after="80" w:line="269" w:lineRule="auto"/>
-      </w:pPr>
-    </w:p>
-    <w:p>
-      <w:pPr>
-        <w:spacing w:before="0" w:after="80" w:line="269" w:lineRule="auto"/>
+        <w:spacing w:before="0" w:after="40" w:line="269" w:lineRule="auto"/>
       </w:pPr>
       <w:r>
         <w:rPr>
@@ -1460,16 +966,10 @@
     </w:p>
     <w:p>
       <w:pPr>
-        <w:spacing w:before="0" w:after="80" w:line="269" w:lineRule="auto"/>
-      </w:pPr>
-    </w:p>
-    <w:p>
-      <w:pPr>
-        <w:spacing w:before="0" w:after="120" w:line="269" w:lineRule="auto"/>
-      </w:pPr>
-      <w:r>
-        <w:rPr>
-          <w:b/>
+        <w:spacing w:before="0" w:after="120" w:line="269" w:lineRule="auto"/>
+      </w:pPr>
+      <w:r>
+        <w:rPr>
           <w:sz w:val="22"/>
           <w:szCs w:val="22"/>
         </w:rPr>
@@ -1478,12 +978,7 @@
     </w:p>
     <w:p>
       <w:pPr>
-        <w:spacing w:before="0" w:after="80" w:line="269" w:lineRule="auto"/>
-      </w:pPr>
-    </w:p>
-    <w:p>
-      <w:pPr>
-        <w:spacing w:before="0" w:after="80" w:line="269" w:lineRule="auto"/>
+        <w:spacing w:before="0" w:after="40" w:line="269" w:lineRule="auto"/>
       </w:pPr>
       <w:r>
         <w:rPr>
@@ -1496,16 +991,10 @@
     </w:p>
     <w:p>
       <w:pPr>
-        <w:spacing w:before="0" w:after="80" w:line="269" w:lineRule="auto"/>
-      </w:pPr>
-    </w:p>
-    <w:p>
-      <w:pPr>
-        <w:spacing w:before="0" w:after="120" w:line="269" w:lineRule="auto"/>
-      </w:pPr>
-      <w:r>
-        <w:rPr>
-          <w:b/>
+        <w:spacing w:before="0" w:after="120" w:line="269" w:lineRule="auto"/>
+      </w:pPr>
+      <w:r>
+        <w:rPr>
           <w:sz w:val="22"/>
           <w:szCs w:val="22"/>
         </w:rPr>
@@ -1514,12 +1003,7 @@
     </w:p>
     <w:p>
       <w:pPr>
-        <w:spacing w:before="0" w:after="80" w:line="269" w:lineRule="auto"/>
-      </w:pPr>
-    </w:p>
-    <w:p>
-      <w:pPr>
-        <w:spacing w:before="0" w:after="80" w:line="269" w:lineRule="auto"/>
+        <w:spacing w:before="0" w:after="40" w:line="269" w:lineRule="auto"/>
       </w:pPr>
       <w:r>
         <w:rPr>
@@ -1532,16 +1016,10 @@
     </w:p>
     <w:p>
       <w:pPr>
-        <w:spacing w:before="0" w:after="80" w:line="269" w:lineRule="auto"/>
-      </w:pPr>
-    </w:p>
-    <w:p>
-      <w:pPr>
-        <w:spacing w:before="0" w:after="120" w:line="269" w:lineRule="auto"/>
-      </w:pPr>
-      <w:r>
-        <w:rPr>
-          <w:b/>
+        <w:spacing w:before="0" w:after="120" w:line="269" w:lineRule="auto"/>
+      </w:pPr>
+      <w:r>
+        <w:rPr>
           <w:sz w:val="22"/>
           <w:szCs w:val="22"/>
         </w:rPr>
@@ -1550,12 +1028,7 @@
     </w:p>
     <w:p>
       <w:pPr>
-        <w:spacing w:before="0" w:after="80" w:line="269" w:lineRule="auto"/>
-      </w:pPr>
-    </w:p>
-    <w:p>
-      <w:pPr>
-        <w:spacing w:before="0" w:after="80" w:line="269" w:lineRule="auto"/>
+        <w:spacing w:before="0" w:after="40" w:line="269" w:lineRule="auto"/>
       </w:pPr>
       <w:r>
         <w:rPr>
@@ -1568,16 +1041,10 @@
     </w:p>
     <w:p>
       <w:pPr>
-        <w:spacing w:before="0" w:after="80" w:line="269" w:lineRule="auto"/>
-      </w:pPr>
-    </w:p>
-    <w:p>
-      <w:pPr>
-        <w:spacing w:before="0" w:after="120" w:line="269" w:lineRule="auto"/>
-      </w:pPr>
-      <w:r>
-        <w:rPr>
-          <w:b/>
+        <w:spacing w:before="0" w:after="120" w:line="269" w:lineRule="auto"/>
+      </w:pPr>
+      <w:r>
+        <w:rPr>
           <w:sz w:val="22"/>
           <w:szCs w:val="22"/>
         </w:rPr>
@@ -1586,12 +1053,7 @@
     </w:p>
     <w:p>
       <w:pPr>
-        <w:spacing w:before="0" w:after="80" w:line="269" w:lineRule="auto"/>
-      </w:pPr>
-    </w:p>
-    <w:p>
-      <w:pPr>
-        <w:spacing w:before="0" w:after="80" w:line="269" w:lineRule="auto"/>
+        <w:spacing w:before="0" w:after="40" w:line="269" w:lineRule="auto"/>
       </w:pPr>
       <w:r>
         <w:rPr>
@@ -1604,36 +1066,15 @@
     </w:p>
     <w:p>
       <w:pPr>
-        <w:spacing w:before="0" w:after="80" w:line="269" w:lineRule="auto"/>
-      </w:pPr>
-    </w:p>
-    <w:p>
-      <w:pPr>
-        <w:spacing w:before="0" w:after="120" w:line="269" w:lineRule="auto"/>
-      </w:pPr>
-      <w:r>
-        <w:rPr>
-          <w:b/>
+        <w:spacing w:before="0" w:after="120" w:line="269" w:lineRule="auto"/>
+      </w:pPr>
+      <w:r>
+        <w:rPr>
           <w:sz w:val="22"/>
           <w:szCs w:val="22"/>
         </w:rPr>
         <w:t xml:space="preserve">My aunt will ____________________ to visit another city.</w:t>
       </w:r>
-    </w:p>
-    <w:p>
-      <w:pPr>
-        <w:spacing w:before="0" w:after="80" w:line="269" w:lineRule="auto"/>
-      </w:pPr>
-    </w:p>
-    <w:p>
-      <w:pPr>
-        <w:spacing w:before="0" w:after="80" w:line="269" w:lineRule="auto"/>
-      </w:pPr>
-    </w:p>
-    <w:p>
-      <w:pPr>
-        <w:spacing w:before="0" w:after="80" w:line="269" w:lineRule="auto"/>
-      </w:pPr>
     </w:p>
     <w:p>
       <w:pPr>
@@ -1652,14 +1093,8 @@
       <w:pPr>
         <w:spacing w:before="0" w:after="80" w:line="269" w:lineRule="auto"/>
       </w:pPr>
-    </w:p>
-    <w:p>
-      <w:pPr>
-        <w:spacing w:before="0" w:after="80" w:line="269" w:lineRule="auto"/>
-      </w:pPr>
-      <w:r>
-        <w:rPr>
-          <w:b/>
+      <w:r>
+        <w:rPr>
           <w:sz w:val="22"/>
           <w:szCs w:val="22"/>
         </w:rPr>
@@ -1668,12 +1103,7 @@
     </w:p>
     <w:p>
       <w:pPr>
-        <w:spacing w:before="0" w:after="80" w:line="269" w:lineRule="auto"/>
-      </w:pPr>
-    </w:p>
-    <w:p>
-      <w:pPr>
-        <w:spacing w:before="0" w:after="80" w:line="269" w:lineRule="auto"/>
+        <w:spacing w:before="0" w:after="40" w:line="269" w:lineRule="auto"/>
       </w:pPr>
       <w:r>
         <w:rPr>
@@ -1686,16 +1116,10 @@
     </w:p>
     <w:p>
       <w:pPr>
-        <w:spacing w:before="0" w:after="80" w:line="269" w:lineRule="auto"/>
-      </w:pPr>
-    </w:p>
-    <w:p>
-      <w:pPr>
-        <w:spacing w:before="0" w:after="120" w:line="269" w:lineRule="auto"/>
-      </w:pPr>
-      <w:r>
-        <w:rPr>
-          <w:b/>
+        <w:spacing w:before="0" w:after="120" w:line="269" w:lineRule="auto"/>
+      </w:pPr>
+      <w:r>
+        <w:rPr>
           <w:sz w:val="22"/>
           <w:szCs w:val="22"/>
         </w:rPr>
@@ -1704,12 +1128,7 @@
     </w:p>
     <w:p>
       <w:pPr>
-        <w:spacing w:before="0" w:after="80" w:line="269" w:lineRule="auto"/>
-      </w:pPr>
-    </w:p>
-    <w:p>
-      <w:pPr>
-        <w:spacing w:before="0" w:after="80" w:line="269" w:lineRule="auto"/>
+        <w:spacing w:before="0" w:after="40" w:line="269" w:lineRule="auto"/>
       </w:pPr>
       <w:r>
         <w:rPr>
@@ -1722,16 +1141,10 @@
     </w:p>
     <w:p>
       <w:pPr>
-        <w:spacing w:before="0" w:after="80" w:line="269" w:lineRule="auto"/>
-      </w:pPr>
-    </w:p>
-    <w:p>
-      <w:pPr>
-        <w:spacing w:before="0" w:after="120" w:line="269" w:lineRule="auto"/>
-      </w:pPr>
-      <w:r>
-        <w:rPr>
-          <w:b/>
+        <w:spacing w:before="0" w:after="120" w:line="269" w:lineRule="auto"/>
+      </w:pPr>
+      <w:r>
+        <w:rPr>
           <w:sz w:val="22"/>
           <w:szCs w:val="22"/>
         </w:rPr>
@@ -1740,12 +1153,7 @@
     </w:p>
     <w:p>
       <w:pPr>
-        <w:spacing w:before="0" w:after="80" w:line="269" w:lineRule="auto"/>
-      </w:pPr>
-    </w:p>
-    <w:p>
-      <w:pPr>
-        <w:spacing w:before="0" w:after="80" w:line="269" w:lineRule="auto"/>
+        <w:spacing w:before="0" w:after="40" w:line="269" w:lineRule="auto"/>
       </w:pPr>
       <w:r>
         <w:rPr>
@@ -1758,16 +1166,10 @@
     </w:p>
     <w:p>
       <w:pPr>
-        <w:spacing w:before="0" w:after="80" w:line="269" w:lineRule="auto"/>
-      </w:pPr>
-    </w:p>
-    <w:p>
-      <w:pPr>
-        <w:spacing w:before="0" w:after="120" w:line="269" w:lineRule="auto"/>
-      </w:pPr>
-      <w:r>
-        <w:rPr>
-          <w:b/>
+        <w:spacing w:before="0" w:after="120" w:line="269" w:lineRule="auto"/>
+      </w:pPr>
+      <w:r>
+        <w:rPr>
           <w:sz w:val="22"/>
           <w:szCs w:val="22"/>
         </w:rPr>
@@ -1776,12 +1178,7 @@
     </w:p>
     <w:p>
       <w:pPr>
-        <w:spacing w:before="0" w:after="80" w:line="269" w:lineRule="auto"/>
-      </w:pPr>
-    </w:p>
-    <w:p>
-      <w:pPr>
-        <w:spacing w:before="0" w:after="80" w:line="269" w:lineRule="auto"/>
+        <w:spacing w:before="0" w:after="40" w:line="269" w:lineRule="auto"/>
       </w:pPr>
       <w:r>
         <w:rPr>
@@ -1794,16 +1191,10 @@
     </w:p>
     <w:p>
       <w:pPr>
-        <w:spacing w:before="0" w:after="80" w:line="269" w:lineRule="auto"/>
-      </w:pPr>
-    </w:p>
-    <w:p>
-      <w:pPr>
-        <w:spacing w:before="0" w:after="120" w:line="269" w:lineRule="auto"/>
-      </w:pPr>
-      <w:r>
-        <w:rPr>
-          <w:b/>
+        <w:spacing w:before="0" w:after="120" w:line="269" w:lineRule="auto"/>
+      </w:pPr>
+      <w:r>
+        <w:rPr>
           <w:sz w:val="22"/>
           <w:szCs w:val="22"/>
         </w:rPr>
@@ -1812,12 +1203,7 @@
     </w:p>
     <w:p>
       <w:pPr>
-        <w:spacing w:before="0" w:after="80" w:line="269" w:lineRule="auto"/>
-      </w:pPr>
-    </w:p>
-    <w:p>
-      <w:pPr>
-        <w:spacing w:before="0" w:after="80" w:line="269" w:lineRule="auto"/>
+        <w:spacing w:before="0" w:after="40" w:line="269" w:lineRule="auto"/>
       </w:pPr>
       <w:r>
         <w:rPr>
@@ -1830,36 +1216,15 @@
     </w:p>
     <w:p>
       <w:pPr>
-        <w:spacing w:before="0" w:after="80" w:line="269" w:lineRule="auto"/>
-      </w:pPr>
-    </w:p>
-    <w:p>
-      <w:pPr>
-        <w:spacing w:before="0" w:after="120" w:line="269" w:lineRule="auto"/>
-      </w:pPr>
-      <w:r>
-        <w:rPr>
-          <w:b/>
+        <w:spacing w:before="0" w:after="120" w:line="269" w:lineRule="auto"/>
+      </w:pPr>
+      <w:r>
+        <w:rPr>
           <w:sz w:val="22"/>
           <w:szCs w:val="22"/>
         </w:rPr>
         <w:t xml:space="preserve">They (got on / got in) the train at 7 a.m.</w:t>
       </w:r>
-    </w:p>
-    <w:p>
-      <w:pPr>
-        <w:spacing w:before="0" w:after="80" w:line="269" w:lineRule="auto"/>
-      </w:pPr>
-    </w:p>
-    <w:p>
-      <w:pPr>
-        <w:spacing w:before="0" w:after="80" w:line="269" w:lineRule="auto"/>
-      </w:pPr>
-    </w:p>
-    <w:p>
-      <w:pPr>
-        <w:spacing w:before="0" w:after="80" w:line="269" w:lineRule="auto"/>
-      </w:pPr>
     </w:p>
     <w:p>
       <w:pPr>
@@ -1878,14 +1243,8 @@
       <w:pPr>
         <w:spacing w:before="0" w:after="80" w:line="269" w:lineRule="auto"/>
       </w:pPr>
-    </w:p>
-    <w:p>
-      <w:pPr>
-        <w:spacing w:before="0" w:after="80" w:line="269" w:lineRule="auto"/>
-      </w:pPr>
-      <w:r>
-        <w:rPr>
-          <w:b/>
+      <w:r>
+        <w:rPr>
           <w:sz w:val="22"/>
           <w:szCs w:val="22"/>
         </w:rPr>
@@ -1894,12 +1253,7 @@
     </w:p>
     <w:p>
       <w:pPr>
-        <w:spacing w:before="0" w:after="80" w:line="269" w:lineRule="auto"/>
-      </w:pPr>
-    </w:p>
-    <w:p>
-      <w:pPr>
-        <w:spacing w:before="0" w:after="80" w:line="269" w:lineRule="auto"/>
+        <w:spacing w:before="0" w:after="40" w:line="269" w:lineRule="auto"/>
       </w:pPr>
       <w:r>
         <w:rPr>
@@ -1912,16 +1266,10 @@
     </w:p>
     <w:p>
       <w:pPr>
-        <w:spacing w:before="0" w:after="80" w:line="269" w:lineRule="auto"/>
-      </w:pPr>
-    </w:p>
-    <w:p>
-      <w:pPr>
-        <w:spacing w:before="0" w:after="120" w:line="269" w:lineRule="auto"/>
-      </w:pPr>
-      <w:r>
-        <w:rPr>
-          <w:b/>
+        <w:spacing w:before="0" w:after="120" w:line="269" w:lineRule="auto"/>
+      </w:pPr>
+      <w:r>
+        <w:rPr>
           <w:sz w:val="22"/>
           <w:szCs w:val="22"/>
         </w:rPr>
@@ -1930,11 +1278,6 @@
     </w:p>
     <w:p>
       <w:pPr>
-        <w:spacing w:before="0" w:after="80" w:line="269" w:lineRule="auto"/>
-      </w:pPr>
-    </w:p>
-    <w:p>
-      <w:pPr>
         <w:spacing w:before="0" w:after="40" w:line="269" w:lineRule="auto"/>
       </w:pPr>
       <w:r>
@@ -1948,16 +1291,10 @@
     </w:p>
     <w:p>
       <w:pPr>
-        <w:spacing w:before="0" w:after="80" w:line="269" w:lineRule="auto"/>
-      </w:pPr>
-    </w:p>
-    <w:p>
-      <w:pPr>
         <w:spacing w:before="0" w:after="20" w:line="269" w:lineRule="auto"/>
       </w:pPr>
       <w:r>
         <w:rPr>
-          <w:b/>
           <w:sz w:val="20"/>
           <w:szCs w:val="20"/>
         </w:rPr>
@@ -1966,12 +1303,7 @@
     </w:p>
     <w:p>
       <w:pPr>
-        <w:spacing w:before="0" w:after="80" w:line="269" w:lineRule="auto"/>
-      </w:pPr>
-    </w:p>
-    <w:p>
-      <w:pPr>
-        <w:spacing w:before="0" w:after="80" w:line="269" w:lineRule="auto"/>
+        <w:spacing w:before="0" w:after="40" w:line="269" w:lineRule="auto"/>
       </w:pPr>
       <w:r>
         <w:rPr>
@@ -1984,16 +1316,10 @@
     </w:p>
     <w:p>
       <w:pPr>
-        <w:spacing w:before="0" w:after="80" w:line="269" w:lineRule="auto"/>
-      </w:pPr>
-    </w:p>
-    <w:p>
-      <w:pPr>
-        <w:spacing w:before="0" w:after="120" w:line="269" w:lineRule="auto"/>
-      </w:pPr>
-      <w:r>
-        <w:rPr>
-          <w:b/>
+        <w:spacing w:before="0" w:after="120" w:line="269" w:lineRule="auto"/>
+      </w:pPr>
+      <w:r>
+        <w:rPr>
           <w:sz w:val="22"/>
           <w:szCs w:val="22"/>
         </w:rPr>
@@ -2002,11 +1328,6 @@
     </w:p>
     <w:p>
       <w:pPr>
-        <w:spacing w:before="0" w:after="80" w:line="269" w:lineRule="auto"/>
-      </w:pPr>
-    </w:p>
-    <w:p>
-      <w:pPr>
         <w:spacing w:before="0" w:after="40" w:line="269" w:lineRule="auto"/>
       </w:pPr>
       <w:r>
@@ -2020,16 +1341,10 @@
     </w:p>
     <w:p>
       <w:pPr>
-        <w:spacing w:before="0" w:after="80" w:line="269" w:lineRule="auto"/>
-      </w:pPr>
-    </w:p>
-    <w:p>
-      <w:pPr>
         <w:spacing w:before="0" w:after="20" w:line="269" w:lineRule="auto"/>
       </w:pPr>
       <w:r>
         <w:rPr>
-          <w:b/>
           <w:sz w:val="20"/>
           <w:szCs w:val="20"/>
         </w:rPr>
@@ -2038,12 +1353,7 @@
     </w:p>
     <w:p>
       <w:pPr>
-        <w:spacing w:before="0" w:after="80" w:line="269" w:lineRule="auto"/>
-      </w:pPr>
-    </w:p>
-    <w:p>
-      <w:pPr>
-        <w:spacing w:before="0" w:after="80" w:line="269" w:lineRule="auto"/>
+        <w:spacing w:before="0" w:after="40" w:line="269" w:lineRule="auto"/>
       </w:pPr>
       <w:r>
         <w:rPr>
@@ -2056,16 +1366,10 @@
     </w:p>
     <w:p>
       <w:pPr>
-        <w:spacing w:before="0" w:after="80" w:line="269" w:lineRule="auto"/>
-      </w:pPr>
-    </w:p>
-    <w:p>
-      <w:pPr>
-        <w:spacing w:before="0" w:after="120" w:line="269" w:lineRule="auto"/>
-      </w:pPr>
-      <w:r>
-        <w:rPr>
-          <w:b/>
+        <w:spacing w:before="0" w:after="120" w:line="269" w:lineRule="auto"/>
+      </w:pPr>
+      <w:r>
+        <w:rPr>
           <w:sz w:val="22"/>
           <w:szCs w:val="22"/>
         </w:rPr>
@@ -2074,11 +1378,6 @@
     </w:p>
     <w:p>
       <w:pPr>
-        <w:spacing w:before="0" w:after="80" w:line="269" w:lineRule="auto"/>
-      </w:pPr>
-    </w:p>
-    <w:p>
-      <w:pPr>
         <w:spacing w:before="0" w:after="40" w:line="269" w:lineRule="auto"/>
       </w:pPr>
       <w:r>
@@ -2092,36 +1391,15 @@
     </w:p>
     <w:p>
       <w:pPr>
-        <w:spacing w:before="0" w:after="80" w:line="269" w:lineRule="auto"/>
-      </w:pPr>
-    </w:p>
-    <w:p>
-      <w:pPr>
         <w:spacing w:before="0" w:after="20" w:line="269" w:lineRule="auto"/>
       </w:pPr>
       <w:r>
         <w:rPr>
-          <w:b/>
           <w:sz w:val="20"/>
           <w:szCs w:val="20"/>
         </w:rPr>
         <w:t xml:space="preserve">_____________________________________________________________________________________________</w:t>
       </w:r>
-    </w:p>
-    <w:p>
-      <w:pPr>
-        <w:spacing w:before="0" w:after="80" w:line="269" w:lineRule="auto"/>
-      </w:pPr>
-    </w:p>
-    <w:p>
-      <w:pPr>
-        <w:spacing w:before="0" w:after="80" w:line="269" w:lineRule="auto"/>
-      </w:pPr>
-    </w:p>
-    <w:p>
-      <w:pPr>
-        <w:spacing w:before="0" w:after="80" w:line="269" w:lineRule="auto"/>
-      </w:pPr>
     </w:p>
     <w:p>
       <w:pPr>
@@ -2140,14 +1418,8 @@
       <w:pPr>
         <w:spacing w:before="0" w:after="80" w:line="269" w:lineRule="auto"/>
       </w:pPr>
-    </w:p>
-    <w:p>
-      <w:pPr>
-        <w:spacing w:before="0" w:after="80" w:line="269" w:lineRule="auto"/>
-      </w:pPr>
-      <w:r>
-        <w:rPr>
-          <w:b/>
+      <w:r>
+        <w:rPr>
           <w:sz w:val="22"/>
           <w:szCs w:val="22"/>
         </w:rPr>
@@ -2156,11 +1428,6 @@
     </w:p>
     <w:p>
       <w:pPr>
-        <w:spacing w:before="0" w:after="80" w:line="269" w:lineRule="auto"/>
-      </w:pPr>
-    </w:p>
-    <w:p>
-      <w:pPr>
         <w:spacing w:before="0" w:after="40" w:line="269" w:lineRule="auto"/>
       </w:pPr>
       <w:r>
@@ -2174,16 +1441,10 @@
     </w:p>
     <w:p>
       <w:pPr>
-        <w:spacing w:before="0" w:after="80" w:line="269" w:lineRule="auto"/>
-      </w:pPr>
-    </w:p>
-    <w:p>
-      <w:pPr>
         <w:spacing w:before="0" w:after="20" w:line="269" w:lineRule="auto"/>
       </w:pPr>
       <w:r>
         <w:rPr>
-          <w:b/>
           <w:sz w:val="20"/>
           <w:szCs w:val="20"/>
         </w:rPr>
@@ -2192,16 +1453,10 @@
     </w:p>
     <w:p>
       <w:pPr>
-        <w:spacing w:before="0" w:after="80" w:line="269" w:lineRule="auto"/>
-      </w:pPr>
-    </w:p>
-    <w:p>
-      <w:pPr>
         <w:spacing w:before="0" w:after="20" w:line="269" w:lineRule="auto"/>
       </w:pPr>
       <w:r>
         <w:rPr>
-          <w:b/>
           <w:sz w:val="20"/>
           <w:szCs w:val="20"/>
         </w:rPr>
@@ -2210,36 +1465,15 @@
     </w:p>
     <w:p>
       <w:pPr>
-        <w:spacing w:before="0" w:after="80" w:line="269" w:lineRule="auto"/>
-      </w:pPr>
-    </w:p>
-    <w:p>
-      <w:pPr>
         <w:spacing w:before="0" w:after="20" w:line="269" w:lineRule="auto"/>
       </w:pPr>
       <w:r>
         <w:rPr>
-          <w:b/>
           <w:sz w:val="20"/>
           <w:szCs w:val="20"/>
         </w:rPr>
         <w:t xml:space="preserve">_____________________________________________________________________________________________</w:t>
       </w:r>
-    </w:p>
-    <w:p>
-      <w:pPr>
-        <w:spacing w:before="0" w:after="80" w:line="269" w:lineRule="auto"/>
-      </w:pPr>
-    </w:p>
-    <w:p>
-      <w:pPr>
-        <w:spacing w:before="0" w:after="80" w:line="269" w:lineRule="auto"/>
-      </w:pPr>
-    </w:p>
-    <w:p>
-      <w:pPr>
-        <w:spacing w:before="0" w:after="80" w:line="269" w:lineRule="auto"/>
-      </w:pPr>
     </w:p>
     <w:p>
       <w:r>
@@ -2261,11 +1495,6 @@
     </w:p>
     <w:p>
       <w:pPr>
-        <w:spacing w:before="0" w:after="80" w:line="269" w:lineRule="auto"/>
-      </w:pPr>
-    </w:p>
-    <w:p>
-      <w:pPr>
         <w:spacing w:before="200" w:after="80" w:line="269" w:lineRule="auto"/>
       </w:pPr>
       <w:r>
@@ -2279,11 +1508,6 @@
     </w:p>
     <w:p>
       <w:pPr>
-        <w:spacing w:before="0" w:after="80" w:line="269" w:lineRule="auto"/>
-      </w:pPr>
-    </w:p>
-    <w:p>
-      <w:pPr>
         <w:spacing w:before="0" w:after="0" w:line="269" w:lineRule="auto"/>
       </w:pPr>
       <w:r>
@@ -2299,14 +1523,8 @@
       <w:pPr>
         <w:spacing w:before="0" w:after="80" w:line="269" w:lineRule="auto"/>
       </w:pPr>
-    </w:p>
-    <w:p>
-      <w:pPr>
-        <w:spacing w:before="0" w:after="80" w:line="269" w:lineRule="auto"/>
-      </w:pPr>
-      <w:r>
-        <w:rPr>
-          <w:b/>
+      <w:r>
+        <w:rPr>
           <w:sz w:val="22"/>
           <w:szCs w:val="22"/>
         </w:rPr>
@@ -2319,7 +1537,6 @@
       </w:pPr>
       <w:r>
         <w:rPr>
-          <w:b/>
           <w:sz w:val="22"/>
           <w:szCs w:val="22"/>
         </w:rPr>
@@ -2328,11 +1545,6 @@
     </w:p>
     <w:p>
       <w:pPr>
-        <w:spacing w:before="0" w:after="80" w:line="269" w:lineRule="auto"/>
-      </w:pPr>
-    </w:p>
-    <w:p>
-      <w:pPr>
         <w:spacing w:before="0" w:after="0" w:line="269" w:lineRule="auto"/>
       </w:pPr>
       <w:r>
@@ -2350,17 +1562,11 @@
       </w:pPr>
       <w:r>
         <w:rPr>
-          <w:b/>
-          <w:sz w:val="22"/>
-          <w:szCs w:val="22"/>
+          <w:sz w:val="20"/>
+          <w:szCs w:val="20"/>
         </w:rPr>
         <w:t xml:space="preserve">O aluno deve localizar informações explícitas no texto e responder com frase completa em inglês. Pequenas variações são aceitáveis se mantiverem o sentido.</w:t>
       </w:r>
-    </w:p>
-    <w:p>
-      <w:pPr>
-        <w:spacing w:before="0" w:after="80" w:line="269" w:lineRule="auto"/>
-      </w:pPr>
     </w:p>
     <w:p>
       <w:pPr>
@@ -2377,11 +1583,6 @@
     </w:p>
     <w:p>
       <w:pPr>
-        <w:spacing w:before="0" w:after="80" w:line="269" w:lineRule="auto"/>
-      </w:pPr>
-    </w:p>
-    <w:p>
-      <w:pPr>
         <w:spacing w:before="0" w:after="0" w:line="269" w:lineRule="auto"/>
       </w:pPr>
       <w:r>
@@ -2397,14 +1598,8 @@
       <w:pPr>
         <w:spacing w:before="0" w:after="80" w:line="269" w:lineRule="auto"/>
       </w:pPr>
-    </w:p>
-    <w:p>
-      <w:pPr>
-        <w:spacing w:before="0" w:after="80" w:line="269" w:lineRule="auto"/>
-      </w:pPr>
-      <w:r>
-        <w:rPr>
-          <w:b/>
+      <w:r>
+        <w:rPr>
           <w:sz w:val="22"/>
           <w:szCs w:val="22"/>
         </w:rPr>
@@ -2413,11 +1608,6 @@
     </w:p>
     <w:p>
       <w:pPr>
-        <w:spacing w:before="0" w:after="80" w:line="269" w:lineRule="auto"/>
-      </w:pPr>
-    </w:p>
-    <w:p>
-      <w:pPr>
         <w:spacing w:before="0" w:after="0" w:line="269" w:lineRule="auto"/>
       </w:pPr>
       <w:r>
@@ -2435,17 +1625,11 @@
       </w:pPr>
       <w:r>
         <w:rPr>
-          <w:b/>
-          <w:sz w:val="22"/>
-          <w:szCs w:val="22"/>
+          <w:sz w:val="20"/>
+          <w:szCs w:val="20"/>
         </w:rPr>
         <w:t xml:space="preserve">A resposta deve indicar corretamente o transporte usado pelos amigos de Emma e estar em frase completa.</w:t>
       </w:r>
-    </w:p>
-    <w:p>
-      <w:pPr>
-        <w:spacing w:before="0" w:after="80" w:line="269" w:lineRule="auto"/>
-      </w:pPr>
     </w:p>
     <w:p>
       <w:pPr>
@@ -2462,11 +1646,6 @@
     </w:p>
     <w:p>
       <w:pPr>
-        <w:spacing w:before="0" w:after="80" w:line="269" w:lineRule="auto"/>
-      </w:pPr>
-    </w:p>
-    <w:p>
-      <w:pPr>
         <w:spacing w:before="0" w:after="0" w:line="269" w:lineRule="auto"/>
       </w:pPr>
       <w:r>
@@ -2482,14 +1661,8 @@
       <w:pPr>
         <w:spacing w:before="0" w:after="80" w:line="269" w:lineRule="auto"/>
       </w:pPr>
-    </w:p>
-    <w:p>
-      <w:pPr>
-        <w:spacing w:before="0" w:after="80" w:line="269" w:lineRule="auto"/>
-      </w:pPr>
-      <w:r>
-        <w:rPr>
-          <w:b/>
+      <w:r>
+        <w:rPr>
           <w:sz w:val="22"/>
           <w:szCs w:val="22"/>
         </w:rPr>
@@ -2498,11 +1671,6 @@
     </w:p>
     <w:p>
       <w:pPr>
-        <w:spacing w:before="0" w:after="80" w:line="269" w:lineRule="auto"/>
-      </w:pPr>
-    </w:p>
-    <w:p>
-      <w:pPr>
         <w:spacing w:before="0" w:after="0" w:line="269" w:lineRule="auto"/>
       </w:pPr>
       <w:r>
@@ -2520,17 +1688,11 @@
       </w:pPr>
       <w:r>
         <w:rPr>
-          <w:b/>
-          <w:sz w:val="22"/>
-          <w:szCs w:val="22"/>
+          <w:sz w:val="20"/>
+          <w:szCs w:val="20"/>
         </w:rPr>
         <w:t xml:space="preserve">A primeira frase é falsa porque o texto diz “Last Sunday”. As demais informações aparecem diretamente no texto.</w:t>
       </w:r>
-    </w:p>
-    <w:p>
-      <w:pPr>
-        <w:spacing w:before="0" w:after="80" w:line="269" w:lineRule="auto"/>
-      </w:pPr>
     </w:p>
     <w:p>
       <w:pPr>
@@ -2547,11 +1709,6 @@
     </w:p>
     <w:p>
       <w:pPr>
-        <w:spacing w:before="0" w:after="80" w:line="269" w:lineRule="auto"/>
-      </w:pPr>
-    </w:p>
-    <w:p>
-      <w:pPr>
         <w:spacing w:before="0" w:after="0" w:line="269" w:lineRule="auto"/>
       </w:pPr>
       <w:r>
@@ -2567,14 +1724,8 @@
       <w:pPr>
         <w:spacing w:before="0" w:after="80" w:line="269" w:lineRule="auto"/>
       </w:pPr>
-    </w:p>
-    <w:p>
-      <w:pPr>
-        <w:spacing w:before="0" w:after="80" w:line="269" w:lineRule="auto"/>
-      </w:pPr>
-      <w:r>
-        <w:rPr>
-          <w:b/>
+      <w:r>
+        <w:rPr>
           <w:sz w:val="22"/>
           <w:szCs w:val="22"/>
         </w:rPr>
@@ -2587,7 +1738,6 @@
       </w:pPr>
       <w:r>
         <w:rPr>
-          <w:b/>
           <w:sz w:val="22"/>
           <w:szCs w:val="22"/>
         </w:rPr>
@@ -2600,7 +1750,6 @@
       </w:pPr>
       <w:r>
         <w:rPr>
-          <w:b/>
           <w:sz w:val="22"/>
           <w:szCs w:val="22"/>
         </w:rPr>
@@ -2613,7 +1762,6 @@
       </w:pPr>
       <w:r>
         <w:rPr>
-          <w:b/>
           <w:sz w:val="22"/>
           <w:szCs w:val="22"/>
         </w:rPr>
@@ -2626,7 +1774,6 @@
       </w:pPr>
       <w:r>
         <w:rPr>
-          <w:b/>
           <w:sz w:val="22"/>
           <w:szCs w:val="22"/>
         </w:rPr>
@@ -2639,7 +1786,6 @@
       </w:pPr>
       <w:r>
         <w:rPr>
-          <w:b/>
           <w:sz w:val="22"/>
           <w:szCs w:val="22"/>
         </w:rPr>
@@ -2648,11 +1794,6 @@
     </w:p>
     <w:p>
       <w:pPr>
-        <w:spacing w:before="0" w:after="80" w:line="269" w:lineRule="auto"/>
-      </w:pPr>
-    </w:p>
-    <w:p>
-      <w:pPr>
         <w:spacing w:before="0" w:after="0" w:line="269" w:lineRule="auto"/>
       </w:pPr>
       <w:r>
@@ -2670,17 +1811,11 @@
       </w:pPr>
       <w:r>
         <w:rPr>
-          <w:b/>
-          <w:sz w:val="22"/>
-          <w:szCs w:val="22"/>
+          <w:sz w:val="20"/>
+          <w:szCs w:val="20"/>
         </w:rPr>
         <w:t xml:space="preserve">A questão avalia vocabulário de toys/activities e a distinção entre atividades normalmente feitas em local fechado ou aberto.</w:t>
       </w:r>
-    </w:p>
-    <w:p>
-      <w:pPr>
-        <w:spacing w:before="0" w:after="80" w:line="269" w:lineRule="auto"/>
-      </w:pPr>
     </w:p>
     <w:p>
       <w:pPr>
@@ -2697,11 +1832,6 @@
     </w:p>
     <w:p>
       <w:pPr>
-        <w:spacing w:before="0" w:after="80" w:line="269" w:lineRule="auto"/>
-      </w:pPr>
-    </w:p>
-    <w:p>
-      <w:pPr>
         <w:spacing w:before="0" w:after="0" w:line="269" w:lineRule="auto"/>
       </w:pPr>
       <w:r>
@@ -2717,14 +1847,8 @@
       <w:pPr>
         <w:spacing w:before="0" w:after="80" w:line="269" w:lineRule="auto"/>
       </w:pPr>
-    </w:p>
-    <w:p>
-      <w:pPr>
-        <w:spacing w:before="0" w:after="80" w:line="269" w:lineRule="auto"/>
-      </w:pPr>
-      <w:r>
-        <w:rPr>
-          <w:b/>
+      <w:r>
+        <w:rPr>
           <w:sz w:val="22"/>
           <w:szCs w:val="22"/>
         </w:rPr>
@@ -2737,7 +1861,6 @@
       </w:pPr>
       <w:r>
         <w:rPr>
-          <w:b/>
           <w:sz w:val="22"/>
           <w:szCs w:val="22"/>
         </w:rPr>
@@ -2750,7 +1873,6 @@
       </w:pPr>
       <w:r>
         <w:rPr>
-          <w:b/>
           <w:sz w:val="22"/>
           <w:szCs w:val="22"/>
         </w:rPr>
@@ -2763,7 +1885,6 @@
       </w:pPr>
       <w:r>
         <w:rPr>
-          <w:b/>
           <w:sz w:val="22"/>
           <w:szCs w:val="22"/>
         </w:rPr>
@@ -2776,7 +1897,6 @@
       </w:pPr>
       <w:r>
         <w:rPr>
-          <w:b/>
           <w:sz w:val="22"/>
           <w:szCs w:val="22"/>
         </w:rPr>
@@ -2789,7 +1909,6 @@
       </w:pPr>
       <w:r>
         <w:rPr>
-          <w:b/>
           <w:sz w:val="22"/>
           <w:szCs w:val="22"/>
         </w:rPr>
@@ -2798,11 +1917,6 @@
     </w:p>
     <w:p>
       <w:pPr>
-        <w:spacing w:before="0" w:after="80" w:line="269" w:lineRule="auto"/>
-      </w:pPr>
-    </w:p>
-    <w:p>
-      <w:pPr>
         <w:spacing w:before="0" w:after="0" w:line="269" w:lineRule="auto"/>
       </w:pPr>
       <w:r>
@@ -2820,17 +1934,11 @@
       </w:pPr>
       <w:r>
         <w:rPr>
-          <w:b/>
-          <w:sz w:val="22"/>
-          <w:szCs w:val="22"/>
+          <w:sz w:val="20"/>
+          <w:szCs w:val="20"/>
         </w:rPr>
         <w:t xml:space="preserve">A questão cobra Simple Past de verbos irregulares. O aluno precisa usar a forma correta, sem aplicar “-ed” a verbos irregulares.</w:t>
       </w:r>
-    </w:p>
-    <w:p>
-      <w:pPr>
-        <w:spacing w:before="0" w:after="80" w:line="269" w:lineRule="auto"/>
-      </w:pPr>
     </w:p>
     <w:p>
       <w:pPr>
@@ -2847,11 +1955,6 @@
     </w:p>
     <w:p>
       <w:pPr>
-        <w:spacing w:before="0" w:after="80" w:line="269" w:lineRule="auto"/>
-      </w:pPr>
-    </w:p>
-    <w:p>
-      <w:pPr>
         <w:spacing w:before="0" w:after="0" w:line="269" w:lineRule="auto"/>
       </w:pPr>
       <w:r>
@@ -2867,14 +1970,8 @@
       <w:pPr>
         <w:spacing w:before="0" w:after="80" w:line="269" w:lineRule="auto"/>
       </w:pPr>
-    </w:p>
-    <w:p>
-      <w:pPr>
-        <w:spacing w:before="0" w:after="80" w:line="269" w:lineRule="auto"/>
-      </w:pPr>
-      <w:r>
-        <w:rPr>
-          <w:b/>
+      <w:r>
+        <w:rPr>
           <w:sz w:val="22"/>
           <w:szCs w:val="22"/>
         </w:rPr>
@@ -2887,7 +1984,6 @@
       </w:pPr>
       <w:r>
         <w:rPr>
-          <w:b/>
           <w:sz w:val="22"/>
           <w:szCs w:val="22"/>
         </w:rPr>
@@ -2898,14 +1994,8 @@
       <w:pPr>
         <w:spacing w:before="0" w:after="80" w:line="269" w:lineRule="auto"/>
       </w:pPr>
-    </w:p>
-    <w:p>
-      <w:pPr>
-        <w:spacing w:before="0" w:after="80" w:line="269" w:lineRule="auto"/>
-      </w:pPr>
-      <w:r>
-        <w:rPr>
-          <w:b/>
+      <w:r>
+        <w:rPr>
           <w:sz w:val="22"/>
           <w:szCs w:val="22"/>
         </w:rPr>
@@ -2918,7 +2008,6 @@
       </w:pPr>
       <w:r>
         <w:rPr>
-          <w:b/>
           <w:sz w:val="22"/>
           <w:szCs w:val="22"/>
         </w:rPr>
@@ -2927,11 +2016,6 @@
     </w:p>
     <w:p>
       <w:pPr>
-        <w:spacing w:before="0" w:after="80" w:line="269" w:lineRule="auto"/>
-      </w:pPr>
-    </w:p>
-    <w:p>
-      <w:pPr>
         <w:spacing w:before="0" w:after="0" w:line="269" w:lineRule="auto"/>
       </w:pPr>
       <w:r>
@@ -2949,17 +2033,11 @@
       </w:pPr>
       <w:r>
         <w:rPr>
-          <w:b/>
-          <w:sz w:val="22"/>
-          <w:szCs w:val="22"/>
+          <w:sz w:val="20"/>
+          <w:szCs w:val="20"/>
         </w:rPr>
         <w:t xml:space="preserve">Em frases negativas e interrogativas no Simple Past, usa-se did/didn't e o verbo principal volta para a forma base: see, take.</w:t>
       </w:r>
-    </w:p>
-    <w:p>
-      <w:pPr>
-        <w:spacing w:before="0" w:after="80" w:line="269" w:lineRule="auto"/>
-      </w:pPr>
     </w:p>
     <w:p>
       <w:pPr>
@@ -2976,11 +2054,6 @@
     </w:p>
     <w:p>
       <w:pPr>
-        <w:spacing w:before="0" w:after="80" w:line="269" w:lineRule="auto"/>
-      </w:pPr>
-    </w:p>
-    <w:p>
-      <w:pPr>
         <w:spacing w:before="0" w:after="0" w:line="269" w:lineRule="auto"/>
       </w:pPr>
       <w:r>
@@ -2996,14 +2069,8 @@
       <w:pPr>
         <w:spacing w:before="0" w:after="80" w:line="269" w:lineRule="auto"/>
       </w:pPr>
-    </w:p>
-    <w:p>
-      <w:pPr>
-        <w:spacing w:before="0" w:after="80" w:line="269" w:lineRule="auto"/>
-      </w:pPr>
-      <w:r>
-        <w:rPr>
-          <w:b/>
+      <w:r>
+        <w:rPr>
           <w:sz w:val="22"/>
           <w:szCs w:val="22"/>
         </w:rPr>
@@ -3016,7 +2083,6 @@
       </w:pPr>
       <w:r>
         <w:rPr>
-          <w:b/>
           <w:sz w:val="22"/>
           <w:szCs w:val="22"/>
         </w:rPr>
@@ -3029,7 +2095,6 @@
       </w:pPr>
       <w:r>
         <w:rPr>
-          <w:b/>
           <w:sz w:val="22"/>
           <w:szCs w:val="22"/>
         </w:rPr>
@@ -3042,7 +2107,6 @@
       </w:pPr>
       <w:r>
         <w:rPr>
-          <w:b/>
           <w:sz w:val="22"/>
           <w:szCs w:val="22"/>
         </w:rPr>
@@ -3055,7 +2119,6 @@
       </w:pPr>
       <w:r>
         <w:rPr>
-          <w:b/>
           <w:sz w:val="22"/>
           <w:szCs w:val="22"/>
         </w:rPr>
@@ -3068,7 +2131,6 @@
       </w:pPr>
       <w:r>
         <w:rPr>
-          <w:b/>
           <w:sz w:val="22"/>
           <w:szCs w:val="22"/>
         </w:rPr>
@@ -3077,11 +2139,6 @@
     </w:p>
     <w:p>
       <w:pPr>
-        <w:spacing w:before="0" w:after="80" w:line="269" w:lineRule="auto"/>
-      </w:pPr>
-    </w:p>
-    <w:p>
-      <w:pPr>
         <w:spacing w:before="0" w:after="0" w:line="269" w:lineRule="auto"/>
       </w:pPr>
       <w:r>
@@ -3099,17 +2156,11 @@
       </w:pPr>
       <w:r>
         <w:rPr>
-          <w:b/>
-          <w:sz w:val="22"/>
-          <w:szCs w:val="22"/>
+          <w:sz w:val="20"/>
+          <w:szCs w:val="20"/>
         </w:rPr>
         <w:t xml:space="preserve">A questão cobra collocations de transporte. Usa-se get on para transportes grandes, get in para carro e get off para descer/sair.</w:t>
       </w:r>
-    </w:p>
-    <w:p>
-      <w:pPr>
-        <w:spacing w:before="0" w:after="80" w:line="269" w:lineRule="auto"/>
-      </w:pPr>
     </w:p>
     <w:p>
       <w:pPr>
@@ -3126,11 +2177,6 @@
     </w:p>
     <w:p>
       <w:pPr>
-        <w:spacing w:before="0" w:after="80" w:line="269" w:lineRule="auto"/>
-      </w:pPr>
-    </w:p>
-    <w:p>
-      <w:pPr>
         <w:spacing w:before="0" w:after="0" w:line="269" w:lineRule="auto"/>
       </w:pPr>
       <w:r>
@@ -3146,14 +2192,8 @@
       <w:pPr>
         <w:spacing w:before="0" w:after="80" w:line="269" w:lineRule="auto"/>
       </w:pPr>
-    </w:p>
-    <w:p>
-      <w:pPr>
-        <w:spacing w:before="0" w:after="80" w:line="269" w:lineRule="auto"/>
-      </w:pPr>
-      <w:r>
-        <w:rPr>
-          <w:b/>
+      <w:r>
+        <w:rPr>
           <w:sz w:val="22"/>
           <w:szCs w:val="22"/>
         </w:rPr>
@@ -3166,7 +2206,6 @@
       </w:pPr>
       <w:r>
         <w:rPr>
-          <w:b/>
           <w:sz w:val="22"/>
           <w:szCs w:val="22"/>
         </w:rPr>
@@ -3179,7 +2218,6 @@
       </w:pPr>
       <w:r>
         <w:rPr>
-          <w:b/>
           <w:sz w:val="22"/>
           <w:szCs w:val="22"/>
         </w:rPr>
@@ -3192,7 +2230,6 @@
       </w:pPr>
       <w:r>
         <w:rPr>
-          <w:b/>
           <w:sz w:val="22"/>
           <w:szCs w:val="22"/>
         </w:rPr>
@@ -3205,7 +2242,6 @@
       </w:pPr>
       <w:r>
         <w:rPr>
-          <w:b/>
           <w:sz w:val="22"/>
           <w:szCs w:val="22"/>
         </w:rPr>
@@ -3214,11 +2250,6 @@
     </w:p>
     <w:p>
       <w:pPr>
-        <w:spacing w:before="0" w:after="80" w:line="269" w:lineRule="auto"/>
-      </w:pPr>
-    </w:p>
-    <w:p>
-      <w:pPr>
         <w:spacing w:before="0" w:after="0" w:line="269" w:lineRule="auto"/>
       </w:pPr>
       <w:r>
@@ -3236,17 +2267,11 @@
       </w:pPr>
       <w:r>
         <w:rPr>
-          <w:b/>
-          <w:sz w:val="22"/>
-          <w:szCs w:val="22"/>
+          <w:sz w:val="20"/>
+          <w:szCs w:val="20"/>
         </w:rPr>
         <w:t xml:space="preserve">A questão combina preposições de transporte e Simple Past com did/didn't. Depois de did/didn't, o verbo volta para a forma base.</w:t>
       </w:r>
-    </w:p>
-    <w:p>
-      <w:pPr>
-        <w:spacing w:before="0" w:after="80" w:line="269" w:lineRule="auto"/>
-      </w:pPr>
     </w:p>
     <w:p>
       <w:pPr>
@@ -3263,11 +2288,6 @@
     </w:p>
     <w:p>
       <w:pPr>
-        <w:spacing w:before="0" w:after="80" w:line="269" w:lineRule="auto"/>
-      </w:pPr>
-    </w:p>
-    <w:p>
-      <w:pPr>
         <w:spacing w:before="0" w:after="0" w:line="269" w:lineRule="auto"/>
       </w:pPr>
       <w:r>
@@ -3283,14 +2303,8 @@
       <w:pPr>
         <w:spacing w:before="0" w:after="80" w:line="269" w:lineRule="auto"/>
       </w:pPr>
-    </w:p>
-    <w:p>
-      <w:pPr>
-        <w:spacing w:before="0" w:after="80" w:line="269" w:lineRule="auto"/>
-      </w:pPr>
-      <w:r>
-        <w:rPr>
-          <w:b/>
+      <w:r>
+        <w:rPr>
           <w:sz w:val="22"/>
           <w:szCs w:val="22"/>
         </w:rPr>
@@ -3303,7 +2317,6 @@
       </w:pPr>
       <w:r>
         <w:rPr>
-          <w:b/>
           <w:sz w:val="22"/>
           <w:szCs w:val="22"/>
         </w:rPr>
@@ -3316,7 +2329,6 @@
       </w:pPr>
       <w:r>
         <w:rPr>
-          <w:b/>
           <w:sz w:val="22"/>
           <w:szCs w:val="22"/>
         </w:rPr>
@@ -3325,11 +2337,6 @@
     </w:p>
     <w:p>
       <w:pPr>
-        <w:spacing w:before="0" w:after="80" w:line="269" w:lineRule="auto"/>
-      </w:pPr>
-    </w:p>
-    <w:p>
-      <w:pPr>
         <w:spacing w:before="0" w:after="0" w:line="269" w:lineRule="auto"/>
       </w:pPr>
       <w:r>
@@ -3347,17 +2354,11 @@
       </w:pPr>
       <w:r>
         <w:rPr>
-          <w:b/>
-          <w:sz w:val="22"/>
-          <w:szCs w:val="22"/>
+          <w:sz w:val="20"/>
+          <w:szCs w:val="20"/>
         </w:rPr>
         <w:t xml:space="preserve">A questão trabalha erros comuns: usar verbo no passado depois de did/didn't e usar collocation inadequada com bus. Para bus, usa-se get on; no passado, got on.</w:t>
       </w:r>
-    </w:p>
-    <w:p>
-      <w:pPr>
-        <w:spacing w:before="0" w:after="80" w:line="269" w:lineRule="auto"/>
-      </w:pPr>
     </w:p>
     <w:p>
       <w:pPr>
@@ -3374,11 +2375,6 @@
     </w:p>
     <w:p>
       <w:pPr>
-        <w:spacing w:before="0" w:after="80" w:line="269" w:lineRule="auto"/>
-      </w:pPr>
-    </w:p>
-    <w:p>
-      <w:pPr>
         <w:spacing w:before="0" w:after="0" w:line="269" w:lineRule="auto"/>
       </w:pPr>
       <w:r>
@@ -3394,14 +2390,8 @@
       <w:pPr>
         <w:spacing w:before="0" w:after="80" w:line="269" w:lineRule="auto"/>
       </w:pPr>
-    </w:p>
-    <w:p>
-      <w:pPr>
-        <w:spacing w:before="0" w:after="80" w:line="269" w:lineRule="auto"/>
-      </w:pPr>
-      <w:r>
-        <w:rPr>
-          <w:b/>
+      <w:r>
+        <w:rPr>
           <w:sz w:val="22"/>
           <w:szCs w:val="22"/>
         </w:rPr>
@@ -3410,11 +2400,6 @@
     </w:p>
     <w:p>
       <w:pPr>
-        <w:spacing w:before="0" w:after="80" w:line="269" w:lineRule="auto"/>
-      </w:pPr>
-    </w:p>
-    <w:p>
-      <w:pPr>
         <w:spacing w:before="0" w:after="0" w:line="269" w:lineRule="auto"/>
       </w:pPr>
       <w:r>
@@ -3432,9 +2417,8 @@
       </w:pPr>
       <w:r>
         <w:rPr>
-          <w:b/>
-          <w:sz w:val="22"/>
-          <w:szCs w:val="22"/>
+          <w:sz w:val="20"/>
+          <w:szCs w:val="20"/>
         </w:rPr>
         <w:t xml:space="preserve">A resposta deve estar em inglês, ser coerente, usar pelo menos dois verbos no Simple Past e uma expressão de transporte. Variações pessoais são aceitáveis se cumprirem os critérios.</w:t>
       </w:r>

</xml_diff>

<commit_message>
Keep English subquestion labels with prompts
</commit_message>
<xml_diff>
--- a/docs/provas/ingles/p2/simulados/simulado-p2-ingles-02.docx
+++ b/docs/provas/ingles/p2/simulados/simulado-p2-ingles-02.docx
@@ -129,36 +129,23 @@
     </w:p>
     <w:p>
       <w:pPr>
+        <w:spacing w:before="0" w:after="80" w:line="269" w:lineRule="auto"/>
+      </w:pPr>
+      <w:r>
+        <w:rPr>
+          <w:sz w:val="22"/>
+          <w:szCs w:val="22"/>
+        </w:rPr>
+        <w:t xml:space="preserve">a. Where did Emma meet her friends?</w:t>
+      </w:r>
+    </w:p>
+    <w:p>
+      <w:pPr>
         <w:spacing w:before="0" w:after="40" w:line="269" w:lineRule="auto"/>
       </w:pPr>
       <w:r>
         <w:rPr>
           <w:b/>
-          <w:sz w:val="22"/>
-          <w:szCs w:val="22"/>
-        </w:rPr>
-        <w:t xml:space="preserve">a.</w:t>
-      </w:r>
-    </w:p>
-    <w:p>
-      <w:pPr>
-        <w:spacing w:before="0" w:after="120" w:line="269" w:lineRule="auto"/>
-      </w:pPr>
-      <w:r>
-        <w:rPr>
-          <w:sz w:val="22"/>
-          <w:szCs w:val="22"/>
-        </w:rPr>
-        <w:t xml:space="preserve">Where did Emma meet her friends?</w:t>
-      </w:r>
-    </w:p>
-    <w:p>
-      <w:pPr>
-        <w:spacing w:before="0" w:after="40" w:line="269" w:lineRule="auto"/>
-      </w:pPr>
-      <w:r>
-        <w:rPr>
-          <w:b/>
           <w:sz w:val="20"/>
           <w:szCs w:val="20"/>
         </w:rPr>
@@ -179,27 +166,14 @@
     </w:p>
     <w:p>
       <w:pPr>
-        <w:spacing w:before="0" w:after="40" w:line="269" w:lineRule="auto"/>
-      </w:pPr>
-      <w:r>
-        <w:rPr>
-          <w:b/>
-          <w:sz w:val="22"/>
-          <w:szCs w:val="22"/>
-        </w:rPr>
-        <w:t xml:space="preserve">b.</w:t>
-      </w:r>
-    </w:p>
-    <w:p>
-      <w:pPr>
-        <w:spacing w:before="0" w:after="120" w:line="269" w:lineRule="auto"/>
-      </w:pPr>
-      <w:r>
-        <w:rPr>
-          <w:sz w:val="22"/>
-          <w:szCs w:val="22"/>
-        </w:rPr>
-        <w:t xml:space="preserve">What did Emma do in her bedroom in the evening?</w:t>
+        <w:spacing w:before="0" w:after="80" w:line="269" w:lineRule="auto"/>
+      </w:pPr>
+      <w:r>
+        <w:rPr>
+          <w:sz w:val="22"/>
+          <w:szCs w:val="22"/>
+        </w:rPr>
+        <w:t xml:space="preserve">b. What did Emma do in her bedroom in the evening?</w:t>
       </w:r>
     </w:p>
     <w:p>
@@ -377,152 +351,74 @@
     </w:p>
     <w:p>
       <w:pPr>
-        <w:spacing w:before="0" w:after="40" w:line="269" w:lineRule="auto"/>
-      </w:pPr>
-      <w:r>
-        <w:rPr>
-          <w:b/>
-          <w:sz w:val="22"/>
-          <w:szCs w:val="22"/>
-        </w:rPr>
-        <w:t xml:space="preserve">a.</w:t>
-      </w:r>
-    </w:p>
-    <w:p>
-      <w:pPr>
-        <w:spacing w:before="0" w:after="120" w:line="269" w:lineRule="auto"/>
-      </w:pPr>
-      <w:r>
-        <w:rPr>
-          <w:sz w:val="22"/>
-          <w:szCs w:val="22"/>
-        </w:rPr>
-        <w:t xml:space="preserve">bowling: ______________________________</w:t>
-      </w:r>
-    </w:p>
-    <w:p>
-      <w:pPr>
-        <w:spacing w:before="0" w:after="40" w:line="269" w:lineRule="auto"/>
-      </w:pPr>
-      <w:r>
-        <w:rPr>
-          <w:b/>
-          <w:sz w:val="22"/>
-          <w:szCs w:val="22"/>
-        </w:rPr>
-        <w:t xml:space="preserve">b.</w:t>
-      </w:r>
-    </w:p>
-    <w:p>
-      <w:pPr>
-        <w:spacing w:before="0" w:after="120" w:line="269" w:lineRule="auto"/>
-      </w:pPr>
-      <w:r>
-        <w:rPr>
-          <w:sz w:val="22"/>
-          <w:szCs w:val="22"/>
-        </w:rPr>
-        <w:t xml:space="preserve">slide: ______________________________</w:t>
-      </w:r>
-    </w:p>
-    <w:p>
-      <w:pPr>
-        <w:spacing w:before="0" w:after="40" w:line="269" w:lineRule="auto"/>
-      </w:pPr>
-      <w:r>
-        <w:rPr>
-          <w:b/>
-          <w:sz w:val="22"/>
-          <w:szCs w:val="22"/>
-        </w:rPr>
-        <w:t xml:space="preserve">c.</w:t>
-      </w:r>
-    </w:p>
-    <w:p>
-      <w:pPr>
-        <w:spacing w:before="0" w:after="120" w:line="269" w:lineRule="auto"/>
-      </w:pPr>
-      <w:r>
-        <w:rPr>
-          <w:sz w:val="22"/>
-          <w:szCs w:val="22"/>
-        </w:rPr>
-        <w:t xml:space="preserve">painting: ______________________________</w:t>
-      </w:r>
-    </w:p>
-    <w:p>
-      <w:pPr>
-        <w:spacing w:before="0" w:after="40" w:line="269" w:lineRule="auto"/>
-      </w:pPr>
-      <w:r>
-        <w:rPr>
-          <w:b/>
-          <w:sz w:val="22"/>
-          <w:szCs w:val="22"/>
-        </w:rPr>
-        <w:t xml:space="preserve">d.</w:t>
-      </w:r>
-    </w:p>
-    <w:p>
-      <w:pPr>
-        <w:spacing w:before="0" w:after="120" w:line="269" w:lineRule="auto"/>
-      </w:pPr>
-      <w:r>
-        <w:rPr>
-          <w:sz w:val="22"/>
-          <w:szCs w:val="22"/>
-        </w:rPr>
-        <w:t xml:space="preserve">tag / play tag: ______________________________</w:t>
-      </w:r>
-    </w:p>
-    <w:p>
-      <w:pPr>
-        <w:spacing w:before="0" w:after="40" w:line="269" w:lineRule="auto"/>
-      </w:pPr>
-      <w:r>
-        <w:rPr>
-          <w:b/>
-          <w:sz w:val="22"/>
-          <w:szCs w:val="22"/>
-        </w:rPr>
-        <w:t xml:space="preserve">e.</w:t>
-      </w:r>
-    </w:p>
-    <w:p>
-      <w:pPr>
-        <w:spacing w:before="0" w:after="120" w:line="269" w:lineRule="auto"/>
-      </w:pPr>
-      <w:r>
-        <w:rPr>
-          <w:sz w:val="22"/>
-          <w:szCs w:val="22"/>
-        </w:rPr>
-        <w:t xml:space="preserve">teddy bear: ______________________________</w:t>
-      </w:r>
-    </w:p>
-    <w:p>
-      <w:pPr>
-        <w:spacing w:before="0" w:after="40" w:line="269" w:lineRule="auto"/>
-      </w:pPr>
-      <w:r>
-        <w:rPr>
-          <w:b/>
-          <w:sz w:val="22"/>
-          <w:szCs w:val="22"/>
-        </w:rPr>
-        <w:t xml:space="preserve">f.</w:t>
-      </w:r>
-    </w:p>
-    <w:p>
-      <w:pPr>
-        <w:spacing w:before="0" w:after="120" w:line="269" w:lineRule="auto"/>
-      </w:pPr>
-      <w:r>
-        <w:rPr>
-          <w:sz w:val="22"/>
-          <w:szCs w:val="22"/>
-        </w:rPr>
-        <w:t xml:space="preserve">merry-go-round: ______________________________</w:t>
+        <w:spacing w:before="0" w:after="80" w:line="269" w:lineRule="auto"/>
+      </w:pPr>
+      <w:r>
+        <w:rPr>
+          <w:sz w:val="22"/>
+          <w:szCs w:val="22"/>
+        </w:rPr>
+        <w:t xml:space="preserve">a. bowling: ______________________________</w:t>
+      </w:r>
+    </w:p>
+    <w:p>
+      <w:pPr>
+        <w:spacing w:before="0" w:after="80" w:line="269" w:lineRule="auto"/>
+      </w:pPr>
+      <w:r>
+        <w:rPr>
+          <w:sz w:val="22"/>
+          <w:szCs w:val="22"/>
+        </w:rPr>
+        <w:t xml:space="preserve">b. slide: ______________________________</w:t>
+      </w:r>
+    </w:p>
+    <w:p>
+      <w:pPr>
+        <w:spacing w:before="0" w:after="80" w:line="269" w:lineRule="auto"/>
+      </w:pPr>
+      <w:r>
+        <w:rPr>
+          <w:sz w:val="22"/>
+          <w:szCs w:val="22"/>
+        </w:rPr>
+        <w:t xml:space="preserve">c. painting: ______________________________</w:t>
+      </w:r>
+    </w:p>
+    <w:p>
+      <w:pPr>
+        <w:spacing w:before="0" w:after="80" w:line="269" w:lineRule="auto"/>
+      </w:pPr>
+      <w:r>
+        <w:rPr>
+          <w:sz w:val="22"/>
+          <w:szCs w:val="22"/>
+        </w:rPr>
+        <w:t xml:space="preserve">d. tag / play tag: ______________________________</w:t>
+      </w:r>
+    </w:p>
+    <w:p>
+      <w:pPr>
+        <w:spacing w:before="0" w:after="80" w:line="269" w:lineRule="auto"/>
+      </w:pPr>
+      <w:r>
+        <w:rPr>
+          <w:sz w:val="22"/>
+          <w:szCs w:val="22"/>
+        </w:rPr>
+        <w:t xml:space="preserve">e. teddy bear: ______________________________</w:t>
+      </w:r>
+    </w:p>
+    <w:p>
+      <w:pPr>
+        <w:spacing w:before="0" w:after="80" w:line="269" w:lineRule="auto"/>
+      </w:pPr>
+      <w:r>
+        <w:rPr>
+          <w:sz w:val="22"/>
+          <w:szCs w:val="22"/>
+        </w:rPr>
+        <w:t xml:space="preserve">f. merry-go-round: ______________________________</w:t>
       </w:r>
     </w:p>
     <w:p>
@@ -565,152 +461,74 @@
     </w:p>
     <w:p>
       <w:pPr>
-        <w:spacing w:before="0" w:after="40" w:line="269" w:lineRule="auto"/>
-      </w:pPr>
-      <w:r>
-        <w:rPr>
-          <w:b/>
-          <w:sz w:val="22"/>
-          <w:szCs w:val="22"/>
-        </w:rPr>
-        <w:t xml:space="preserve">a.</w:t>
-      </w:r>
-    </w:p>
-    <w:p>
-      <w:pPr>
-        <w:spacing w:before="0" w:after="120" w:line="269" w:lineRule="auto"/>
-      </w:pPr>
-      <w:r>
-        <w:rPr>
-          <w:sz w:val="22"/>
-          <w:szCs w:val="22"/>
-        </w:rPr>
-        <w:t xml:space="preserve">I ____________________ my cousins at the park yesterday.</w:t>
-      </w:r>
-    </w:p>
-    <w:p>
-      <w:pPr>
-        <w:spacing w:before="0" w:after="40" w:line="269" w:lineRule="auto"/>
-      </w:pPr>
-      <w:r>
-        <w:rPr>
-          <w:b/>
-          <w:sz w:val="22"/>
-          <w:szCs w:val="22"/>
-        </w:rPr>
-        <w:t xml:space="preserve">b.</w:t>
-      </w:r>
-    </w:p>
-    <w:p>
-      <w:pPr>
-        <w:spacing w:before="0" w:after="120" w:line="269" w:lineRule="auto"/>
-      </w:pPr>
-      <w:r>
-        <w:rPr>
-          <w:sz w:val="22"/>
-          <w:szCs w:val="22"/>
-        </w:rPr>
-        <w:t xml:space="preserve">Lucas ____________________ a bike near his house last weekend.</w:t>
-      </w:r>
-    </w:p>
-    <w:p>
-      <w:pPr>
-        <w:spacing w:before="0" w:after="40" w:line="269" w:lineRule="auto"/>
-      </w:pPr>
-      <w:r>
-        <w:rPr>
-          <w:b/>
-          <w:sz w:val="22"/>
-          <w:szCs w:val="22"/>
-        </w:rPr>
-        <w:t xml:space="preserve">c.</w:t>
-      </w:r>
-    </w:p>
-    <w:p>
-      <w:pPr>
-        <w:spacing w:before="0" w:after="120" w:line="269" w:lineRule="auto"/>
-      </w:pPr>
-      <w:r>
-        <w:rPr>
-          <w:sz w:val="22"/>
-          <w:szCs w:val="22"/>
-        </w:rPr>
-        <w:t xml:space="preserve">They ____________________ sandwiches after the game.</w:t>
-      </w:r>
-    </w:p>
-    <w:p>
-      <w:pPr>
-        <w:spacing w:before="0" w:after="40" w:line="269" w:lineRule="auto"/>
-      </w:pPr>
-      <w:r>
-        <w:rPr>
-          <w:b/>
-          <w:sz w:val="22"/>
-          <w:szCs w:val="22"/>
-        </w:rPr>
-        <w:t xml:space="preserve">d.</w:t>
-      </w:r>
-    </w:p>
-    <w:p>
-      <w:pPr>
-        <w:spacing w:before="0" w:after="120" w:line="269" w:lineRule="auto"/>
-      </w:pPr>
-      <w:r>
-        <w:rPr>
-          <w:sz w:val="22"/>
-          <w:szCs w:val="22"/>
-        </w:rPr>
-        <w:t xml:space="preserve">We ____________________ to the bowling alley on Sunday.</w:t>
-      </w:r>
-    </w:p>
-    <w:p>
-      <w:pPr>
-        <w:spacing w:before="0" w:after="40" w:line="269" w:lineRule="auto"/>
-      </w:pPr>
-      <w:r>
-        <w:rPr>
-          <w:b/>
-          <w:sz w:val="22"/>
-          <w:szCs w:val="22"/>
-        </w:rPr>
-        <w:t xml:space="preserve">e.</w:t>
-      </w:r>
-    </w:p>
-    <w:p>
-      <w:pPr>
-        <w:spacing w:before="0" w:after="120" w:line="269" w:lineRule="auto"/>
-      </w:pPr>
-      <w:r>
-        <w:rPr>
-          <w:sz w:val="22"/>
-          <w:szCs w:val="22"/>
-        </w:rPr>
-        <w:t xml:space="preserve">Julia ____________________ a short text about her day.</w:t>
-      </w:r>
-    </w:p>
-    <w:p>
-      <w:pPr>
-        <w:spacing w:before="0" w:after="40" w:line="269" w:lineRule="auto"/>
-      </w:pPr>
-      <w:r>
-        <w:rPr>
-          <w:b/>
-          <w:sz w:val="22"/>
-          <w:szCs w:val="22"/>
-        </w:rPr>
-        <w:t xml:space="preserve">f.</w:t>
-      </w:r>
-    </w:p>
-    <w:p>
-      <w:pPr>
-        <w:spacing w:before="0" w:after="120" w:line="269" w:lineRule="auto"/>
-      </w:pPr>
-      <w:r>
-        <w:rPr>
-          <w:sz w:val="22"/>
-          <w:szCs w:val="22"/>
-        </w:rPr>
-        <w:t xml:space="preserve">My brother ____________________ on the bench after lunch.</w:t>
+        <w:spacing w:before="0" w:after="80" w:line="269" w:lineRule="auto"/>
+      </w:pPr>
+      <w:r>
+        <w:rPr>
+          <w:sz w:val="22"/>
+          <w:szCs w:val="22"/>
+        </w:rPr>
+        <w:t xml:space="preserve">a. I ____________________ my cousins at the park yesterday.</w:t>
+      </w:r>
+    </w:p>
+    <w:p>
+      <w:pPr>
+        <w:spacing w:before="0" w:after="80" w:line="269" w:lineRule="auto"/>
+      </w:pPr>
+      <w:r>
+        <w:rPr>
+          <w:sz w:val="22"/>
+          <w:szCs w:val="22"/>
+        </w:rPr>
+        <w:t xml:space="preserve">b. Lucas ____________________ a bike near his house last weekend.</w:t>
+      </w:r>
+    </w:p>
+    <w:p>
+      <w:pPr>
+        <w:spacing w:before="0" w:after="80" w:line="269" w:lineRule="auto"/>
+      </w:pPr>
+      <w:r>
+        <w:rPr>
+          <w:sz w:val="22"/>
+          <w:szCs w:val="22"/>
+        </w:rPr>
+        <w:t xml:space="preserve">c. They ____________________ sandwiches after the game.</w:t>
+      </w:r>
+    </w:p>
+    <w:p>
+      <w:pPr>
+        <w:spacing w:before="0" w:after="80" w:line="269" w:lineRule="auto"/>
+      </w:pPr>
+      <w:r>
+        <w:rPr>
+          <w:sz w:val="22"/>
+          <w:szCs w:val="22"/>
+        </w:rPr>
+        <w:t xml:space="preserve">d. We ____________________ to the bowling alley on Sunday.</w:t>
+      </w:r>
+    </w:p>
+    <w:p>
+      <w:pPr>
+        <w:spacing w:before="0" w:after="80" w:line="269" w:lineRule="auto"/>
+      </w:pPr>
+      <w:r>
+        <w:rPr>
+          <w:sz w:val="22"/>
+          <w:szCs w:val="22"/>
+        </w:rPr>
+        <w:t xml:space="preserve">e. Julia ____________________ a short text about her day.</w:t>
+      </w:r>
+    </w:p>
+    <w:p>
+      <w:pPr>
+        <w:spacing w:before="0" w:after="80" w:line="269" w:lineRule="auto"/>
+      </w:pPr>
+      <w:r>
+        <w:rPr>
+          <w:sz w:val="22"/>
+          <w:szCs w:val="22"/>
+        </w:rPr>
+        <w:t xml:space="preserve">f. My brother ____________________ on the bench after lunch.</w:t>
       </w:r>
     </w:p>
     <w:p>
@@ -740,27 +558,39 @@
     </w:p>
     <w:p>
       <w:pPr>
+        <w:spacing w:before="0" w:after="80" w:line="269" w:lineRule="auto"/>
+      </w:pPr>
+      <w:r>
+        <w:rPr>
+          <w:sz w:val="22"/>
+          <w:szCs w:val="22"/>
+        </w:rPr>
+        <w:t xml:space="preserve">a. She saw a merry-go-round at the park.</w:t>
+      </w:r>
+    </w:p>
+    <w:p>
+      <w:pPr>
         <w:spacing w:before="0" w:after="40" w:line="269" w:lineRule="auto"/>
       </w:pPr>
       <w:r>
         <w:rPr>
           <w:b/>
-          <w:sz w:val="22"/>
-          <w:szCs w:val="22"/>
-        </w:rPr>
-        <w:t xml:space="preserve">a.</w:t>
-      </w:r>
-    </w:p>
-    <w:p>
-      <w:pPr>
-        <w:spacing w:before="0" w:after="120" w:line="269" w:lineRule="auto"/>
-      </w:pPr>
-      <w:r>
-        <w:rPr>
-          <w:sz w:val="22"/>
-          <w:szCs w:val="22"/>
-        </w:rPr>
-        <w:t xml:space="preserve">She saw a merry-go-round at the park.</w:t>
+          <w:sz w:val="20"/>
+          <w:szCs w:val="20"/>
+        </w:rPr>
+        <w:t xml:space="preserve">NEGATIVE:</w:t>
+      </w:r>
+    </w:p>
+    <w:p>
+      <w:pPr>
+        <w:spacing w:before="0" w:after="20" w:line="269" w:lineRule="auto"/>
+      </w:pPr>
+      <w:r>
+        <w:rPr>
+          <w:sz w:val="20"/>
+          <w:szCs w:val="20"/>
+        </w:rPr>
+        <w:t xml:space="preserve">_____________________________________________________________________________________________</w:t>
       </w:r>
     </w:p>
     <w:p>
@@ -773,7 +603,7 @@
           <w:sz w:val="20"/>
           <w:szCs w:val="20"/>
         </w:rPr>
-        <w:t xml:space="preserve">NEGATIVE:</w:t>
+        <w:t xml:space="preserve">INTERROGATIVE:</w:t>
       </w:r>
     </w:p>
     <w:p>
@@ -790,52 +620,14 @@
     </w:p>
     <w:p>
       <w:pPr>
-        <w:spacing w:before="0" w:after="40" w:line="269" w:lineRule="auto"/>
-      </w:pPr>
-      <w:r>
-        <w:rPr>
-          <w:b/>
-          <w:sz w:val="20"/>
-          <w:szCs w:val="20"/>
-        </w:rPr>
-        <w:t xml:space="preserve">INTERROGATIVE:</w:t>
-      </w:r>
-    </w:p>
-    <w:p>
-      <w:pPr>
-        <w:spacing w:before="0" w:after="20" w:line="269" w:lineRule="auto"/>
-      </w:pPr>
-      <w:r>
-        <w:rPr>
-          <w:sz w:val="20"/>
-          <w:szCs w:val="20"/>
-        </w:rPr>
-        <w:t xml:space="preserve">_____________________________________________________________________________________________</w:t>
-      </w:r>
-    </w:p>
-    <w:p>
-      <w:pPr>
-        <w:spacing w:before="0" w:after="40" w:line="269" w:lineRule="auto"/>
-      </w:pPr>
-      <w:r>
-        <w:rPr>
-          <w:b/>
-          <w:sz w:val="22"/>
-          <w:szCs w:val="22"/>
-        </w:rPr>
-        <w:t xml:space="preserve">b.</w:t>
-      </w:r>
-    </w:p>
-    <w:p>
-      <w:pPr>
-        <w:spacing w:before="0" w:after="120" w:line="269" w:lineRule="auto"/>
-      </w:pPr>
-      <w:r>
-        <w:rPr>
-          <w:sz w:val="22"/>
-          <w:szCs w:val="22"/>
-        </w:rPr>
-        <w:t xml:space="preserve">They took the bus to school yesterday.</w:t>
+        <w:spacing w:before="0" w:after="80" w:line="269" w:lineRule="auto"/>
+      </w:pPr>
+      <w:r>
+        <w:rPr>
+          <w:sz w:val="22"/>
+          <w:szCs w:val="22"/>
+        </w:rPr>
+        <w:t xml:space="preserve">b. They took the bus to school yesterday.</w:t>
       </w:r>
     </w:p>
     <w:p>
@@ -928,152 +720,74 @@
     </w:p>
     <w:p>
       <w:pPr>
-        <w:spacing w:before="0" w:after="40" w:line="269" w:lineRule="auto"/>
-      </w:pPr>
-      <w:r>
-        <w:rPr>
-          <w:b/>
-          <w:sz w:val="22"/>
-          <w:szCs w:val="22"/>
-        </w:rPr>
-        <w:t xml:space="preserve">a.</w:t>
-      </w:r>
-    </w:p>
-    <w:p>
-      <w:pPr>
-        <w:spacing w:before="0" w:after="120" w:line="269" w:lineRule="auto"/>
-      </w:pPr>
-      <w:r>
-        <w:rPr>
-          <w:sz w:val="22"/>
-          <w:szCs w:val="22"/>
-        </w:rPr>
-        <w:t xml:space="preserve">Every morning, I ____________________ to school.</w:t>
-      </w:r>
-    </w:p>
-    <w:p>
-      <w:pPr>
-        <w:spacing w:before="0" w:after="40" w:line="269" w:lineRule="auto"/>
-      </w:pPr>
-      <w:r>
-        <w:rPr>
-          <w:b/>
-          <w:sz w:val="22"/>
-          <w:szCs w:val="22"/>
-        </w:rPr>
-        <w:t xml:space="preserve">b.</w:t>
-      </w:r>
-    </w:p>
-    <w:p>
-      <w:pPr>
-        <w:spacing w:before="0" w:after="120" w:line="269" w:lineRule="auto"/>
-      </w:pPr>
-      <w:r>
-        <w:rPr>
-          <w:sz w:val="22"/>
-          <w:szCs w:val="22"/>
-        </w:rPr>
-        <w:t xml:space="preserve">The passengers will ____________________ the plane at gate 5.</w:t>
-      </w:r>
-    </w:p>
-    <w:p>
-      <w:pPr>
-        <w:spacing w:before="0" w:after="40" w:line="269" w:lineRule="auto"/>
-      </w:pPr>
-      <w:r>
-        <w:rPr>
-          <w:b/>
-          <w:sz w:val="22"/>
-          <w:szCs w:val="22"/>
-        </w:rPr>
-        <w:t xml:space="preserve">c.</w:t>
-      </w:r>
-    </w:p>
-    <w:p>
-      <w:pPr>
-        <w:spacing w:before="0" w:after="120" w:line="269" w:lineRule="auto"/>
-      </w:pPr>
-      <w:r>
-        <w:rPr>
-          <w:sz w:val="22"/>
-          <w:szCs w:val="22"/>
-        </w:rPr>
-        <w:t xml:space="preserve">My sister will ____________________ the car because it is raining.</w:t>
-      </w:r>
-    </w:p>
-    <w:p>
-      <w:pPr>
-        <w:spacing w:before="0" w:after="40" w:line="269" w:lineRule="auto"/>
-      </w:pPr>
-      <w:r>
-        <w:rPr>
-          <w:b/>
-          <w:sz w:val="22"/>
-          <w:szCs w:val="22"/>
-        </w:rPr>
-        <w:t xml:space="preserve">d.</w:t>
-      </w:r>
-    </w:p>
-    <w:p>
-      <w:pPr>
-        <w:spacing w:before="0" w:after="120" w:line="269" w:lineRule="auto"/>
-      </w:pPr>
-      <w:r>
-        <w:rPr>
-          <w:sz w:val="22"/>
-          <w:szCs w:val="22"/>
-        </w:rPr>
-        <w:t xml:space="preserve">We need to ____________________ the subway at the next station.</w:t>
-      </w:r>
-    </w:p>
-    <w:p>
-      <w:pPr>
-        <w:spacing w:before="0" w:after="40" w:line="269" w:lineRule="auto"/>
-      </w:pPr>
-      <w:r>
-        <w:rPr>
-          <w:b/>
-          <w:sz w:val="22"/>
-          <w:szCs w:val="22"/>
-        </w:rPr>
-        <w:t xml:space="preserve">e.</w:t>
-      </w:r>
-    </w:p>
-    <w:p>
-      <w:pPr>
-        <w:spacing w:before="0" w:after="120" w:line="269" w:lineRule="auto"/>
-      </w:pPr>
-      <w:r>
-        <w:rPr>
-          <w:sz w:val="22"/>
-          <w:szCs w:val="22"/>
-        </w:rPr>
-        <w:t xml:space="preserve">On Saturday, Pedro likes to ____________________ in the park.</w:t>
-      </w:r>
-    </w:p>
-    <w:p>
-      <w:pPr>
-        <w:spacing w:before="0" w:after="40" w:line="269" w:lineRule="auto"/>
-      </w:pPr>
-      <w:r>
-        <w:rPr>
-          <w:b/>
-          <w:sz w:val="22"/>
-          <w:szCs w:val="22"/>
-        </w:rPr>
-        <w:t xml:space="preserve">f.</w:t>
-      </w:r>
-    </w:p>
-    <w:p>
-      <w:pPr>
-        <w:spacing w:before="0" w:after="120" w:line="269" w:lineRule="auto"/>
-      </w:pPr>
-      <w:r>
-        <w:rPr>
-          <w:sz w:val="22"/>
-          <w:szCs w:val="22"/>
-        </w:rPr>
-        <w:t xml:space="preserve">My aunt will ____________________ to visit another city.</w:t>
+        <w:spacing w:before="0" w:after="80" w:line="269" w:lineRule="auto"/>
+      </w:pPr>
+      <w:r>
+        <w:rPr>
+          <w:sz w:val="22"/>
+          <w:szCs w:val="22"/>
+        </w:rPr>
+        <w:t xml:space="preserve">a. Every morning, I ____________________ to school.</w:t>
+      </w:r>
+    </w:p>
+    <w:p>
+      <w:pPr>
+        <w:spacing w:before="0" w:after="80" w:line="269" w:lineRule="auto"/>
+      </w:pPr>
+      <w:r>
+        <w:rPr>
+          <w:sz w:val="22"/>
+          <w:szCs w:val="22"/>
+        </w:rPr>
+        <w:t xml:space="preserve">b. The passengers will ____________________ the plane at gate 5.</w:t>
+      </w:r>
+    </w:p>
+    <w:p>
+      <w:pPr>
+        <w:spacing w:before="0" w:after="80" w:line="269" w:lineRule="auto"/>
+      </w:pPr>
+      <w:r>
+        <w:rPr>
+          <w:sz w:val="22"/>
+          <w:szCs w:val="22"/>
+        </w:rPr>
+        <w:t xml:space="preserve">c. My sister will ____________________ the car because it is raining.</w:t>
+      </w:r>
+    </w:p>
+    <w:p>
+      <w:pPr>
+        <w:spacing w:before="0" w:after="80" w:line="269" w:lineRule="auto"/>
+      </w:pPr>
+      <w:r>
+        <w:rPr>
+          <w:sz w:val="22"/>
+          <w:szCs w:val="22"/>
+        </w:rPr>
+        <w:t xml:space="preserve">d. We need to ____________________ the subway at the next station.</w:t>
+      </w:r>
+    </w:p>
+    <w:p>
+      <w:pPr>
+        <w:spacing w:before="0" w:after="80" w:line="269" w:lineRule="auto"/>
+      </w:pPr>
+      <w:r>
+        <w:rPr>
+          <w:sz w:val="22"/>
+          <w:szCs w:val="22"/>
+        </w:rPr>
+        <w:t xml:space="preserve">e. On Saturday, Pedro likes to ____________________ in the park.</w:t>
+      </w:r>
+    </w:p>
+    <w:p>
+      <w:pPr>
+        <w:spacing w:before="0" w:after="80" w:line="269" w:lineRule="auto"/>
+      </w:pPr>
+      <w:r>
+        <w:rPr>
+          <w:sz w:val="22"/>
+          <w:szCs w:val="22"/>
+        </w:rPr>
+        <w:t xml:space="preserve">f. My aunt will ____________________ to visit another city.</w:t>
       </w:r>
     </w:p>
     <w:p>
@@ -1103,127 +817,62 @@
     </w:p>
     <w:p>
       <w:pPr>
-        <w:spacing w:before="0" w:after="40" w:line="269" w:lineRule="auto"/>
-      </w:pPr>
-      <w:r>
-        <w:rPr>
-          <w:b/>
-          <w:sz w:val="22"/>
-          <w:szCs w:val="22"/>
-        </w:rPr>
-        <w:t xml:space="preserve">a.</w:t>
-      </w:r>
-    </w:p>
-    <w:p>
-      <w:pPr>
-        <w:spacing w:before="0" w:after="120" w:line="269" w:lineRule="auto"/>
-      </w:pPr>
-      <w:r>
-        <w:rPr>
-          <w:sz w:val="22"/>
-          <w:szCs w:val="22"/>
-        </w:rPr>
-        <w:t xml:space="preserve">There were many students (on / in) the bus.</w:t>
-      </w:r>
-    </w:p>
-    <w:p>
-      <w:pPr>
-        <w:spacing w:before="0" w:after="40" w:line="269" w:lineRule="auto"/>
-      </w:pPr>
-      <w:r>
-        <w:rPr>
-          <w:b/>
-          <w:sz w:val="22"/>
-          <w:szCs w:val="22"/>
-        </w:rPr>
-        <w:t xml:space="preserve">b.</w:t>
-      </w:r>
-    </w:p>
-    <w:p>
-      <w:pPr>
-        <w:spacing w:before="0" w:after="120" w:line="269" w:lineRule="auto"/>
-      </w:pPr>
-      <w:r>
-        <w:rPr>
-          <w:sz w:val="22"/>
-          <w:szCs w:val="22"/>
-        </w:rPr>
-        <w:t xml:space="preserve">My phone was (on / in) the car.</w:t>
-      </w:r>
-    </w:p>
-    <w:p>
-      <w:pPr>
-        <w:spacing w:before="0" w:after="40" w:line="269" w:lineRule="auto"/>
-      </w:pPr>
-      <w:r>
-        <w:rPr>
-          <w:b/>
-          <w:sz w:val="22"/>
-          <w:szCs w:val="22"/>
-        </w:rPr>
-        <w:t xml:space="preserve">c.</w:t>
-      </w:r>
-    </w:p>
-    <w:p>
-      <w:pPr>
-        <w:spacing w:before="0" w:after="120" w:line="269" w:lineRule="auto"/>
-      </w:pPr>
-      <w:r>
-        <w:rPr>
-          <w:sz w:val="22"/>
-          <w:szCs w:val="22"/>
-        </w:rPr>
-        <w:t xml:space="preserve">Did he (ate / eat) a sandwich after school?</w:t>
-      </w:r>
-    </w:p>
-    <w:p>
-      <w:pPr>
-        <w:spacing w:before="0" w:after="40" w:line="269" w:lineRule="auto"/>
-      </w:pPr>
-      <w:r>
-        <w:rPr>
-          <w:b/>
-          <w:sz w:val="22"/>
-          <w:szCs w:val="22"/>
-        </w:rPr>
-        <w:t xml:space="preserve">d.</w:t>
-      </w:r>
-    </w:p>
-    <w:p>
-      <w:pPr>
-        <w:spacing w:before="0" w:after="120" w:line="269" w:lineRule="auto"/>
-      </w:pPr>
-      <w:r>
-        <w:rPr>
-          <w:sz w:val="22"/>
-          <w:szCs w:val="22"/>
-        </w:rPr>
-        <w:t xml:space="preserve">She didn't (saw / see) her friends yesterday.</w:t>
-      </w:r>
-    </w:p>
-    <w:p>
-      <w:pPr>
-        <w:spacing w:before="0" w:after="40" w:line="269" w:lineRule="auto"/>
-      </w:pPr>
-      <w:r>
-        <w:rPr>
-          <w:b/>
-          <w:sz w:val="22"/>
-          <w:szCs w:val="22"/>
-        </w:rPr>
-        <w:t xml:space="preserve">e.</w:t>
-      </w:r>
-    </w:p>
-    <w:p>
-      <w:pPr>
-        <w:spacing w:before="0" w:after="120" w:line="269" w:lineRule="auto"/>
-      </w:pPr>
-      <w:r>
-        <w:rPr>
-          <w:sz w:val="22"/>
-          <w:szCs w:val="22"/>
-        </w:rPr>
-        <w:t xml:space="preserve">They (got on / got in) the train at 7 a.m.</w:t>
+        <w:spacing w:before="0" w:after="80" w:line="269" w:lineRule="auto"/>
+      </w:pPr>
+      <w:r>
+        <w:rPr>
+          <w:sz w:val="22"/>
+          <w:szCs w:val="22"/>
+        </w:rPr>
+        <w:t xml:space="preserve">a. There were many students (on / in) the bus.</w:t>
+      </w:r>
+    </w:p>
+    <w:p>
+      <w:pPr>
+        <w:spacing w:before="0" w:after="80" w:line="269" w:lineRule="auto"/>
+      </w:pPr>
+      <w:r>
+        <w:rPr>
+          <w:sz w:val="22"/>
+          <w:szCs w:val="22"/>
+        </w:rPr>
+        <w:t xml:space="preserve">b. My phone was (on / in) the car.</w:t>
+      </w:r>
+    </w:p>
+    <w:p>
+      <w:pPr>
+        <w:spacing w:before="0" w:after="80" w:line="269" w:lineRule="auto"/>
+      </w:pPr>
+      <w:r>
+        <w:rPr>
+          <w:sz w:val="22"/>
+          <w:szCs w:val="22"/>
+        </w:rPr>
+        <w:t xml:space="preserve">c. Did he (ate / eat) a sandwich after school?</w:t>
+      </w:r>
+    </w:p>
+    <w:p>
+      <w:pPr>
+        <w:spacing w:before="0" w:after="80" w:line="269" w:lineRule="auto"/>
+      </w:pPr>
+      <w:r>
+        <w:rPr>
+          <w:sz w:val="22"/>
+          <w:szCs w:val="22"/>
+        </w:rPr>
+        <w:t xml:space="preserve">d. She didn't (saw / see) her friends yesterday.</w:t>
+      </w:r>
+    </w:p>
+    <w:p>
+      <w:pPr>
+        <w:spacing w:before="0" w:after="80" w:line="269" w:lineRule="auto"/>
+      </w:pPr>
+      <w:r>
+        <w:rPr>
+          <w:sz w:val="22"/>
+          <w:szCs w:val="22"/>
+        </w:rPr>
+        <w:t xml:space="preserve">e. They (got on / got in) the train at 7 a.m.</w:t>
       </w:r>
     </w:p>
     <w:p>
@@ -1253,27 +902,51 @@
     </w:p>
     <w:p>
       <w:pPr>
+        <w:spacing w:before="0" w:after="80" w:line="269" w:lineRule="auto"/>
+      </w:pPr>
+      <w:r>
+        <w:rPr>
+          <w:sz w:val="22"/>
+          <w:szCs w:val="22"/>
+        </w:rPr>
+        <w:t xml:space="preserve">a. Did she went to the park yesterday?</w:t>
+      </w:r>
+    </w:p>
+    <w:p>
+      <w:pPr>
         <w:spacing w:before="0" w:after="40" w:line="269" w:lineRule="auto"/>
       </w:pPr>
       <w:r>
         <w:rPr>
           <w:b/>
-          <w:sz w:val="22"/>
-          <w:szCs w:val="22"/>
-        </w:rPr>
-        <w:t xml:space="preserve">a.</w:t>
-      </w:r>
-    </w:p>
-    <w:p>
-      <w:pPr>
-        <w:spacing w:before="0" w:after="120" w:line="269" w:lineRule="auto"/>
-      </w:pPr>
-      <w:r>
-        <w:rPr>
-          <w:sz w:val="22"/>
-          <w:szCs w:val="22"/>
-        </w:rPr>
-        <w:t xml:space="preserve">Did she went to the park yesterday?</w:t>
+          <w:sz w:val="20"/>
+          <w:szCs w:val="20"/>
+        </w:rPr>
+        <w:t xml:space="preserve">Resposta:</w:t>
+      </w:r>
+    </w:p>
+    <w:p>
+      <w:pPr>
+        <w:spacing w:before="0" w:after="20" w:line="269" w:lineRule="auto"/>
+      </w:pPr>
+      <w:r>
+        <w:rPr>
+          <w:sz w:val="20"/>
+          <w:szCs w:val="20"/>
+        </w:rPr>
+        <w:t xml:space="preserve">_____________________________________________________________________________________________</w:t>
+      </w:r>
+    </w:p>
+    <w:p>
+      <w:pPr>
+        <w:spacing w:before="0" w:after="80" w:line="269" w:lineRule="auto"/>
+      </w:pPr>
+      <w:r>
+        <w:rPr>
+          <w:sz w:val="22"/>
+          <w:szCs w:val="22"/>
+        </w:rPr>
+        <w:t xml:space="preserve">b. They didn't saw the slide.</w:t>
       </w:r>
     </w:p>
     <w:p>
@@ -1303,77 +976,14 @@
     </w:p>
     <w:p>
       <w:pPr>
-        <w:spacing w:before="0" w:after="40" w:line="269" w:lineRule="auto"/>
-      </w:pPr>
-      <w:r>
-        <w:rPr>
-          <w:b/>
-          <w:sz w:val="22"/>
-          <w:szCs w:val="22"/>
-        </w:rPr>
-        <w:t xml:space="preserve">b.</w:t>
-      </w:r>
-    </w:p>
-    <w:p>
-      <w:pPr>
-        <w:spacing w:before="0" w:after="120" w:line="269" w:lineRule="auto"/>
-      </w:pPr>
-      <w:r>
-        <w:rPr>
-          <w:sz w:val="22"/>
-          <w:szCs w:val="22"/>
-        </w:rPr>
-        <w:t xml:space="preserve">They didn't saw the slide.</w:t>
-      </w:r>
-    </w:p>
-    <w:p>
-      <w:pPr>
-        <w:spacing w:before="0" w:after="40" w:line="269" w:lineRule="auto"/>
-      </w:pPr>
-      <w:r>
-        <w:rPr>
-          <w:b/>
-          <w:sz w:val="20"/>
-          <w:szCs w:val="20"/>
-        </w:rPr>
-        <w:t xml:space="preserve">Resposta:</w:t>
-      </w:r>
-    </w:p>
-    <w:p>
-      <w:pPr>
-        <w:spacing w:before="0" w:after="20" w:line="269" w:lineRule="auto"/>
-      </w:pPr>
-      <w:r>
-        <w:rPr>
-          <w:sz w:val="20"/>
-          <w:szCs w:val="20"/>
-        </w:rPr>
-        <w:t xml:space="preserve">_____________________________________________________________________________________________</w:t>
-      </w:r>
-    </w:p>
-    <w:p>
-      <w:pPr>
-        <w:spacing w:before="0" w:after="40" w:line="269" w:lineRule="auto"/>
-      </w:pPr>
-      <w:r>
-        <w:rPr>
-          <w:b/>
-          <w:sz w:val="22"/>
-          <w:szCs w:val="22"/>
-        </w:rPr>
-        <w:t xml:space="preserve">c.</w:t>
-      </w:r>
-    </w:p>
-    <w:p>
-      <w:pPr>
-        <w:spacing w:before="0" w:after="120" w:line="269" w:lineRule="auto"/>
-      </w:pPr>
-      <w:r>
-        <w:rPr>
-          <w:sz w:val="22"/>
-          <w:szCs w:val="22"/>
-        </w:rPr>
-        <w:t xml:space="preserve">He get in the bus at 8 o'clock yesterday.</w:t>
+        <w:spacing w:before="0" w:after="80" w:line="269" w:lineRule="auto"/>
+      </w:pPr>
+      <w:r>
+        <w:rPr>
+          <w:sz w:val="22"/>
+          <w:szCs w:val="22"/>
+        </w:rPr>
+        <w:t xml:space="preserve">c. He get in the bus at 8 o'clock yesterday.</w:t>
       </w:r>
     </w:p>
     <w:p>

</xml_diff>